<commit_message>
Improve Chapter I: continuous flow, no blank gaps, fuller text
</commit_message>
<xml_diff>
--- a/Diplom_ishi.docx
+++ b/Diplom_ishi.docx
@@ -1453,21 +1453,21 @@
           <w:sz w:val="24"/>
           <w:szCs w:val="24"/>
         </w:rPr>
-        <w:t xml:space="preserve">Temir yo'l harakat tarkibining tormoz tizimi poyezd tezligini kamaytirish, uni to'xtatish hamda turgan holatda ushlab turish uchun xizmat qiladi. Zamonaviy harakat tarkibida asosan pnevmatik (havo bilan ishlaydigan) avtomatik tormoz tizimi qo'llaniladi. Bu tizimda tormozlash siqilgan havo energiyasi hisobiga amalga oshiriladi, boshqaruv esa tormoz magistralidagi bosimni o'zgartirish orqali bajariladi.</w:t>
-      </w:r>
-    </w:p>
-    <w:p>
-      <w:pPr>
-        <w:spacing w:after="120" w:line="360" w:lineRule="auto"/>
-        <w:ind w:firstLine="709"/>
-        <w:jc w:val="both"/>
-      </w:pPr>
-      <w:r>
-        <w:rPr>
-          <w:sz w:val="24"/>
-          <w:szCs w:val="24"/>
-        </w:rPr>
-        <w:t xml:space="preserve">072-tormoz qurilmasi bloki ushbu tizimning muhim funksional elementlaridan biri bo'lib, u havo oqimini taqsimlash, bosimni belgilangan darajada barqarorlashtirish va tormoz silindriga uzatiladigan kuchni shakllantirish vazifalarini bajaradi. Blok magistral quvur, zaxira rezervuar va ijro mexanizmlari (tormoz silindri) o'rtasidagi havo almashinuvini boshqaradi.</w:t>
+        <w:t xml:space="preserve">Temir yo'l harakat tarkibining tormoz tizimi poyezd tezligini kamaytirish, uni to'xtatish hamda turgan holatda ushlab turish uchun xizmat qiladi. Zamonaviy harakat tarkibida asosan pnevmatik (havo bilan ishlaydigan) avtomatik tormoz tizimi qo'llaniladi. Bu tizimda tormozlash siqilgan havo energiyasi hisobiga amalga oshiriladi, boshqaruv esa tormoz magistralidagi bosimni o'zgartirish orqali bajariladi. Tizimning avtomatikligi shundan iboratki, magistral uzilganda yoki bosim keskin pasayganda poyezd o'z-o'zidan tormozlanadi.</w:t>
+      </w:r>
+    </w:p>
+    <w:p>
+      <w:pPr>
+        <w:spacing w:after="120" w:line="360" w:lineRule="auto"/>
+        <w:ind w:firstLine="709"/>
+        <w:jc w:val="both"/>
+      </w:pPr>
+      <w:r>
+        <w:rPr>
+          <w:sz w:val="24"/>
+          <w:szCs w:val="24"/>
+        </w:rPr>
+        <w:t xml:space="preserve">072-tormoz qurilmasi bloki ushbu tizimning muhim funksional elementlaridan biri bo'lib, u havo oqimini taqsimlash, bosimni belgilangan darajada barqarorlashtirish va tormoz silindriga uzatiladigan kuchni shakllantirish vazifalarini bajaradi. Blok magistral quvur, zaxira rezervuar va ijro mexanizmlari (tormoz silindri) o'rtasidagi havo almashinuvini boshqaradi va tormozlash hamda bo'shatish jarayonlarini talab etilgan ketma-ketlikda amalga oshiradi.</w:t>
       </w:r>
     </w:p>
     <w:p>
@@ -1565,7 +1565,28 @@
           <w:sz w:val="24"/>
           <w:szCs w:val="24"/>
         </w:rPr>
-        <w:t xml:space="preserve">germetiklikni ta'minlash va havoning ruxsatsiz chiqib ketishining oldini olish.</w:t>
+        <w:t xml:space="preserve">germetiklikni ta'minlash va havoning ruxsatsiz chiqib ketishining oldini olish;</w:t>
+      </w:r>
+    </w:p>
+    <w:p>
+      <w:pPr>
+        <w:spacing w:after="60" w:line="312" w:lineRule="auto"/>
+        <w:ind w:left="709" w:hanging="284"/>
+        <w:jc w:val="both"/>
+      </w:pPr>
+      <w:r>
+        <w:rPr>
+          <w:sz w:val="24"/>
+          <w:szCs w:val="24"/>
+        </w:rPr>
+        <w:t xml:space="preserve">–  </w:t>
+      </w:r>
+      <w:r>
+        <w:rPr>
+          <w:sz w:val="24"/>
+          <w:szCs w:val="24"/>
+        </w:rPr>
+        <w:t xml:space="preserve">magistralda bosim tiklanganda tormozni to'liq va o'z vaqtida bo'shatish.</w:t>
       </w:r>
     </w:p>
     <w:p>
@@ -1607,12 +1628,21 @@
           <w:sz w:val="24"/>
           <w:szCs w:val="24"/>
         </w:rPr>
+        <w:t xml:space="preserve">Texnik tavsifda blokning ortiqcha bosimga, dinamik yuklamalarga va atrof-muhit ta'siriga chidamliligi alohida e'tiborga olinadi. Harakat tarkibi turli iqlim sharoitlarida va yo'lning notekisliklarida ishlagani uchun blok doimiy tebranish va zarbalarga duch keladi. Shu bois uning konstruksiyasi mustahkam, biriktiruvchi elementlari esa o'z-o'zidan bo'shab ketishdan himoyalangan bo'lishi kerak.</w:t>
+      </w:r>
+    </w:p>
+    <w:p>
+      <w:pPr>
+        <w:spacing w:after="120" w:line="360" w:lineRule="auto"/>
+        <w:ind w:firstLine="709"/>
+        <w:jc w:val="both"/>
+      </w:pPr>
+      <w:r>
+        <w:rPr>
+          <w:sz w:val="24"/>
+          <w:szCs w:val="24"/>
+        </w:rPr>
         <w:t xml:space="preserve">Shunday qilib, 072-tormoz qurilmasi bloki tormoz tizimining ishonchli va xavfsiz ishlashini ta'minlovchi mas'uliyatli tugun hisoblanadi. Uning texnik holatiga qo'yiladigan yuqori talablar ta'mirlash texnologiyasining sifatli va aniq bo'lishini taqozo etadi.</w:t>
-      </w:r>
-    </w:p>
-    <w:p>
-      <w:r>
-        <w:br w:type="page"/>
       </w:r>
     </w:p>
     <w:p>
@@ -1829,6 +1859,20 @@
           <w:sz w:val="24"/>
           <w:szCs w:val="24"/>
         </w:rPr>
+        <w:t xml:space="preserve">Blok bir nechta rejimda ishlashi mumkin: tormozlash, ushlab turish (perekrysha) va bo'shatish. Tormozlash rejimida havo silindrga uzatiladi, ushlab turish rejimida erishilgan bosim saqlab qolinadi, bo'shatish rejimida esa silindr atmosferaga ulanadi. Bu rejimlarning aniq va ketma-ket almashinuvi blokning to'g'ri sozlanganligiga bog'liq.</w:t>
+      </w:r>
+    </w:p>
+    <w:p>
+      <w:pPr>
+        <w:spacing w:after="120" w:line="360" w:lineRule="auto"/>
+        <w:ind w:firstLine="709"/>
+        <w:jc w:val="both"/>
+      </w:pPr>
+      <w:r>
+        <w:rPr>
+          <w:sz w:val="24"/>
+          <w:szCs w:val="24"/>
+        </w:rPr>
         <w:t xml:space="preserve">Detallarning materiallari ularning ish sharoitiga qarab tanlanadi. Klapanlar va o'rindiqlar yeyilishga chidamli bo'lishi uchun yuqori sifatli po'lat yoki rangli metall qotishmalaridan, zichlagich elementlar esa moy va havoga chidamli maxsus rezina yoki polimer materiallardan tayyorlanadi. Prujinalar prujina po'latidan ishlanadi va belgilangan bikrlik ko'rsatkichiga ega bo'lishi kerak.</w:t>
       </w:r>
     </w:p>
@@ -1858,11 +1902,6 @@
           <w:szCs w:val="24"/>
         </w:rPr>
         <w:t xml:space="preserve">Konstruksiyaning tahlili shuni ko'rsatadiki, blokning ishonchliligi ko'p jihatdan zichlagich elementlar va klapan juftliklari holatiga bog'liq. Aynan shu detallar ekspluatatsiyada eng ko'p yeyiladi va ta'mirlash jarayonida alohida e'tibor talab qiladi. Bu xulosa keyingi bo'limda keltiriladigan nuqsonlar tahlili uchun asos bo'ladi.</w:t>
-      </w:r>
-    </w:p>
-    <w:p>
-      <w:r>
-        <w:br w:type="page"/>
       </w:r>
     </w:p>
     <w:p>
@@ -2051,6 +2090,20 @@
           <w:sz w:val="24"/>
           <w:szCs w:val="24"/>
         </w:rPr>
+        <w:t xml:space="preserve">Nuqsonlarni xarakteriga ko'ra ikki guruhga ajratish mumkin: tuzatib bo'ladigan (tiklanadigan) va tuzatib bo'lmaydigan nuqsonlar. Birinchi guruhga yeyilgan sirtlar, kichik korroziya izlari va sozlash buzilishi kiradi; ular tiklash yoki sozlash orqali bartaraf etiladi. Ikkinchi guruhga yoriqlar, chuqur korroziya va materialning charchash buzilishlari kirib, bunday detallar almashtirishni talab qiladi.</w:t>
+      </w:r>
+    </w:p>
+    <w:p>
+      <w:pPr>
+        <w:spacing w:after="120" w:line="360" w:lineRule="auto"/>
+        <w:ind w:firstLine="709"/>
+        <w:jc w:val="both"/>
+      </w:pPr>
+      <w:r>
+        <w:rPr>
+          <w:sz w:val="24"/>
+          <w:szCs w:val="24"/>
+        </w:rPr>
         <w:t xml:space="preserve">Ishdan chiqish statistikasini tahlil qilish shuni ko'rsatadiki, nosozliklarning eng katta ulushi zichlagich elementlar (manjeta, halqa, diafragma) va klapan juftliklariga to'g'ri keladi. Korpus va yirik mexanik detallar nisbatan kamroq ishdan chiqadi va ko'pincha tiklash mumkin bo'ladi. Shu sababli ta'mirlash texnologiyasida zichlagichlarni almashtirishga va klapan juftliklarini tiklashga alohida e'tibor qaratiladi.</w:t>
       </w:r>
     </w:p>
@@ -2066,11 +2119,6 @@
           <w:szCs w:val="24"/>
         </w:rPr>
         <w:t xml:space="preserve">Nuqsonlarni o'z vaqtida aniqlash va tahlil qilish ta'mirlash hajmini to'g'ri belgilash, kerakli ehtiyot qismlar zaxirasini rejalashtirish va ta'mirlash sifatini oshirish imkonini beradi. Yuqorida keltirilgan tahlil keyingi bobda ishlab chiqiladigan texnologik jarayonning asosini tashkil etadi.</w:t>
-      </w:r>
-    </w:p>
-    <w:p>
-      <w:r>
-        <w:br w:type="page"/>
       </w:r>
     </w:p>
     <w:p>

</xml_diff>

<commit_message>
Add Chapter III (Design-calculation part) with formulas, tables and schemes
</commit_message>
<xml_diff>
--- a/Diplom_ishi.docx
+++ b/Diplom_ishi.docx
@@ -10060,6 +10060,1821 @@
         <w:t xml:space="preserve">Avtomatlashtirish va mexanizatsiyalash darajasini oshirish texnologik jarayonni takomillashtirishning istiqbolli yo'nalishidir. Yuvish, sinash va o'lchash operatsiyalarini avtomatlashtirish qo'l mehnatini sezilarli kamaytiradi, sifatni barqarorlashtiradi va inson omili bilan bog'liq xatoliklarni kamaytiradi. Ushbu yo'nalishdagi investitsiyalar ishlab chiqarish hajmi yetarli bo'lganda tez qoplaniladi.</w:t>
       </w:r>
     </w:p>
+    <w:p>
+      <w:r>
+        <w:br w:type="page"/>
+      </w:r>
+    </w:p>
+    <w:p>
+      <w:pPr>
+        <w:jc w:val="center"/>
+        <w:spacing w:before="0" w:after="220"/>
+      </w:pPr>
+      <w:r>
+        <w:rPr>
+          <w:b/>
+          <w:sz w:val="28"/>
+          <w:szCs w:val="28"/>
+        </w:rPr>
+        <w:t xml:space="preserve">III BOB. KONSTRUKTORLIK-HISOB QISMI</w:t>
+      </w:r>
+    </w:p>
+    <w:p>
+      <w:pPr>
+        <w:spacing w:before="240" w:after="120"/>
+        <w:keepNext/>
+      </w:pPr>
+      <w:r>
+        <w:rPr>
+          <w:b/>
+          <w:sz w:val="26"/>
+          <w:szCs w:val="26"/>
+        </w:rPr>
+        <w:t xml:space="preserve">3.1. Texnologik jarayon parametrlari va vaqt me'yorlarini hisoblash</w:t>
+      </w:r>
+    </w:p>
+    <w:p>
+      <w:pPr>
+        <w:spacing w:after="120" w:line="360" w:lineRule="auto"/>
+        <w:ind w:firstLine="709"/>
+        <w:jc w:val="both"/>
+      </w:pPr>
+      <w:r>
+        <w:rPr>
+          <w:sz w:val="24"/>
+          <w:szCs w:val="24"/>
+        </w:rPr>
+        <w:t xml:space="preserve">Texnologik jarayonni asoslash uchun uning asosiy parametrlari – operatsiyalarning vaqt me'yorlari, ta'mirlash siklining davomiyligi, zarur jihozlar va ishchilar soni hisoblanadi. Vaqt me'yorlari ta'mirlash rejasini tuzish, ish haqini belgilash va ishlab chiqarish quvvatini aniqlash uchun asos bo'lib xizmat qiladi.</w:t>
+      </w:r>
+    </w:p>
+    <w:p>
+      <w:pPr>
+        <w:spacing w:after="120" w:line="360" w:lineRule="auto"/>
+        <w:ind w:firstLine="709"/>
+        <w:jc w:val="both"/>
+      </w:pPr>
+      <w:r>
+        <w:rPr>
+          <w:sz w:val="24"/>
+          <w:szCs w:val="24"/>
+        </w:rPr>
+        <w:t xml:space="preserve">Har bir operatsiya uchun dona vaqti (shtuk vaqti) hisoblanadi. Dona vaqti operatsiyani bir marta bajarishga sarflanadigan to'liq vaqt bo'lib, u quyidagi tashkil etuvchilardan iborat:</w:t>
+      </w:r>
+    </w:p>
+    <w:p>
+      <w:pPr>
+        <w:jc w:val="center"/>
+        <w:spacing w:before="80" w:after="120"/>
+      </w:pPr>
+      <w:r>
+        <w:rPr>
+          <w:i/>
+          <w:sz w:val="26"/>
+          <w:szCs w:val="26"/>
+        </w:rPr>
+        <w:t xml:space="preserve">Tₛₕ = Tₒ + Tᵥ + Tₒᵦ + Tₑₜ</w:t>
+      </w:r>
+    </w:p>
+    <w:p>
+      <w:pPr>
+        <w:spacing w:after="120" w:line="360" w:lineRule="auto"/>
+        <w:ind w:firstLine="709"/>
+        <w:jc w:val="both"/>
+      </w:pPr>
+      <w:r>
+        <w:rPr>
+          <w:sz w:val="24"/>
+          <w:szCs w:val="24"/>
+        </w:rPr>
+        <w:t xml:space="preserve">bu yerda: Tₛₕ – dona vaqti; Tₒ – asosiy (texnologik) vaqt; Tᵥ – yordamchi vaqt; Tₒᵦ – ish o'rniga xizmat ko'rsatish vaqti; Tₑₜ – dam olish va shaxsiy ehtiyojlar uchun vaqt.</w:t>
+      </w:r>
+    </w:p>
+    <w:p>
+      <w:pPr>
+        <w:spacing w:after="120" w:line="360" w:lineRule="auto"/>
+        <w:ind w:firstLine="709"/>
+        <w:jc w:val="both"/>
+      </w:pPr>
+      <w:r>
+        <w:rPr>
+          <w:sz w:val="24"/>
+          <w:szCs w:val="24"/>
+        </w:rPr>
+        <w:t xml:space="preserve">Asosiy vaqt Tₒ – detal yoki tugun ustida bevosita texnologik ta'sir (yuvish, charxlash, yig'ish) bajariladigan vaqt. Yordamchi vaqt Tᵥ – detalni o'rnatish, mahkamlash, o'lchash kabi qo'shimcha harakatlarga sarflanadigan vaqt. Xizmat ko'rsatish va dam olish vaqtlari odatda operativ vaqtning (Tₒ + Tᵥ) ma'lum foizi sifatida olinadi.</w:t>
+      </w:r>
+    </w:p>
+    <w:p>
+      <w:pPr>
+        <w:spacing w:after="120" w:line="360" w:lineRule="auto"/>
+        <w:ind w:firstLine="709"/>
+        <w:jc w:val="both"/>
+      </w:pPr>
+      <w:r>
+        <w:rPr>
+          <w:sz w:val="24"/>
+          <w:szCs w:val="24"/>
+        </w:rPr>
+        <w:t xml:space="preserve">Bo'lakli-kalkulyatsion vaqt esa tayyorlov-yakunlov vaqtini ham hisobga oladi va partiyaga bo'linadi:</w:t>
+      </w:r>
+    </w:p>
+    <w:p>
+      <w:pPr>
+        <w:jc w:val="center"/>
+        <w:spacing w:before="80" w:after="120"/>
+      </w:pPr>
+      <w:r>
+        <w:rPr>
+          <w:i/>
+          <w:sz w:val="26"/>
+          <w:szCs w:val="26"/>
+        </w:rPr>
+        <w:t xml:space="preserve">Tₛₕₖ = Tₛₕ + Tₚₖ / n</w:t>
+      </w:r>
+    </w:p>
+    <w:p>
+      <w:pPr>
+        <w:spacing w:after="120" w:line="360" w:lineRule="auto"/>
+        <w:ind w:firstLine="709"/>
+        <w:jc w:val="both"/>
+      </w:pPr>
+      <w:r>
+        <w:rPr>
+          <w:sz w:val="24"/>
+          <w:szCs w:val="24"/>
+        </w:rPr>
+        <w:t xml:space="preserve">bu yerda: Tₚₖ – tayyorlov-yakunlov vaqti (partiyaga bir marta sarflanadi); n – partiyadagi detallar soni. Partiya kattalashgani sayin bir detalga to'g'ri keladigan tayyorlov-yakunlov vaqti kamayadi.</w:t>
+      </w:r>
+    </w:p>
+    <w:p>
+      <w:pPr>
+        <w:spacing w:after="120" w:line="360" w:lineRule="auto"/>
+        <w:ind w:firstLine="709"/>
+        <w:jc w:val="both"/>
+      </w:pPr>
+      <w:r>
+        <w:rPr>
+          <w:sz w:val="24"/>
+          <w:szCs w:val="24"/>
+        </w:rPr>
+        <w:t xml:space="preserve">Hisoblangan operatsiya vaqtlarining namunaviy taqsimoti 3.1-jadvalda keltirilgan (qiymatlar shartli, texnologik jarayonni tushuntirish uchun).</w:t>
+      </w:r>
+    </w:p>
+    <w:tbl>
+      <w:tblPr>
+        <w:tblW w:w="0" w:type="auto"/>
+        <w:jc w:val="center"/>
+        <w:tblBorders>
+          <w:top w:val="single" w:sz="6" w:space="0" w:color="000000"/>
+          <w:left w:val="single" w:sz="6" w:space="0" w:color="000000"/>
+          <w:bottom w:val="single" w:sz="6" w:space="0" w:color="000000"/>
+          <w:right w:val="single" w:sz="6" w:space="0" w:color="000000"/>
+          <w:insideH w:val="single" w:sz="6" w:space="0" w:color="000000"/>
+          <w:insideV w:val="single" w:sz="6" w:space="0" w:color="000000"/>
+        </w:tblBorders>
+      </w:tblPr>
+      <w:tblGrid>
+        <w:gridCol w:w="3200"/>
+        <w:gridCol w:w="1900"/>
+        <w:gridCol w:w="1900"/>
+        <w:gridCol w:w="2000"/>
+      </w:tblGrid>
+      <w:tr>
+        <w:tc>
+          <w:tcPr>
+            <w:tcW w:w="3200" w:type="dxa"/>
+            <w:vAlign w:val="center"/>
+          </w:tcPr>
+          <w:p>
+            <w:pPr>
+              <w:spacing w:after="20"/>
+              <w:jc w:val="center"/>
+            </w:pPr>
+            <w:r>
+              <w:rPr>
+                <w:b/>
+                <w:sz w:val="22"/>
+                <w:szCs w:val="22"/>
+              </w:rPr>
+              <w:t xml:space="preserve">Operatsiya</w:t>
+            </w:r>
+          </w:p>
+        </w:tc>
+        <w:tc>
+          <w:tcPr>
+            <w:tcW w:w="1900" w:type="dxa"/>
+            <w:vAlign w:val="center"/>
+          </w:tcPr>
+          <w:p>
+            <w:pPr>
+              <w:spacing w:after="20"/>
+              <w:jc w:val="center"/>
+            </w:pPr>
+            <w:r>
+              <w:rPr>
+                <w:b/>
+                <w:sz w:val="22"/>
+                <w:szCs w:val="22"/>
+              </w:rPr>
+              <w:t xml:space="preserve">Tₒ, min</w:t>
+            </w:r>
+          </w:p>
+        </w:tc>
+        <w:tc>
+          <w:tcPr>
+            <w:tcW w:w="1900" w:type="dxa"/>
+            <w:vAlign w:val="center"/>
+          </w:tcPr>
+          <w:p>
+            <w:pPr>
+              <w:spacing w:after="20"/>
+              <w:jc w:val="center"/>
+            </w:pPr>
+            <w:r>
+              <w:rPr>
+                <w:b/>
+                <w:sz w:val="22"/>
+                <w:szCs w:val="22"/>
+              </w:rPr>
+              <w:t xml:space="preserve">Tᵥ, min</w:t>
+            </w:r>
+          </w:p>
+        </w:tc>
+        <w:tc>
+          <w:tcPr>
+            <w:tcW w:w="2000" w:type="dxa"/>
+            <w:vAlign w:val="center"/>
+          </w:tcPr>
+          <w:p>
+            <w:pPr>
+              <w:spacing w:after="20"/>
+              <w:jc w:val="center"/>
+            </w:pPr>
+            <w:r>
+              <w:rPr>
+                <w:b/>
+                <w:sz w:val="22"/>
+                <w:szCs w:val="22"/>
+              </w:rPr>
+              <w:t xml:space="preserve">Tₛₕ, min</w:t>
+            </w:r>
+          </w:p>
+        </w:tc>
+      </w:tr>
+      <w:tr>
+        <w:tc>
+          <w:tcPr>
+            <w:tcW w:w="3200" w:type="dxa"/>
+            <w:vAlign w:val="center"/>
+          </w:tcPr>
+          <w:p>
+            <w:pPr>
+              <w:spacing w:after="20"/>
+              <w:jc w:val="left"/>
+            </w:pPr>
+            <w:r>
+              <w:rPr>
+                <w:sz w:val="22"/>
+                <w:szCs w:val="22"/>
+              </w:rPr>
+              <w:t xml:space="preserve">Yuvish</w:t>
+            </w:r>
+          </w:p>
+        </w:tc>
+        <w:tc>
+          <w:tcPr>
+            <w:tcW w:w="1900" w:type="dxa"/>
+            <w:vAlign w:val="center"/>
+          </w:tcPr>
+          <w:p>
+            <w:pPr>
+              <w:spacing w:after="20"/>
+              <w:jc w:val="center"/>
+            </w:pPr>
+            <w:r>
+              <w:rPr>
+                <w:sz w:val="22"/>
+                <w:szCs w:val="22"/>
+              </w:rPr>
+              <w:t xml:space="preserve">8</w:t>
+            </w:r>
+          </w:p>
+        </w:tc>
+        <w:tc>
+          <w:tcPr>
+            <w:tcW w:w="1900" w:type="dxa"/>
+            <w:vAlign w:val="center"/>
+          </w:tcPr>
+          <w:p>
+            <w:pPr>
+              <w:spacing w:after="20"/>
+              <w:jc w:val="center"/>
+            </w:pPr>
+            <w:r>
+              <w:rPr>
+                <w:sz w:val="22"/>
+                <w:szCs w:val="22"/>
+              </w:rPr>
+              <w:t xml:space="preserve">4</w:t>
+            </w:r>
+          </w:p>
+        </w:tc>
+        <w:tc>
+          <w:tcPr>
+            <w:tcW w:w="2000" w:type="dxa"/>
+            <w:vAlign w:val="center"/>
+          </w:tcPr>
+          <w:p>
+            <w:pPr>
+              <w:spacing w:after="20"/>
+              <w:jc w:val="center"/>
+            </w:pPr>
+            <w:r>
+              <w:rPr>
+                <w:sz w:val="22"/>
+                <w:szCs w:val="22"/>
+              </w:rPr>
+              <w:t xml:space="preserve">13</w:t>
+            </w:r>
+          </w:p>
+        </w:tc>
+      </w:tr>
+      <w:tr>
+        <w:tc>
+          <w:tcPr>
+            <w:tcW w:w="3200" w:type="dxa"/>
+            <w:vAlign w:val="center"/>
+          </w:tcPr>
+          <w:p>
+            <w:pPr>
+              <w:spacing w:after="20"/>
+              <w:jc w:val="left"/>
+            </w:pPr>
+            <w:r>
+              <w:rPr>
+                <w:sz w:val="22"/>
+                <w:szCs w:val="22"/>
+              </w:rPr>
+              <w:t xml:space="preserve">Demontaj</w:t>
+            </w:r>
+          </w:p>
+        </w:tc>
+        <w:tc>
+          <w:tcPr>
+            <w:tcW w:w="1900" w:type="dxa"/>
+            <w:vAlign w:val="center"/>
+          </w:tcPr>
+          <w:p>
+            <w:pPr>
+              <w:spacing w:after="20"/>
+              <w:jc w:val="center"/>
+            </w:pPr>
+            <w:r>
+              <w:rPr>
+                <w:sz w:val="22"/>
+                <w:szCs w:val="22"/>
+              </w:rPr>
+              <w:t xml:space="preserve">12</w:t>
+            </w:r>
+          </w:p>
+        </w:tc>
+        <w:tc>
+          <w:tcPr>
+            <w:tcW w:w="1900" w:type="dxa"/>
+            <w:vAlign w:val="center"/>
+          </w:tcPr>
+          <w:p>
+            <w:pPr>
+              <w:spacing w:after="20"/>
+              <w:jc w:val="center"/>
+            </w:pPr>
+            <w:r>
+              <w:rPr>
+                <w:sz w:val="22"/>
+                <w:szCs w:val="22"/>
+              </w:rPr>
+              <w:t xml:space="preserve">6</w:t>
+            </w:r>
+          </w:p>
+        </w:tc>
+        <w:tc>
+          <w:tcPr>
+            <w:tcW w:w="2000" w:type="dxa"/>
+            <w:vAlign w:val="center"/>
+          </w:tcPr>
+          <w:p>
+            <w:pPr>
+              <w:spacing w:after="20"/>
+              <w:jc w:val="center"/>
+            </w:pPr>
+            <w:r>
+              <w:rPr>
+                <w:sz w:val="22"/>
+                <w:szCs w:val="22"/>
+              </w:rPr>
+              <w:t xml:space="preserve">20</w:t>
+            </w:r>
+          </w:p>
+        </w:tc>
+      </w:tr>
+      <w:tr>
+        <w:tc>
+          <w:tcPr>
+            <w:tcW w:w="3200" w:type="dxa"/>
+            <w:vAlign w:val="center"/>
+          </w:tcPr>
+          <w:p>
+            <w:pPr>
+              <w:spacing w:after="20"/>
+              <w:jc w:val="left"/>
+            </w:pPr>
+            <w:r>
+              <w:rPr>
+                <w:sz w:val="22"/>
+                <w:szCs w:val="22"/>
+              </w:rPr>
+              <w:t xml:space="preserve">Nuqsonlash</w:t>
+            </w:r>
+          </w:p>
+        </w:tc>
+        <w:tc>
+          <w:tcPr>
+            <w:tcW w:w="1900" w:type="dxa"/>
+            <w:vAlign w:val="center"/>
+          </w:tcPr>
+          <w:p>
+            <w:pPr>
+              <w:spacing w:after="20"/>
+              <w:jc w:val="center"/>
+            </w:pPr>
+            <w:r>
+              <w:rPr>
+                <w:sz w:val="22"/>
+                <w:szCs w:val="22"/>
+              </w:rPr>
+              <w:t xml:space="preserve">15</w:t>
+            </w:r>
+          </w:p>
+        </w:tc>
+        <w:tc>
+          <w:tcPr>
+            <w:tcW w:w="1900" w:type="dxa"/>
+            <w:vAlign w:val="center"/>
+          </w:tcPr>
+          <w:p>
+            <w:pPr>
+              <w:spacing w:after="20"/>
+              <w:jc w:val="center"/>
+            </w:pPr>
+            <w:r>
+              <w:rPr>
+                <w:sz w:val="22"/>
+                <w:szCs w:val="22"/>
+              </w:rPr>
+              <w:t xml:space="preserve">5</w:t>
+            </w:r>
+          </w:p>
+        </w:tc>
+        <w:tc>
+          <w:tcPr>
+            <w:tcW w:w="2000" w:type="dxa"/>
+            <w:vAlign w:val="center"/>
+          </w:tcPr>
+          <w:p>
+            <w:pPr>
+              <w:spacing w:after="20"/>
+              <w:jc w:val="center"/>
+            </w:pPr>
+            <w:r>
+              <w:rPr>
+                <w:sz w:val="22"/>
+                <w:szCs w:val="22"/>
+              </w:rPr>
+              <w:t xml:space="preserve">22</w:t>
+            </w:r>
+          </w:p>
+        </w:tc>
+      </w:tr>
+      <w:tr>
+        <w:tc>
+          <w:tcPr>
+            <w:tcW w:w="3200" w:type="dxa"/>
+            <w:vAlign w:val="center"/>
+          </w:tcPr>
+          <w:p>
+            <w:pPr>
+              <w:spacing w:after="20"/>
+              <w:jc w:val="left"/>
+            </w:pPr>
+            <w:r>
+              <w:rPr>
+                <w:sz w:val="22"/>
+                <w:szCs w:val="22"/>
+              </w:rPr>
+              <w:t xml:space="preserve">Tiklash</w:t>
+            </w:r>
+          </w:p>
+        </w:tc>
+        <w:tc>
+          <w:tcPr>
+            <w:tcW w:w="1900" w:type="dxa"/>
+            <w:vAlign w:val="center"/>
+          </w:tcPr>
+          <w:p>
+            <w:pPr>
+              <w:spacing w:after="20"/>
+              <w:jc w:val="center"/>
+            </w:pPr>
+            <w:r>
+              <w:rPr>
+                <w:sz w:val="22"/>
+                <w:szCs w:val="22"/>
+              </w:rPr>
+              <w:t xml:space="preserve">25</w:t>
+            </w:r>
+          </w:p>
+        </w:tc>
+        <w:tc>
+          <w:tcPr>
+            <w:tcW w:w="1900" w:type="dxa"/>
+            <w:vAlign w:val="center"/>
+          </w:tcPr>
+          <w:p>
+            <w:pPr>
+              <w:spacing w:after="20"/>
+              <w:jc w:val="center"/>
+            </w:pPr>
+            <w:r>
+              <w:rPr>
+                <w:sz w:val="22"/>
+                <w:szCs w:val="22"/>
+              </w:rPr>
+              <w:t xml:space="preserve">8</w:t>
+            </w:r>
+          </w:p>
+        </w:tc>
+        <w:tc>
+          <w:tcPr>
+            <w:tcW w:w="2000" w:type="dxa"/>
+            <w:vAlign w:val="center"/>
+          </w:tcPr>
+          <w:p>
+            <w:pPr>
+              <w:spacing w:after="20"/>
+              <w:jc w:val="center"/>
+            </w:pPr>
+            <w:r>
+              <w:rPr>
+                <w:sz w:val="22"/>
+                <w:szCs w:val="22"/>
+              </w:rPr>
+              <w:t xml:space="preserve">36</w:t>
+            </w:r>
+          </w:p>
+        </w:tc>
+      </w:tr>
+      <w:tr>
+        <w:tc>
+          <w:tcPr>
+            <w:tcW w:w="3200" w:type="dxa"/>
+            <w:vAlign w:val="center"/>
+          </w:tcPr>
+          <w:p>
+            <w:pPr>
+              <w:spacing w:after="20"/>
+              <w:jc w:val="left"/>
+            </w:pPr>
+            <w:r>
+              <w:rPr>
+                <w:sz w:val="22"/>
+                <w:szCs w:val="22"/>
+              </w:rPr>
+              <w:t xml:space="preserve">Yig'ish</w:t>
+            </w:r>
+          </w:p>
+        </w:tc>
+        <w:tc>
+          <w:tcPr>
+            <w:tcW w:w="1900" w:type="dxa"/>
+            <w:vAlign w:val="center"/>
+          </w:tcPr>
+          <w:p>
+            <w:pPr>
+              <w:spacing w:after="20"/>
+              <w:jc w:val="center"/>
+            </w:pPr>
+            <w:r>
+              <w:rPr>
+                <w:sz w:val="22"/>
+                <w:szCs w:val="22"/>
+              </w:rPr>
+              <w:t xml:space="preserve">18</w:t>
+            </w:r>
+          </w:p>
+        </w:tc>
+        <w:tc>
+          <w:tcPr>
+            <w:tcW w:w="1900" w:type="dxa"/>
+            <w:vAlign w:val="center"/>
+          </w:tcPr>
+          <w:p>
+            <w:pPr>
+              <w:spacing w:after="20"/>
+              <w:jc w:val="center"/>
+            </w:pPr>
+            <w:r>
+              <w:rPr>
+                <w:sz w:val="22"/>
+                <w:szCs w:val="22"/>
+              </w:rPr>
+              <w:t xml:space="preserve">7</w:t>
+            </w:r>
+          </w:p>
+        </w:tc>
+        <w:tc>
+          <w:tcPr>
+            <w:tcW w:w="2000" w:type="dxa"/>
+            <w:vAlign w:val="center"/>
+          </w:tcPr>
+          <w:p>
+            <w:pPr>
+              <w:spacing w:after="20"/>
+              <w:jc w:val="center"/>
+            </w:pPr>
+            <w:r>
+              <w:rPr>
+                <w:sz w:val="22"/>
+                <w:szCs w:val="22"/>
+              </w:rPr>
+              <w:t xml:space="preserve">27</w:t>
+            </w:r>
+          </w:p>
+        </w:tc>
+      </w:tr>
+      <w:tr>
+        <w:tc>
+          <w:tcPr>
+            <w:tcW w:w="3200" w:type="dxa"/>
+            <w:vAlign w:val="center"/>
+          </w:tcPr>
+          <w:p>
+            <w:pPr>
+              <w:spacing w:after="20"/>
+              <w:jc w:val="left"/>
+            </w:pPr>
+            <w:r>
+              <w:rPr>
+                <w:sz w:val="22"/>
+                <w:szCs w:val="22"/>
+              </w:rPr>
+              <w:t xml:space="preserve">Sinash</w:t>
+            </w:r>
+          </w:p>
+        </w:tc>
+        <w:tc>
+          <w:tcPr>
+            <w:tcW w:w="1900" w:type="dxa"/>
+            <w:vAlign w:val="center"/>
+          </w:tcPr>
+          <w:p>
+            <w:pPr>
+              <w:spacing w:after="20"/>
+              <w:jc w:val="center"/>
+            </w:pPr>
+            <w:r>
+              <w:rPr>
+                <w:sz w:val="22"/>
+                <w:szCs w:val="22"/>
+              </w:rPr>
+              <w:t xml:space="preserve">14</w:t>
+            </w:r>
+          </w:p>
+        </w:tc>
+        <w:tc>
+          <w:tcPr>
+            <w:tcW w:w="1900" w:type="dxa"/>
+            <w:vAlign w:val="center"/>
+          </w:tcPr>
+          <w:p>
+            <w:pPr>
+              <w:spacing w:after="20"/>
+              <w:jc w:val="center"/>
+            </w:pPr>
+            <w:r>
+              <w:rPr>
+                <w:sz w:val="22"/>
+                <w:szCs w:val="22"/>
+              </w:rPr>
+              <w:t xml:space="preserve">6</w:t>
+            </w:r>
+          </w:p>
+        </w:tc>
+        <w:tc>
+          <w:tcPr>
+            <w:tcW w:w="2000" w:type="dxa"/>
+            <w:vAlign w:val="center"/>
+          </w:tcPr>
+          <w:p>
+            <w:pPr>
+              <w:spacing w:after="20"/>
+              <w:jc w:val="center"/>
+            </w:pPr>
+            <w:r>
+              <w:rPr>
+                <w:sz w:val="22"/>
+                <w:szCs w:val="22"/>
+              </w:rPr>
+              <w:t xml:space="preserve">22</w:t>
+            </w:r>
+          </w:p>
+        </w:tc>
+      </w:tr>
+      <w:tr>
+        <w:tc>
+          <w:tcPr>
+            <w:tcW w:w="3200" w:type="dxa"/>
+            <w:vAlign w:val="center"/>
+          </w:tcPr>
+          <w:p>
+            <w:pPr>
+              <w:spacing w:after="20"/>
+              <w:jc w:val="left"/>
+            </w:pPr>
+            <w:r>
+              <w:rPr>
+                <w:sz w:val="22"/>
+                <w:szCs w:val="22"/>
+              </w:rPr>
+              <w:t xml:space="preserve">Jami</w:t>
+            </w:r>
+          </w:p>
+        </w:tc>
+        <w:tc>
+          <w:tcPr>
+            <w:tcW w:w="1900" w:type="dxa"/>
+            <w:vAlign w:val="center"/>
+          </w:tcPr>
+          <w:p>
+            <w:pPr>
+              <w:spacing w:after="20"/>
+              <w:jc w:val="center"/>
+            </w:pPr>
+            <w:r>
+              <w:rPr>
+                <w:sz w:val="22"/>
+                <w:szCs w:val="22"/>
+              </w:rPr>
+              <w:t xml:space="preserve">92</w:t>
+            </w:r>
+          </w:p>
+        </w:tc>
+        <w:tc>
+          <w:tcPr>
+            <w:tcW w:w="1900" w:type="dxa"/>
+            <w:vAlign w:val="center"/>
+          </w:tcPr>
+          <w:p>
+            <w:pPr>
+              <w:spacing w:after="20"/>
+              <w:jc w:val="center"/>
+            </w:pPr>
+            <w:r>
+              <w:rPr>
+                <w:sz w:val="22"/>
+                <w:szCs w:val="22"/>
+              </w:rPr>
+              <w:t xml:space="preserve">36</w:t>
+            </w:r>
+          </w:p>
+        </w:tc>
+        <w:tc>
+          <w:tcPr>
+            <w:tcW w:w="2000" w:type="dxa"/>
+            <w:vAlign w:val="center"/>
+          </w:tcPr>
+          <w:p>
+            <w:pPr>
+              <w:spacing w:after="20"/>
+              <w:jc w:val="center"/>
+            </w:pPr>
+            <w:r>
+              <w:rPr>
+                <w:sz w:val="22"/>
+                <w:szCs w:val="22"/>
+              </w:rPr>
+              <w:t xml:space="preserve">140</w:t>
+            </w:r>
+          </w:p>
+        </w:tc>
+      </w:tr>
+    </w:tbl>
+    <w:p/>
+    <w:p>
+      <w:pPr>
+        <w:spacing w:after="120" w:line="360" w:lineRule="auto"/>
+        <w:ind w:firstLine="709"/>
+        <w:jc w:val="both"/>
+      </w:pPr>
+      <w:r>
+        <w:rPr>
+          <w:sz w:val="24"/>
+          <w:szCs w:val="24"/>
+        </w:rPr>
+        <w:t xml:space="preserve">Ta'mirlash siklining davomiyligi barcha operatsiyalar vaqti va operatsiyalararo to'xtashlar yig'indisidan iborat. Yillik ishlab chiqarish dasturi N (yiliga ta'mirlanadigan bloklar soni) ma'lum bo'lsa, har bir operatsiya bo'yicha zarur jihozlar soni quyidagicha aniqlanadi:</w:t>
+      </w:r>
+    </w:p>
+    <w:p>
+      <w:pPr>
+        <w:jc w:val="center"/>
+        <w:spacing w:before="80" w:after="120"/>
+      </w:pPr>
+      <w:r>
+        <w:rPr>
+          <w:i/>
+          <w:sz w:val="26"/>
+          <w:szCs w:val="26"/>
+        </w:rPr>
+        <w:t xml:space="preserve">Sᵣ = (N · Tₛₕ) / (Fᵈ · 60 · η)</w:t>
+      </w:r>
+    </w:p>
+    <w:p>
+      <w:pPr>
+        <w:spacing w:after="120" w:line="360" w:lineRule="auto"/>
+        <w:ind w:firstLine="709"/>
+        <w:jc w:val="both"/>
+      </w:pPr>
+      <w:r>
+        <w:rPr>
+          <w:sz w:val="24"/>
+          <w:szCs w:val="24"/>
+        </w:rPr>
+        <w:t xml:space="preserve">bu yerda: Sᵣ – hisobiy jihozlar soni; N – yillik dastur; Tₛₕ – operatsiyaning dona vaqti (min); Fᵈ – jihozning yillik samarali ish fondi (soat); η – jihozdan foydalanish koeffitsiyenti. Hisobiy son yuqoriga butun songacha yaxlitlanadi va qabul qilingan jihozlar soni aniqlanadi.</w:t>
+      </w:r>
+    </w:p>
+    <w:p>
+      <w:pPr>
+        <w:spacing w:after="120" w:line="360" w:lineRule="auto"/>
+        <w:ind w:firstLine="709"/>
+        <w:jc w:val="both"/>
+      </w:pPr>
+      <w:r>
+        <w:rPr>
+          <w:sz w:val="24"/>
+          <w:szCs w:val="24"/>
+        </w:rPr>
+        <w:t xml:space="preserve">Xuddi shu tarzda ishchilar soni ham hisoblanadi: operatsiyaning yillik mehnat hajmi ishchining yillik ish fondiga bo'linadi. Jihozlardan foydalanish koeffitsiyenti qabul qilingan va hisobiy sonlarning nisbati sifatida baholanadi; uning yuqori bo'lishi resurslardan samarali foydalanilayotganini bildiradi.</w:t>
+      </w:r>
+    </w:p>
+    <w:p>
+      <w:pPr>
+        <w:spacing w:after="120" w:line="360" w:lineRule="auto"/>
+        <w:ind w:firstLine="709"/>
+        <w:jc w:val="both"/>
+      </w:pPr>
+      <w:r>
+        <w:rPr>
+          <w:sz w:val="24"/>
+          <w:szCs w:val="24"/>
+        </w:rPr>
+        <w:t xml:space="preserve">Shunday qilib, hisoblangan vaqt me'yorlari va parametrlar texnologik jarayonni tashkil etish, ish o'rinlari va ishchilar sonini belgilash hamda ta'mirlash rejasini asoslash uchun zaruriy asos bo'lib xizmat qiladi.</w:t>
+      </w:r>
+    </w:p>
+    <w:p>
+      <w:pPr>
+        <w:spacing w:before="240" w:after="120"/>
+        <w:keepNext/>
+      </w:pPr>
+      <w:r>
+        <w:rPr>
+          <w:b/>
+          <w:sz w:val="26"/>
+          <w:szCs w:val="26"/>
+        </w:rPr>
+        <w:t xml:space="preserve">3.2. Maxsus moslamani loyihalash va mustahkamlik hisobi</w:t>
+      </w:r>
+    </w:p>
+    <w:p>
+      <w:pPr>
+        <w:spacing w:after="120" w:line="360" w:lineRule="auto"/>
+        <w:ind w:firstLine="709"/>
+        <w:jc w:val="both"/>
+      </w:pPr>
+      <w:r>
+        <w:rPr>
+          <w:sz w:val="24"/>
+          <w:szCs w:val="24"/>
+        </w:rPr>
+        <w:t xml:space="preserve">Ta'mirlash texnologiyasini samarali amalga oshirish uchun maxsus moslama loyihalanadi. Loyihalanadigan moslama – 072-blokni demontaj va yig'ish operatsiyalarida mahkamlab turuvchi qurilma bo'lib, u blokning ishonchli qotirilishini, qulay holatda joylashishini va ish xavfsizligini ta'minlaydi.</w:t>
+      </w:r>
+    </w:p>
+    <w:p>
+      <w:pPr>
+        <w:spacing w:after="120" w:line="360" w:lineRule="auto"/>
+        <w:ind w:firstLine="709"/>
+        <w:jc w:val="both"/>
+      </w:pPr>
+      <w:r>
+        <w:rPr>
+          <w:sz w:val="24"/>
+          <w:szCs w:val="24"/>
+        </w:rPr>
+        <w:t xml:space="preserve">Moslamaga qo'yiladigan asosiy talablar:</w:t>
+      </w:r>
+    </w:p>
+    <w:p>
+      <w:pPr>
+        <w:spacing w:after="60" w:line="312" w:lineRule="auto"/>
+        <w:ind w:left="709" w:hanging="284"/>
+        <w:jc w:val="both"/>
+      </w:pPr>
+      <w:r>
+        <w:rPr>
+          <w:sz w:val="24"/>
+          <w:szCs w:val="24"/>
+        </w:rPr>
+        <w:t xml:space="preserve">–  </w:t>
+      </w:r>
+      <w:r>
+        <w:rPr>
+          <w:sz w:val="24"/>
+          <w:szCs w:val="24"/>
+        </w:rPr>
+        <w:t xml:space="preserve">blokni ishonchli va tez mahkamlash hamda bo'shatish;</w:t>
+      </w:r>
+    </w:p>
+    <w:p>
+      <w:pPr>
+        <w:spacing w:after="60" w:line="312" w:lineRule="auto"/>
+        <w:ind w:left="709" w:hanging="284"/>
+        <w:jc w:val="both"/>
+      </w:pPr>
+      <w:r>
+        <w:rPr>
+          <w:sz w:val="24"/>
+          <w:szCs w:val="24"/>
+        </w:rPr>
+        <w:t xml:space="preserve">–  </w:t>
+      </w:r>
+      <w:r>
+        <w:rPr>
+          <w:sz w:val="24"/>
+          <w:szCs w:val="24"/>
+        </w:rPr>
+        <w:t xml:space="preserve">mahkamlashda blokning shikastlanmasligi;</w:t>
+      </w:r>
+    </w:p>
+    <w:p>
+      <w:pPr>
+        <w:spacing w:after="60" w:line="312" w:lineRule="auto"/>
+        <w:ind w:left="709" w:hanging="284"/>
+        <w:jc w:val="both"/>
+      </w:pPr>
+      <w:r>
+        <w:rPr>
+          <w:sz w:val="24"/>
+          <w:szCs w:val="24"/>
+        </w:rPr>
+        <w:t xml:space="preserve">–  </w:t>
+      </w:r>
+      <w:r>
+        <w:rPr>
+          <w:sz w:val="24"/>
+          <w:szCs w:val="24"/>
+        </w:rPr>
+        <w:t xml:space="preserve">operatsiyalar uchun qulay kirish imkonini ta'minlash;</w:t>
+      </w:r>
+    </w:p>
+    <w:p>
+      <w:pPr>
+        <w:spacing w:after="60" w:line="312" w:lineRule="auto"/>
+        <w:ind w:left="709" w:hanging="284"/>
+        <w:jc w:val="both"/>
+      </w:pPr>
+      <w:r>
+        <w:rPr>
+          <w:sz w:val="24"/>
+          <w:szCs w:val="24"/>
+        </w:rPr>
+        <w:t xml:space="preserve">–  </w:t>
+      </w:r>
+      <w:r>
+        <w:rPr>
+          <w:sz w:val="24"/>
+          <w:szCs w:val="24"/>
+        </w:rPr>
+        <w:t xml:space="preserve">yetarli mustahkamlik va bikrlik;</w:t>
+      </w:r>
+    </w:p>
+    <w:p>
+      <w:pPr>
+        <w:spacing w:after="60" w:line="312" w:lineRule="auto"/>
+        <w:ind w:left="709" w:hanging="284"/>
+        <w:jc w:val="both"/>
+      </w:pPr>
+      <w:r>
+        <w:rPr>
+          <w:sz w:val="24"/>
+          <w:szCs w:val="24"/>
+        </w:rPr>
+        <w:t xml:space="preserve">–  </w:t>
+      </w:r>
+      <w:r>
+        <w:rPr>
+          <w:sz w:val="24"/>
+          <w:szCs w:val="24"/>
+        </w:rPr>
+        <w:t xml:space="preserve">ishlab chiqarish va ekspluatatsiyada soddalik.</w:t>
+      </w:r>
+    </w:p>
+    <w:p>
+      <w:pPr>
+        <w:spacing w:after="120" w:line="360" w:lineRule="auto"/>
+        <w:ind w:firstLine="709"/>
+        <w:jc w:val="both"/>
+      </w:pPr>
+      <w:r>
+        <w:rPr>
+          <w:sz w:val="24"/>
+          <w:szCs w:val="24"/>
+        </w:rPr>
+        <w:t xml:space="preserve">Moslamaning ishlash prinsipi vintli (yoki ekssentrikli) qisuvchi mexanizmga asoslangan. Blok asosga o'rnatiladi va qisuvchi element yordamida mahkamlanadi. Qisish kuchi blokning ish jarayonida siljimasligini ta'minlaydigan, lekin korpusni shikastlamaydigan darajada bo'lishi kerak.</w:t>
+      </w:r>
+    </w:p>
+    <w:p>
+      <w:pPr>
+        <w:spacing w:after="120" w:line="360" w:lineRule="auto"/>
+        <w:ind w:firstLine="709"/>
+        <w:jc w:val="both"/>
+      </w:pPr>
+      <w:r>
+        <w:rPr>
+          <w:sz w:val="24"/>
+          <w:szCs w:val="24"/>
+        </w:rPr>
+        <w:t xml:space="preserve">Zarur qisish kuchi Pₖ ishlov jarayonida blokка ta'sir etuvchi kuch va ishonchlilik (zapas) koeffitsiyenti asosida aniqlanadi:</w:t>
+      </w:r>
+    </w:p>
+    <w:p>
+      <w:pPr>
+        <w:jc w:val="center"/>
+        <w:spacing w:before="80" w:after="120"/>
+      </w:pPr>
+      <w:r>
+        <w:rPr>
+          <w:i/>
+          <w:sz w:val="26"/>
+          <w:szCs w:val="26"/>
+        </w:rPr>
+        <w:t xml:space="preserve">Pₖ = K · Pᵢₛₕ</w:t>
+      </w:r>
+    </w:p>
+    <w:p>
+      <w:pPr>
+        <w:spacing w:after="120" w:line="360" w:lineRule="auto"/>
+        <w:ind w:firstLine="709"/>
+        <w:jc w:val="both"/>
+      </w:pPr>
+      <w:r>
+        <w:rPr>
+          <w:sz w:val="24"/>
+          <w:szCs w:val="24"/>
+        </w:rPr>
+        <w:t xml:space="preserve">bu yerda: Pₖ – zarur qisish kuchi; K – ishonchlilik koeffitsiyenti (odatda 1,5–2,0); Pᵢₛₕ – operatsiya jarayonida yuzaga keladigan siljituvchi kuch. Vintli mexanizmda qisish kuchi vintga qo'yilgan aylantiruvchi moment orqali yuzaga keltiriladi.</w:t>
+      </w:r>
+    </w:p>
+    <w:p>
+      <w:pPr>
+        <w:spacing w:after="120" w:line="360" w:lineRule="auto"/>
+        <w:ind w:firstLine="709"/>
+        <w:jc w:val="both"/>
+      </w:pPr>
+      <w:r>
+        <w:rPr>
+          <w:sz w:val="24"/>
+          <w:szCs w:val="24"/>
+        </w:rPr>
+        <w:t xml:space="preserve">Vintdagi kuchlanish mustahkamlikка tekshiriladi. Vint materialining cho'zilishga (yoki siqilishga) mustahkamligi sharti quyidagicha:</w:t>
+      </w:r>
+    </w:p>
+    <w:p>
+      <w:pPr>
+        <w:jc w:val="center"/>
+        <w:spacing w:before="80" w:after="120"/>
+      </w:pPr>
+      <w:r>
+        <w:rPr>
+          <w:i/>
+          <w:sz w:val="26"/>
+          <w:szCs w:val="26"/>
+        </w:rPr>
+        <w:t xml:space="preserve">σ = Pₖ / A ≤ [σ]</w:t>
+      </w:r>
+    </w:p>
+    <w:p>
+      <w:pPr>
+        <w:spacing w:after="120" w:line="360" w:lineRule="auto"/>
+        <w:ind w:firstLine="709"/>
+        <w:jc w:val="both"/>
+      </w:pPr>
+      <w:r>
+        <w:rPr>
+          <w:sz w:val="24"/>
+          <w:szCs w:val="24"/>
+        </w:rPr>
+        <w:t xml:space="preserve">bu yerda: σ – vintdagi haqiqiy kuchlanish; A – vintning kese maydoni (ichki diametr bo'yicha); [σ] – material uchun ruxsat etilgan kuchlanish. Shart bajarilsa, tanlangan vint diametri yetarli mustahkamlikка ega hisoblanadi; aks holda kattaroq diametr tanlanadi.</w:t>
+      </w:r>
+    </w:p>
+    <w:p>
+      <w:pPr>
+        <w:spacing w:after="120" w:line="360" w:lineRule="auto"/>
+        <w:ind w:firstLine="709"/>
+        <w:jc w:val="both"/>
+      </w:pPr>
+      <w:r>
+        <w:rPr>
+          <w:sz w:val="24"/>
+          <w:szCs w:val="24"/>
+        </w:rPr>
+        <w:t xml:space="preserve">Moslamaning asos plitasi egilishga (bikrlikка) tekshiriladi. Egilish deformatsiyasi ruxsat etilgan qiymatdan oshmasligi kerak, aks holda blokning aniq joylashishi buziladi. Hisob natijasida plita qalinligi va qovurg'alar (rebro) zarurligi belgilanadi. Moslamaning sxematik ko'rinishi 3.1-rasmda keltirilgan.</w:t>
+      </w:r>
+    </w:p>
+    <w:tbl>
+      <w:tblPr>
+        <w:tblW w:w="7600" w:type="dxa"/>
+        <w:jc w:val="center"/>
+        <w:tblBorders>
+          <w:top w:val="single" w:sz="6" w:space="0" w:color="000000"/>
+          <w:left w:val="single" w:sz="6" w:space="0" w:color="000000"/>
+          <w:bottom w:val="single" w:sz="6" w:space="0" w:color="000000"/>
+          <w:right w:val="single" w:sz="6" w:space="0" w:color="000000"/>
+          <w:insideH w:val="single" w:sz="6" w:space="0" w:color="000000"/>
+          <w:insideV w:val="single" w:sz="6" w:space="0" w:color="000000"/>
+        </w:tblBorders>
+      </w:tblPr>
+      <w:tblGrid>
+        <w:gridCol w:w="7600"/>
+      </w:tblGrid>
+      <w:tr>
+        <w:tc>
+          <w:tcPr>
+            <w:tcW w:w="7600" w:type="dxa"/>
+            <w:vAlign w:val="center"/>
+          </w:tcPr>
+          <w:p>
+            <w:pPr>
+              <w:jc w:val="center"/>
+              <w:spacing w:after="0"/>
+            </w:pPr>
+            <w:r>
+              <w:rPr>
+                <w:b/>
+                <w:sz w:val="22"/>
+                <w:szCs w:val="22"/>
+              </w:rPr>
+              <w:t xml:space="preserve">Qisuvchi vint (mahkamlash mexanizmi)</w:t>
+            </w:r>
+          </w:p>
+        </w:tc>
+      </w:tr>
+    </w:tbl>
+    <w:p>
+      <w:pPr>
+        <w:jc w:val="center"/>
+        <w:spacing w:before="20" w:after="20"/>
+      </w:pPr>
+      <w:r>
+        <w:rPr>
+          <w:b/>
+          <w:sz w:val="30"/>
+          <w:szCs w:val="30"/>
+        </w:rPr>
+        <w:t xml:space="preserve">↓</w:t>
+      </w:r>
+    </w:p>
+    <w:tbl>
+      <w:tblPr>
+        <w:tblW w:w="7600" w:type="dxa"/>
+        <w:jc w:val="center"/>
+        <w:tblBorders>
+          <w:top w:val="single" w:sz="6" w:space="0" w:color="000000"/>
+          <w:left w:val="single" w:sz="6" w:space="0" w:color="000000"/>
+          <w:bottom w:val="single" w:sz="6" w:space="0" w:color="000000"/>
+          <w:right w:val="single" w:sz="6" w:space="0" w:color="000000"/>
+          <w:insideH w:val="single" w:sz="6" w:space="0" w:color="000000"/>
+          <w:insideV w:val="single" w:sz="6" w:space="0" w:color="000000"/>
+        </w:tblBorders>
+      </w:tblPr>
+      <w:tblGrid>
+        <w:gridCol w:w="7600"/>
+      </w:tblGrid>
+      <w:tr>
+        <w:tc>
+          <w:tcPr>
+            <w:tcW w:w="7600" w:type="dxa"/>
+            <w:vAlign w:val="center"/>
+          </w:tcPr>
+          <w:p>
+            <w:pPr>
+              <w:jc w:val="center"/>
+              <w:spacing w:after="0"/>
+            </w:pPr>
+            <w:r>
+              <w:rPr>
+                <w:b/>
+                <w:sz w:val="22"/>
+                <w:szCs w:val="22"/>
+              </w:rPr>
+              <w:t xml:space="preserve">072-blok (mahkamlanadigan detal)</w:t>
+            </w:r>
+          </w:p>
+        </w:tc>
+      </w:tr>
+    </w:tbl>
+    <w:p>
+      <w:pPr>
+        <w:jc w:val="center"/>
+        <w:spacing w:before="20" w:after="20"/>
+      </w:pPr>
+      <w:r>
+        <w:rPr>
+          <w:b/>
+          <w:sz w:val="30"/>
+          <w:szCs w:val="30"/>
+        </w:rPr>
+        <w:t xml:space="preserve">↓</w:t>
+      </w:r>
+    </w:p>
+    <w:tbl>
+      <w:tblPr>
+        <w:tblW w:w="7600" w:type="dxa"/>
+        <w:jc w:val="center"/>
+        <w:tblBorders>
+          <w:top w:val="single" w:sz="6" w:space="0" w:color="000000"/>
+          <w:left w:val="single" w:sz="6" w:space="0" w:color="000000"/>
+          <w:bottom w:val="single" w:sz="6" w:space="0" w:color="000000"/>
+          <w:right w:val="single" w:sz="6" w:space="0" w:color="000000"/>
+          <w:insideH w:val="single" w:sz="6" w:space="0" w:color="000000"/>
+          <w:insideV w:val="single" w:sz="6" w:space="0" w:color="000000"/>
+        </w:tblBorders>
+      </w:tblPr>
+      <w:tblGrid>
+        <w:gridCol w:w="7600"/>
+      </w:tblGrid>
+      <w:tr>
+        <w:tc>
+          <w:tcPr>
+            <w:tcW w:w="7600" w:type="dxa"/>
+            <w:vAlign w:val="center"/>
+          </w:tcPr>
+          <w:p>
+            <w:pPr>
+              <w:jc w:val="center"/>
+              <w:spacing w:after="0"/>
+            </w:pPr>
+            <w:r>
+              <w:rPr>
+                <w:b/>
+                <w:sz w:val="22"/>
+                <w:szCs w:val="22"/>
+              </w:rPr>
+              <w:t xml:space="preserve">Asos plitasi va qovurg'alar (tayanch)</w:t>
+            </w:r>
+          </w:p>
+        </w:tc>
+      </w:tr>
+    </w:tbl>
+    <w:p/>
+    <w:p>
+      <w:pPr>
+        <w:jc w:val="center"/>
+        <w:spacing w:before="40" w:after="200"/>
+      </w:pPr>
+      <w:r>
+        <w:rPr>
+          <w:i/>
+          <w:sz w:val="22"/>
+          <w:szCs w:val="22"/>
+        </w:rPr>
+        <w:t xml:space="preserve">3.1-rasm. Mahkamlovchi moslamaning sxematik tuzilishi</w:t>
+      </w:r>
+    </w:p>
+    <w:p>
+      <w:pPr>
+        <w:spacing w:after="120" w:line="360" w:lineRule="auto"/>
+        <w:ind w:firstLine="709"/>
+        <w:jc w:val="both"/>
+      </w:pPr>
+      <w:r>
+        <w:rPr>
+          <w:sz w:val="24"/>
+          <w:szCs w:val="24"/>
+        </w:rPr>
+        <w:t xml:space="preserve">O'tkazilgan hisoblar moslamaning tanlangan o'lchamlari va materiali mustahkamlik va bikrlik talablarini qondirishini ko'rsatadi. Loyihalangan moslama demontaj va yig'ish operatsiyalarining xavfsizligi va unumdorligini oshirish imkonini beradi.</w:t>
+      </w:r>
+    </w:p>
+    <w:p>
+      <w:pPr>
+        <w:spacing w:before="240" w:after="120"/>
+        <w:keepNext/>
+      </w:pPr>
+      <w:r>
+        <w:rPr>
+          <w:b/>
+          <w:sz w:val="26"/>
+          <w:szCs w:val="26"/>
+        </w:rPr>
+        <w:t xml:space="preserve">3.3. Sinov stendi sxemasini ishlab chiqish</w:t>
+      </w:r>
+    </w:p>
+    <w:p>
+      <w:pPr>
+        <w:spacing w:after="120" w:line="360" w:lineRule="auto"/>
+        <w:ind w:firstLine="709"/>
+        <w:jc w:val="both"/>
+      </w:pPr>
+      <w:r>
+        <w:rPr>
+          <w:sz w:val="24"/>
+          <w:szCs w:val="24"/>
+        </w:rPr>
+        <w:t xml:space="preserve">Tiklangan blokni sinash uchun sinov stendi loyihalanadi. Stend blokning germetikligini, sezgirligini va ish rejimlarini real ekspluatatsiyaga yaqin sharoitda tekshirish imkonini berishi kerak. Stend pnevmatik qurilma bo'lib, siqilgan havo manbai, boshqaruv va o'lchov elementlaridan tashkil topadi.</w:t>
+      </w:r>
+    </w:p>
+    <w:p>
+      <w:pPr>
+        <w:spacing w:after="120" w:line="360" w:lineRule="auto"/>
+        <w:ind w:firstLine="709"/>
+        <w:jc w:val="both"/>
+      </w:pPr>
+      <w:r>
+        <w:rPr>
+          <w:sz w:val="24"/>
+          <w:szCs w:val="24"/>
+        </w:rPr>
+        <w:t xml:space="preserve">Sinov stendining asosiy tarkibiy elementlari:</w:t>
+      </w:r>
+    </w:p>
+    <w:p>
+      <w:pPr>
+        <w:spacing w:after="60" w:line="312" w:lineRule="auto"/>
+        <w:ind w:left="709" w:hanging="284"/>
+        <w:jc w:val="both"/>
+      </w:pPr>
+      <w:r>
+        <w:rPr>
+          <w:sz w:val="24"/>
+          <w:szCs w:val="24"/>
+        </w:rPr>
+        <w:t xml:space="preserve">–  </w:t>
+      </w:r>
+      <w:r>
+        <w:rPr>
+          <w:sz w:val="24"/>
+          <w:szCs w:val="24"/>
+        </w:rPr>
+        <w:t xml:space="preserve">siqilgan havo manbai (kompressor yoki sex magistrali);</w:t>
+      </w:r>
+    </w:p>
+    <w:p>
+      <w:pPr>
+        <w:spacing w:after="60" w:line="312" w:lineRule="auto"/>
+        <w:ind w:left="709" w:hanging="284"/>
+        <w:jc w:val="both"/>
+      </w:pPr>
+      <w:r>
+        <w:rPr>
+          <w:sz w:val="24"/>
+          <w:szCs w:val="24"/>
+        </w:rPr>
+        <w:t xml:space="preserve">–  </w:t>
+      </w:r>
+      <w:r>
+        <w:rPr>
+          <w:sz w:val="24"/>
+          <w:szCs w:val="24"/>
+        </w:rPr>
+        <w:t xml:space="preserve">filtr va bosim rostlagich (reduktor);</w:t>
+      </w:r>
+    </w:p>
+    <w:p>
+      <w:pPr>
+        <w:spacing w:after="60" w:line="312" w:lineRule="auto"/>
+        <w:ind w:left="709" w:hanging="284"/>
+        <w:jc w:val="both"/>
+      </w:pPr>
+      <w:r>
+        <w:rPr>
+          <w:sz w:val="24"/>
+          <w:szCs w:val="24"/>
+        </w:rPr>
+        <w:t xml:space="preserve">–  </w:t>
+      </w:r>
+      <w:r>
+        <w:rPr>
+          <w:sz w:val="24"/>
+          <w:szCs w:val="24"/>
+        </w:rPr>
+        <w:t xml:space="preserve">boshqaruv kranlari va taqsimlagich;</w:t>
+      </w:r>
+    </w:p>
+    <w:p>
+      <w:pPr>
+        <w:spacing w:after="60" w:line="312" w:lineRule="auto"/>
+        <w:ind w:left="709" w:hanging="284"/>
+        <w:jc w:val="both"/>
+      </w:pPr>
+      <w:r>
+        <w:rPr>
+          <w:sz w:val="24"/>
+          <w:szCs w:val="24"/>
+        </w:rPr>
+        <w:t xml:space="preserve">–  </w:t>
+      </w:r>
+      <w:r>
+        <w:rPr>
+          <w:sz w:val="24"/>
+          <w:szCs w:val="24"/>
+        </w:rPr>
+        <w:t xml:space="preserve">o'lchov manometrlari (sinf aniqligi yetarli);</w:t>
+      </w:r>
+    </w:p>
+    <w:p>
+      <w:pPr>
+        <w:spacing w:after="60" w:line="312" w:lineRule="auto"/>
+        <w:ind w:left="709" w:hanging="284"/>
+        <w:jc w:val="both"/>
+      </w:pPr>
+      <w:r>
+        <w:rPr>
+          <w:sz w:val="24"/>
+          <w:szCs w:val="24"/>
+        </w:rPr>
+        <w:t xml:space="preserve">–  </w:t>
+      </w:r>
+      <w:r>
+        <w:rPr>
+          <w:sz w:val="24"/>
+          <w:szCs w:val="24"/>
+        </w:rPr>
+        <w:t xml:space="preserve">zaxira rezervuar va tormoz silindri imitatorlari;</w:t>
+      </w:r>
+    </w:p>
+    <w:p>
+      <w:pPr>
+        <w:spacing w:after="60" w:line="312" w:lineRule="auto"/>
+        <w:ind w:left="709" w:hanging="284"/>
+        <w:jc w:val="both"/>
+      </w:pPr>
+      <w:r>
+        <w:rPr>
+          <w:sz w:val="24"/>
+          <w:szCs w:val="24"/>
+        </w:rPr>
+        <w:t xml:space="preserve">–  </w:t>
+      </w:r>
+      <w:r>
+        <w:rPr>
+          <w:sz w:val="24"/>
+          <w:szCs w:val="24"/>
+        </w:rPr>
+        <w:t xml:space="preserve">sinaladigan blokни ulovchi moslama (ulagich).</w:t>
+      </w:r>
+    </w:p>
+    <w:p>
+      <w:pPr>
+        <w:spacing w:after="120" w:line="360" w:lineRule="auto"/>
+        <w:ind w:firstLine="709"/>
+        <w:jc w:val="both"/>
+      </w:pPr>
+      <w:r>
+        <w:rPr>
+          <w:sz w:val="24"/>
+          <w:szCs w:val="24"/>
+        </w:rPr>
+        <w:t xml:space="preserve">Stendning ishlash prinsipi quyidagicha: manbadan kelgan havo filtr va reduktordan o'tib, belgilangan ish bosimigacha rostlanadi; boshqaruv krani orqali havo sinaladigan blokка beriladi; blokning javobi (silindr imitatoridagi bosim) manometrlar yordamida o'lchanadi va me'yorlar bilan taqqoslanadi. Stendning prinsipial sxemasi 3.2-rasmda keltirilgan.</w:t>
+      </w:r>
+    </w:p>
+    <w:tbl>
+      <w:tblPr>
+        <w:tblW w:w="8200" w:type="dxa"/>
+        <w:jc w:val="center"/>
+        <w:tblBorders>
+          <w:top w:val="single" w:sz="6" w:space="0" w:color="000000"/>
+          <w:left w:val="single" w:sz="6" w:space="0" w:color="000000"/>
+          <w:bottom w:val="single" w:sz="6" w:space="0" w:color="000000"/>
+          <w:right w:val="single" w:sz="6" w:space="0" w:color="000000"/>
+          <w:insideH w:val="single" w:sz="6" w:space="0" w:color="000000"/>
+          <w:insideV w:val="single" w:sz="6" w:space="0" w:color="000000"/>
+        </w:tblBorders>
+      </w:tblPr>
+      <w:tblGrid>
+        <w:gridCol w:w="8200"/>
+      </w:tblGrid>
+      <w:tr>
+        <w:tc>
+          <w:tcPr>
+            <w:tcW w:w="8200" w:type="dxa"/>
+            <w:vAlign w:val="center"/>
+          </w:tcPr>
+          <w:p>
+            <w:pPr>
+              <w:jc w:val="center"/>
+              <w:spacing w:after="0"/>
+            </w:pPr>
+            <w:r>
+              <w:rPr>
+                <w:b/>
+                <w:sz w:val="22"/>
+                <w:szCs w:val="22"/>
+              </w:rPr>
+              <w:t xml:space="preserve">Siqilgan havo manbai</w:t>
+            </w:r>
+          </w:p>
+        </w:tc>
+      </w:tr>
+    </w:tbl>
+    <w:p>
+      <w:pPr>
+        <w:jc w:val="center"/>
+        <w:spacing w:before="20" w:after="20"/>
+      </w:pPr>
+      <w:r>
+        <w:rPr>
+          <w:b/>
+          <w:sz w:val="30"/>
+          <w:szCs w:val="30"/>
+        </w:rPr>
+        <w:t xml:space="preserve">↓</w:t>
+      </w:r>
+    </w:p>
+    <w:tbl>
+      <w:tblPr>
+        <w:tblW w:w="8200" w:type="dxa"/>
+        <w:jc w:val="center"/>
+        <w:tblBorders>
+          <w:top w:val="single" w:sz="6" w:space="0" w:color="000000"/>
+          <w:left w:val="single" w:sz="6" w:space="0" w:color="000000"/>
+          <w:bottom w:val="single" w:sz="6" w:space="0" w:color="000000"/>
+          <w:right w:val="single" w:sz="6" w:space="0" w:color="000000"/>
+          <w:insideH w:val="single" w:sz="6" w:space="0" w:color="000000"/>
+          <w:insideV w:val="single" w:sz="6" w:space="0" w:color="000000"/>
+        </w:tblBorders>
+      </w:tblPr>
+      <w:tblGrid>
+        <w:gridCol w:w="8200"/>
+      </w:tblGrid>
+      <w:tr>
+        <w:tc>
+          <w:tcPr>
+            <w:tcW w:w="8200" w:type="dxa"/>
+            <w:vAlign w:val="center"/>
+          </w:tcPr>
+          <w:p>
+            <w:pPr>
+              <w:jc w:val="center"/>
+              <w:spacing w:after="0"/>
+            </w:pPr>
+            <w:r>
+              <w:rPr>
+                <w:b/>
+                <w:sz w:val="22"/>
+                <w:szCs w:val="22"/>
+              </w:rPr>
+              <w:t xml:space="preserve">Filtr + bosim rostlagich (reduktor)</w:t>
+            </w:r>
+          </w:p>
+        </w:tc>
+      </w:tr>
+    </w:tbl>
+    <w:p>
+      <w:pPr>
+        <w:jc w:val="center"/>
+        <w:spacing w:before="20" w:after="20"/>
+      </w:pPr>
+      <w:r>
+        <w:rPr>
+          <w:b/>
+          <w:sz w:val="30"/>
+          <w:szCs w:val="30"/>
+        </w:rPr>
+        <w:t xml:space="preserve">↓</w:t>
+      </w:r>
+    </w:p>
+    <w:tbl>
+      <w:tblPr>
+        <w:tblW w:w="8200" w:type="dxa"/>
+        <w:jc w:val="center"/>
+        <w:tblBorders>
+          <w:top w:val="single" w:sz="6" w:space="0" w:color="000000"/>
+          <w:left w:val="single" w:sz="6" w:space="0" w:color="000000"/>
+          <w:bottom w:val="single" w:sz="6" w:space="0" w:color="000000"/>
+          <w:right w:val="single" w:sz="6" w:space="0" w:color="000000"/>
+          <w:insideH w:val="single" w:sz="6" w:space="0" w:color="000000"/>
+          <w:insideV w:val="single" w:sz="6" w:space="0" w:color="000000"/>
+        </w:tblBorders>
+      </w:tblPr>
+      <w:tblGrid>
+        <w:gridCol w:w="8200"/>
+      </w:tblGrid>
+      <w:tr>
+        <w:tc>
+          <w:tcPr>
+            <w:tcW w:w="8200" w:type="dxa"/>
+            <w:vAlign w:val="center"/>
+          </w:tcPr>
+          <w:p>
+            <w:pPr>
+              <w:jc w:val="center"/>
+              <w:spacing w:after="0"/>
+            </w:pPr>
+            <w:r>
+              <w:rPr>
+                <w:b/>
+                <w:sz w:val="22"/>
+                <w:szCs w:val="22"/>
+              </w:rPr>
+              <w:t xml:space="preserve">Boshqaruv krani va taqsimlagich</w:t>
+            </w:r>
+          </w:p>
+        </w:tc>
+      </w:tr>
+    </w:tbl>
+    <w:p>
+      <w:pPr>
+        <w:jc w:val="center"/>
+        <w:spacing w:before="20" w:after="20"/>
+      </w:pPr>
+      <w:r>
+        <w:rPr>
+          <w:b/>
+          <w:sz w:val="30"/>
+          <w:szCs w:val="30"/>
+        </w:rPr>
+        <w:t xml:space="preserve">↓</w:t>
+      </w:r>
+    </w:p>
+    <w:tbl>
+      <w:tblPr>
+        <w:tblW w:w="8200" w:type="dxa"/>
+        <w:jc w:val="center"/>
+        <w:tblBorders>
+          <w:top w:val="single" w:sz="6" w:space="0" w:color="000000"/>
+          <w:left w:val="single" w:sz="6" w:space="0" w:color="000000"/>
+          <w:bottom w:val="single" w:sz="6" w:space="0" w:color="000000"/>
+          <w:right w:val="single" w:sz="6" w:space="0" w:color="000000"/>
+          <w:insideH w:val="single" w:sz="6" w:space="0" w:color="000000"/>
+          <w:insideV w:val="single" w:sz="6" w:space="0" w:color="000000"/>
+        </w:tblBorders>
+      </w:tblPr>
+      <w:tblGrid>
+        <w:gridCol w:w="8200"/>
+      </w:tblGrid>
+      <w:tr>
+        <w:tc>
+          <w:tcPr>
+            <w:tcW w:w="8200" w:type="dxa"/>
+            <w:vAlign w:val="center"/>
+          </w:tcPr>
+          <w:p>
+            <w:pPr>
+              <w:jc w:val="center"/>
+              <w:spacing w:after="0"/>
+            </w:pPr>
+            <w:r>
+              <w:rPr>
+                <w:b/>
+                <w:sz w:val="22"/>
+                <w:szCs w:val="22"/>
+              </w:rPr>
+              <w:t xml:space="preserve">Sinaladigan blok + zaxira rezervuar imitatori</w:t>
+            </w:r>
+          </w:p>
+        </w:tc>
+      </w:tr>
+    </w:tbl>
+    <w:p>
+      <w:pPr>
+        <w:jc w:val="center"/>
+        <w:spacing w:before="20" w:after="20"/>
+      </w:pPr>
+      <w:r>
+        <w:rPr>
+          <w:b/>
+          <w:sz w:val="30"/>
+          <w:szCs w:val="30"/>
+        </w:rPr>
+        <w:t xml:space="preserve">↓</w:t>
+      </w:r>
+    </w:p>
+    <w:tbl>
+      <w:tblPr>
+        <w:tblW w:w="8200" w:type="dxa"/>
+        <w:jc w:val="center"/>
+        <w:tblBorders>
+          <w:top w:val="single" w:sz="6" w:space="0" w:color="000000"/>
+          <w:left w:val="single" w:sz="6" w:space="0" w:color="000000"/>
+          <w:bottom w:val="single" w:sz="6" w:space="0" w:color="000000"/>
+          <w:right w:val="single" w:sz="6" w:space="0" w:color="000000"/>
+          <w:insideH w:val="single" w:sz="6" w:space="0" w:color="000000"/>
+          <w:insideV w:val="single" w:sz="6" w:space="0" w:color="000000"/>
+        </w:tblBorders>
+      </w:tblPr>
+      <w:tblGrid>
+        <w:gridCol w:w="8200"/>
+      </w:tblGrid>
+      <w:tr>
+        <w:tc>
+          <w:tcPr>
+            <w:tcW w:w="8200" w:type="dxa"/>
+            <w:vAlign w:val="center"/>
+          </w:tcPr>
+          <w:p>
+            <w:pPr>
+              <w:jc w:val="center"/>
+              <w:spacing w:after="0"/>
+            </w:pPr>
+            <w:r>
+              <w:rPr>
+                <w:b/>
+                <w:sz w:val="22"/>
+                <w:szCs w:val="22"/>
+              </w:rPr>
+              <w:t xml:space="preserve">Tormoz silindri imitatori + o'lchov manometrlari</w:t>
+            </w:r>
+          </w:p>
+        </w:tc>
+      </w:tr>
+    </w:tbl>
+    <w:p/>
+    <w:p>
+      <w:pPr>
+        <w:jc w:val="center"/>
+        <w:spacing w:before="40" w:after="200"/>
+      </w:pPr>
+      <w:r>
+        <w:rPr>
+          <w:i/>
+          <w:sz w:val="22"/>
+          <w:szCs w:val="22"/>
+        </w:rPr>
+        <w:t xml:space="preserve">3.2-rasm. Sinov stendining prinsipial pnevmatik sxemasi</w:t>
+      </w:r>
+    </w:p>
+    <w:p>
+      <w:pPr>
+        <w:spacing w:after="120" w:line="360" w:lineRule="auto"/>
+        <w:ind w:firstLine="709"/>
+        <w:jc w:val="both"/>
+      </w:pPr>
+      <w:r>
+        <w:rPr>
+          <w:sz w:val="24"/>
+          <w:szCs w:val="24"/>
+        </w:rPr>
+        <w:t xml:space="preserve">Stendni loyihalashda rezervuar va silindr imitatorlarining hajmi real qiymatlarга mos tanlanadi, chunki bosimning o'sish va pasayish vaqti hajmga bog'liq. Havo sarfini ta'minlash uchun manba quvvati va quvurlar kese yuzasi yetarli bo'lishi kerak. O'lchov manometrlari sinaladigan parametrlar diapazoniga va talab qilinadigan aniqlikка mos tanlanadi.</w:t>
+      </w:r>
+    </w:p>
+    <w:p>
+      <w:pPr>
+        <w:spacing w:after="120" w:line="360" w:lineRule="auto"/>
+        <w:ind w:firstLine="709"/>
+        <w:jc w:val="both"/>
+      </w:pPr>
+      <w:r>
+        <w:rPr>
+          <w:sz w:val="24"/>
+          <w:szCs w:val="24"/>
+        </w:rPr>
+        <w:t xml:space="preserve">Stendning germetikligi alohida ta'minlanadi: barcha ulanishlar zich bo'lishi va stendning o'z sizishlari minimal bo'lishi kerak, aks holda ular sinov natijalarini buzadi. Stend davriy ravishda etalon blok yordamida tekshiriladi va o'lchov asboblari metrologik nazoratdan o'tkaziladi.</w:t>
+      </w:r>
+    </w:p>
+    <w:p>
+      <w:pPr>
+        <w:spacing w:after="120" w:line="360" w:lineRule="auto"/>
+        <w:ind w:firstLine="709"/>
+        <w:jc w:val="both"/>
+      </w:pPr>
+      <w:r>
+        <w:rPr>
+          <w:sz w:val="24"/>
+          <w:szCs w:val="24"/>
+        </w:rPr>
+        <w:t xml:space="preserve">Ishlab chiqilgan stend sxemasi sinash operatsiyasini to'liq, ishonchli va xavfsiz amalga oshirish imkonini beradi. Zamonaviy stendlarda o'lchash va qayd etish jarayonini avtomatlashtirish sinash aniqligini oshiradi va inson omilini kamaytiradi.</w:t>
+      </w:r>
+    </w:p>
+    <w:p>
+      <w:pPr>
+        <w:spacing w:after="120" w:line="360" w:lineRule="auto"/>
+        <w:ind w:firstLine="709"/>
+        <w:jc w:val="both"/>
+      </w:pPr>
+      <w:r>
+        <w:rPr>
+          <w:sz w:val="24"/>
+          <w:szCs w:val="24"/>
+        </w:rPr>
+        <w:t xml:space="preserve">Uchinchi bob bo'yicha xulosa qilib aytganda, texnologik jarayonning vaqt me'yorlari va asosiy parametrlari hisoblandi, mahkamlovchi maxsus moslama loyihalanib mustahkamlikка tekshirildi hamda sinov stendining prinsipial sxemasi ishlab chiqildi. Olingan natijalar texnologik jarayonni konstruktorlik jihatdan asoslaydi va uni amaliyotга joriy etish imkonini beradi.</w:t>
+      </w:r>
+    </w:p>
     <w:sectPr>
       <w:pgSz w:w="11906" w:h="16838"/>
       <w:pgMar w:top="1134" w:right="567" w:bottom="1134" w:left="1701" w:header="708" w:footer="708" w:gutter="0"/>

</xml_diff>

<commit_message>
Integrate BTO-072 data into Chapter I; enrich with table and pneumatic scheme
</commit_message>
<xml_diff>
--- a/Diplom_ishi.docx
+++ b/Diplom_ishi.docx
@@ -1453,6 +1453,34 @@
           <w:sz w:val="24"/>
           <w:szCs w:val="24"/>
         </w:rPr>
+        <w:t xml:space="preserve">Ushbu bitiruv malakaviy ishida ko'rib chiqilayotgan obyekt – 072-rusumli tormoz uskunalari bloki (ruscha: «Блок тормозного оборудования», БТО-072; chizma raqami 072.00.000) bo'lib, u temir yo'l harakat tarkibining (yo'lovchi vagonlari, elektropoyezdlar) pnevmatik tormoz tizimida qo'llaniladi. Blok bir nechta tormoz apparatlarini yagona asos-plitada (plita-osnova) birlashtirgan unifikatsiyalangan tugun bo'lib, ularning harakat tarkibiga o'rnatilishini va texnik xizmat ko'rsatilishini soddalashtiradi.</w:t>
+      </w:r>
+    </w:p>
+    <w:p>
+      <w:pPr>
+        <w:spacing w:after="120" w:line="360" w:lineRule="auto"/>
+        <w:ind w:firstLine="709"/>
+        <w:jc w:val="both"/>
+      </w:pPr>
+      <w:r>
+        <w:rPr>
+          <w:sz w:val="24"/>
+          <w:szCs w:val="24"/>
+        </w:rPr>
+        <w:t xml:space="preserve">Bunday blokli yechimning asosiy afzalligi shundaki, alohida apparatlarni vagon ramasiga tarqoq o'rnatish o'rniga, ular bitta plitada zavod sharoitida yig'iladi va sozlanadi. Bu montaj mehnatini kamaytiradi, germetiklikni oshiradi va ta'mirlash hamda almashtirishni osonlashtiradi. Aynan shu sababli kapital ta'mirlashda blokni yaxlit tugun sifatida ta'mirlash texnologiyasini ishlab chiqish dolzarb hisoblanadi.</w:t>
+      </w:r>
+    </w:p>
+    <w:p>
+      <w:pPr>
+        <w:spacing w:after="120" w:line="360" w:lineRule="auto"/>
+        <w:ind w:firstLine="709"/>
+        <w:jc w:val="both"/>
+      </w:pPr>
+      <w:r>
+        <w:rPr>
+          <w:sz w:val="24"/>
+          <w:szCs w:val="24"/>
+        </w:rPr>
         <w:t xml:space="preserve">Temir yo'l harakat tarkibining tormoz tizimi poyezd tezligini kamaytirish, uni to'xtatish hamda turgan holatda ushlab turish uchun xizmat qiladi. Zamonaviy harakat tarkibida asosan pnevmatik (havo bilan ishlaydigan) avtomatik tormoz tizimi qo'llaniladi. Bu tizimda tormozlash siqilgan havo energiyasi hisobiga amalga oshiriladi, boshqaruv esa tormoz magistralidagi bosimni o'zgartirish orqali bajariladi. Tizimning avtomatikligi shundan iboratki, magistral uzilganda yoki bosim keskin pasayganda poyezd o'z-o'zidan tormozlanadi.</w:t>
       </w:r>
     </w:p>
@@ -1631,6 +1659,321 @@
         <w:t xml:space="preserve">Texnik tavsifda blokning ortiqcha bosimga, dinamik yuklamalarga va atrof-muhit ta'siriga chidamliligi alohida e'tiborga olinadi. Harakat tarkibi turli iqlim sharoitlarida va yo'lning notekisliklarida ishlagani uchun blok doimiy tebranish va zarbalarga duch keladi. Shu bois uning konstruksiyasi mustahkam, biriktiruvchi elementlari esa o'z-o'zidan bo'shab ketishdan himoyalangan bo'lishi kerak.</w:t>
       </w:r>
     </w:p>
+    <w:p>
+      <w:pPr>
+        <w:spacing w:after="120" w:line="360" w:lineRule="auto"/>
+        <w:ind w:firstLine="709"/>
+        <w:jc w:val="both"/>
+      </w:pPr>
+      <w:r>
+        <w:rPr>
+          <w:sz w:val="24"/>
+          <w:szCs w:val="24"/>
+        </w:rPr>
+        <w:t xml:space="preserve">Blokning asosiy texnik ko'rsatkichlari 1.1-jadvalda umumlashtirilgan (qiymatlar shu turdagi yo'lovchi vagon tormoz uskunalari uchun xos bo'lib, konkret rusumning texnik shartlari asosida aniqlanadi).</w:t>
+      </w:r>
+    </w:p>
+    <w:tbl>
+      <w:tblPr>
+        <w:tblW w:w="0" w:type="auto"/>
+        <w:jc w:val="center"/>
+        <w:tblBorders>
+          <w:top w:val="single" w:sz="6" w:space="0" w:color="000000"/>
+          <w:left w:val="single" w:sz="6" w:space="0" w:color="000000"/>
+          <w:bottom w:val="single" w:sz="6" w:space="0" w:color="000000"/>
+          <w:right w:val="single" w:sz="6" w:space="0" w:color="000000"/>
+          <w:insideH w:val="single" w:sz="6" w:space="0" w:color="000000"/>
+          <w:insideV w:val="single" w:sz="6" w:space="0" w:color="000000"/>
+        </w:tblBorders>
+      </w:tblPr>
+      <w:tblGrid>
+        <w:gridCol w:w="5200"/>
+        <w:gridCol w:w="4000"/>
+      </w:tblGrid>
+      <w:tr>
+        <w:tc>
+          <w:tcPr>
+            <w:tcW w:w="5200" w:type="dxa"/>
+            <w:vAlign w:val="center"/>
+          </w:tcPr>
+          <w:p>
+            <w:pPr>
+              <w:spacing w:after="20"/>
+              <w:jc w:val="center"/>
+            </w:pPr>
+            <w:r>
+              <w:rPr>
+                <w:b/>
+                <w:sz w:val="22"/>
+                <w:szCs w:val="22"/>
+              </w:rPr>
+              <w:t xml:space="preserve">Ko'rsatkich</w:t>
+            </w:r>
+          </w:p>
+        </w:tc>
+        <w:tc>
+          <w:tcPr>
+            <w:tcW w:w="4000" w:type="dxa"/>
+            <w:vAlign w:val="center"/>
+          </w:tcPr>
+          <w:p>
+            <w:pPr>
+              <w:spacing w:after="20"/>
+              <w:jc w:val="center"/>
+            </w:pPr>
+            <w:r>
+              <w:rPr>
+                <w:b/>
+                <w:sz w:val="22"/>
+                <w:szCs w:val="22"/>
+              </w:rPr>
+              <w:t xml:space="preserve">Qiymati / birligi</w:t>
+            </w:r>
+          </w:p>
+        </w:tc>
+      </w:tr>
+      <w:tr>
+        <w:tc>
+          <w:tcPr>
+            <w:tcW w:w="5200" w:type="dxa"/>
+            <w:vAlign w:val="center"/>
+          </w:tcPr>
+          <w:p>
+            <w:pPr>
+              <w:spacing w:after="20"/>
+              <w:jc w:val="left"/>
+            </w:pPr>
+            <w:r>
+              <w:rPr>
+                <w:sz w:val="22"/>
+                <w:szCs w:val="22"/>
+              </w:rPr>
+              <w:t xml:space="preserve">Tormoz magistrali nominal bosimi</w:t>
+            </w:r>
+          </w:p>
+        </w:tc>
+        <w:tc>
+          <w:tcPr>
+            <w:tcW w:w="4000" w:type="dxa"/>
+            <w:vAlign w:val="center"/>
+          </w:tcPr>
+          <w:p>
+            <w:pPr>
+              <w:spacing w:after="20"/>
+              <w:jc w:val="center"/>
+            </w:pPr>
+            <w:r>
+              <w:rPr>
+                <w:sz w:val="22"/>
+                <w:szCs w:val="22"/>
+              </w:rPr>
+              <w:t xml:space="preserve">0,50–0,54 MPa</w:t>
+            </w:r>
+          </w:p>
+        </w:tc>
+      </w:tr>
+      <w:tr>
+        <w:tc>
+          <w:tcPr>
+            <w:tcW w:w="5200" w:type="dxa"/>
+            <w:vAlign w:val="center"/>
+          </w:tcPr>
+          <w:p>
+            <w:pPr>
+              <w:spacing w:after="20"/>
+              <w:jc w:val="left"/>
+            </w:pPr>
+            <w:r>
+              <w:rPr>
+                <w:sz w:val="22"/>
+                <w:szCs w:val="22"/>
+              </w:rPr>
+              <w:t xml:space="preserve">Tormoz silindridagi maksimal bosim</w:t>
+            </w:r>
+          </w:p>
+        </w:tc>
+        <w:tc>
+          <w:tcPr>
+            <w:tcW w:w="4000" w:type="dxa"/>
+            <w:vAlign w:val="center"/>
+          </w:tcPr>
+          <w:p>
+            <w:pPr>
+              <w:spacing w:after="20"/>
+              <w:jc w:val="center"/>
+            </w:pPr>
+            <w:r>
+              <w:rPr>
+                <w:sz w:val="22"/>
+                <w:szCs w:val="22"/>
+              </w:rPr>
+              <w:t xml:space="preserve">0,38–0,43 MPa</w:t>
+            </w:r>
+          </w:p>
+        </w:tc>
+      </w:tr>
+      <w:tr>
+        <w:tc>
+          <w:tcPr>
+            <w:tcW w:w="5200" w:type="dxa"/>
+            <w:vAlign w:val="center"/>
+          </w:tcPr>
+          <w:p>
+            <w:pPr>
+              <w:spacing w:after="20"/>
+              <w:jc w:val="left"/>
+            </w:pPr>
+            <w:r>
+              <w:rPr>
+                <w:sz w:val="22"/>
+                <w:szCs w:val="22"/>
+              </w:rPr>
+              <w:t xml:space="preserve">Ishga tushish (sezgirlik) bosim farqi</w:t>
+            </w:r>
+          </w:p>
+        </w:tc>
+        <w:tc>
+          <w:tcPr>
+            <w:tcW w:w="4000" w:type="dxa"/>
+            <w:vAlign w:val="center"/>
+          </w:tcPr>
+          <w:p>
+            <w:pPr>
+              <w:spacing w:after="20"/>
+              <w:jc w:val="center"/>
+            </w:pPr>
+            <w:r>
+              <w:rPr>
+                <w:sz w:val="22"/>
+                <w:szCs w:val="22"/>
+              </w:rPr>
+              <w:t xml:space="preserve">0,03–0,05 MPa</w:t>
+            </w:r>
+          </w:p>
+        </w:tc>
+      </w:tr>
+      <w:tr>
+        <w:tc>
+          <w:tcPr>
+            <w:tcW w:w="5200" w:type="dxa"/>
+            <w:vAlign w:val="center"/>
+          </w:tcPr>
+          <w:p>
+            <w:pPr>
+              <w:spacing w:after="20"/>
+              <w:jc w:val="left"/>
+            </w:pPr>
+            <w:r>
+              <w:rPr>
+                <w:sz w:val="22"/>
+                <w:szCs w:val="22"/>
+              </w:rPr>
+              <w:t xml:space="preserve">Ish harorati oralig'i</w:t>
+            </w:r>
+          </w:p>
+        </w:tc>
+        <w:tc>
+          <w:tcPr>
+            <w:tcW w:w="4000" w:type="dxa"/>
+            <w:vAlign w:val="center"/>
+          </w:tcPr>
+          <w:p>
+            <w:pPr>
+              <w:spacing w:after="20"/>
+              <w:jc w:val="center"/>
+            </w:pPr>
+            <w:r>
+              <w:rPr>
+                <w:sz w:val="22"/>
+                <w:szCs w:val="22"/>
+              </w:rPr>
+              <w:t xml:space="preserve">‒50 … +60 °C</w:t>
+            </w:r>
+          </w:p>
+        </w:tc>
+      </w:tr>
+      <w:tr>
+        <w:tc>
+          <w:tcPr>
+            <w:tcW w:w="5200" w:type="dxa"/>
+            <w:vAlign w:val="center"/>
+          </w:tcPr>
+          <w:p>
+            <w:pPr>
+              <w:spacing w:after="20"/>
+              <w:jc w:val="left"/>
+            </w:pPr>
+            <w:r>
+              <w:rPr>
+                <w:sz w:val="22"/>
+                <w:szCs w:val="22"/>
+              </w:rPr>
+              <w:t xml:space="preserve">Germetiklik (bosim pasayishi)</w:t>
+            </w:r>
+          </w:p>
+        </w:tc>
+        <w:tc>
+          <w:tcPr>
+            <w:tcW w:w="4000" w:type="dxa"/>
+            <w:vAlign w:val="center"/>
+          </w:tcPr>
+          <w:p>
+            <w:pPr>
+              <w:spacing w:after="20"/>
+              <w:jc w:val="center"/>
+            </w:pPr>
+            <w:r>
+              <w:rPr>
+                <w:sz w:val="22"/>
+                <w:szCs w:val="22"/>
+              </w:rPr>
+              <w:t xml:space="preserve">ruxsat etilgan me'yorda</w:t>
+            </w:r>
+          </w:p>
+        </w:tc>
+      </w:tr>
+      <w:tr>
+        <w:tc>
+          <w:tcPr>
+            <w:tcW w:w="5200" w:type="dxa"/>
+            <w:vAlign w:val="center"/>
+          </w:tcPr>
+          <w:p>
+            <w:pPr>
+              <w:spacing w:after="20"/>
+              <w:jc w:val="left"/>
+            </w:pPr>
+            <w:r>
+              <w:rPr>
+                <w:sz w:val="22"/>
+                <w:szCs w:val="22"/>
+              </w:rPr>
+              <w:t xml:space="preserve">Ish muhiti</w:t>
+            </w:r>
+          </w:p>
+        </w:tc>
+        <w:tc>
+          <w:tcPr>
+            <w:tcW w:w="4000" w:type="dxa"/>
+            <w:vAlign w:val="center"/>
+          </w:tcPr>
+          <w:p>
+            <w:pPr>
+              <w:spacing w:after="20"/>
+              <w:jc w:val="center"/>
+            </w:pPr>
+            <w:r>
+              <w:rPr>
+                <w:sz w:val="22"/>
+                <w:szCs w:val="22"/>
+              </w:rPr>
+              <w:t xml:space="preserve">siqilgan tozalangan havo</w:t>
+            </w:r>
+          </w:p>
+        </w:tc>
+      </w:tr>
+    </w:tbl>
+    <w:p/>
     <w:p>
       <w:pPr>
         <w:spacing w:after="120" w:line="360" w:lineRule="auto"/>
@@ -1888,6 +2231,681 @@
           <w:szCs w:val="24"/>
         </w:rPr>
         <w:t xml:space="preserve">Detallar o'rtasidagi o'lchamiy bog'lanishlar va o'tqazishlar (posadkalar) blokning to'g'ri ishlashi uchun katta ahamiyatga ega. Klapan va o'rindiq orasidagi tegishish zichligi, diafragmaning erkin yurishi, porshen va silindr orasidagi tirqish belgilangan dopuskalar doirasida bo'lishi shart. Bu o'lchamlarning buzilishi blokning sezgirligini pasaytiradi va germetiklikni yo'qotadi.</w:t>
+      </w:r>
+    </w:p>
+    <w:p>
+      <w:pPr>
+        <w:spacing w:after="120" w:line="360" w:lineRule="auto"/>
+        <w:ind w:firstLine="709"/>
+        <w:jc w:val="both"/>
+      </w:pPr>
+      <w:r>
+        <w:rPr>
+          <w:sz w:val="24"/>
+          <w:szCs w:val="24"/>
+        </w:rPr>
+        <w:t xml:space="preserve">072-blok (БТО-072) tarkibiga, asos-plitadan tashqari, bir qator tormoz apparatlari kiradi. Ularning vazifasi 1.2-jadvalda keltirilgan. Bu apparatlar plitadagi ichki havo kanallari orqali o'zaro bog'langan va yagona pnevmatik tizimni tashkil etadi.</w:t>
+      </w:r>
+    </w:p>
+    <w:tbl>
+      <w:tblPr>
+        <w:tblW w:w="0" w:type="auto"/>
+        <w:jc w:val="center"/>
+        <w:tblBorders>
+          <w:top w:val="single" w:sz="6" w:space="0" w:color="000000"/>
+          <w:left w:val="single" w:sz="6" w:space="0" w:color="000000"/>
+          <w:bottom w:val="single" w:sz="6" w:space="0" w:color="000000"/>
+          <w:right w:val="single" w:sz="6" w:space="0" w:color="000000"/>
+          <w:insideH w:val="single" w:sz="6" w:space="0" w:color="000000"/>
+          <w:insideV w:val="single" w:sz="6" w:space="0" w:color="000000"/>
+        </w:tblBorders>
+      </w:tblPr>
+      <w:tblGrid>
+        <w:gridCol w:w="5000"/>
+        <w:gridCol w:w="4400"/>
+      </w:tblGrid>
+      <w:tr>
+        <w:tc>
+          <w:tcPr>
+            <w:tcW w:w="5000" w:type="dxa"/>
+            <w:vAlign w:val="center"/>
+          </w:tcPr>
+          <w:p>
+            <w:pPr>
+              <w:spacing w:after="20"/>
+              <w:jc w:val="center"/>
+            </w:pPr>
+            <w:r>
+              <w:rPr>
+                <w:b/>
+                <w:sz w:val="22"/>
+                <w:szCs w:val="22"/>
+              </w:rPr>
+              <w:t xml:space="preserve">Tarkibiy qism (apparat)</w:t>
+            </w:r>
+          </w:p>
+        </w:tc>
+        <w:tc>
+          <w:tcPr>
+            <w:tcW w:w="4400" w:type="dxa"/>
+            <w:vAlign w:val="center"/>
+          </w:tcPr>
+          <w:p>
+            <w:pPr>
+              <w:spacing w:after="20"/>
+              <w:jc w:val="center"/>
+            </w:pPr>
+            <w:r>
+              <w:rPr>
+                <w:b/>
+                <w:sz w:val="22"/>
+                <w:szCs w:val="22"/>
+              </w:rPr>
+              <w:t xml:space="preserve">Vazifasi</w:t>
+            </w:r>
+          </w:p>
+        </w:tc>
+      </w:tr>
+      <w:tr>
+        <w:tc>
+          <w:tcPr>
+            <w:tcW w:w="5000" w:type="dxa"/>
+            <w:vAlign w:val="center"/>
+          </w:tcPr>
+          <w:p>
+            <w:pPr>
+              <w:spacing w:after="20"/>
+              <w:jc w:val="left"/>
+            </w:pPr>
+            <w:r>
+              <w:rPr>
+                <w:sz w:val="22"/>
+                <w:szCs w:val="22"/>
+              </w:rPr>
+              <w:t xml:space="preserve">Asos-plita (plita-osnova)</w:t>
+            </w:r>
+          </w:p>
+        </w:tc>
+        <w:tc>
+          <w:tcPr>
+            <w:tcW w:w="4400" w:type="dxa"/>
+            <w:vAlign w:val="center"/>
+          </w:tcPr>
+          <w:p>
+            <w:pPr>
+              <w:spacing w:after="20"/>
+              <w:jc w:val="center"/>
+            </w:pPr>
+            <w:r>
+              <w:rPr>
+                <w:sz w:val="22"/>
+                <w:szCs w:val="22"/>
+              </w:rPr>
+              <w:t xml:space="preserve">Apparatlarni o'rnatish va havo kanallari</w:t>
+            </w:r>
+          </w:p>
+        </w:tc>
+      </w:tr>
+      <w:tr>
+        <w:tc>
+          <w:tcPr>
+            <w:tcW w:w="5000" w:type="dxa"/>
+            <w:vAlign w:val="center"/>
+          </w:tcPr>
+          <w:p>
+            <w:pPr>
+              <w:spacing w:after="20"/>
+              <w:jc w:val="left"/>
+            </w:pPr>
+            <w:r>
+              <w:rPr>
+                <w:sz w:val="22"/>
+                <w:szCs w:val="22"/>
+              </w:rPr>
+              <w:t xml:space="preserve">Havo taqsimlagich (vozduhoraspredelitel)</w:t>
+            </w:r>
+          </w:p>
+        </w:tc>
+        <w:tc>
+          <w:tcPr>
+            <w:tcW w:w="4400" w:type="dxa"/>
+            <w:vAlign w:val="center"/>
+          </w:tcPr>
+          <w:p>
+            <w:pPr>
+              <w:spacing w:after="20"/>
+              <w:jc w:val="center"/>
+            </w:pPr>
+            <w:r>
+              <w:rPr>
+                <w:sz w:val="22"/>
+                <w:szCs w:val="22"/>
+              </w:rPr>
+              <w:t xml:space="preserve">Tormozlash/bo'shatishni boshqarish</w:t>
+            </w:r>
+          </w:p>
+        </w:tc>
+      </w:tr>
+      <w:tr>
+        <w:tc>
+          <w:tcPr>
+            <w:tcW w:w="5000" w:type="dxa"/>
+            <w:vAlign w:val="center"/>
+          </w:tcPr>
+          <w:p>
+            <w:pPr>
+              <w:spacing w:after="20"/>
+              <w:jc w:val="left"/>
+            </w:pPr>
+            <w:r>
+              <w:rPr>
+                <w:sz w:val="22"/>
+                <w:szCs w:val="22"/>
+              </w:rPr>
+              <w:t xml:space="preserve">Bosim relesi (rele davleniya)</w:t>
+            </w:r>
+          </w:p>
+        </w:tc>
+        <w:tc>
+          <w:tcPr>
+            <w:tcW w:w="4400" w:type="dxa"/>
+            <w:vAlign w:val="center"/>
+          </w:tcPr>
+          <w:p>
+            <w:pPr>
+              <w:spacing w:after="20"/>
+              <w:jc w:val="center"/>
+            </w:pPr>
+            <w:r>
+              <w:rPr>
+                <w:sz w:val="22"/>
+                <w:szCs w:val="22"/>
+              </w:rPr>
+              <w:t xml:space="preserve">Silindr bosimini kuchaytirib taqsimlash</w:t>
+            </w:r>
+          </w:p>
+        </w:tc>
+      </w:tr>
+      <w:tr>
+        <w:tc>
+          <w:tcPr>
+            <w:tcW w:w="5000" w:type="dxa"/>
+            <w:vAlign w:val="center"/>
+          </w:tcPr>
+          <w:p>
+            <w:pPr>
+              <w:spacing w:after="20"/>
+              <w:jc w:val="left"/>
+            </w:pPr>
+            <w:r>
+              <w:rPr>
+                <w:sz w:val="22"/>
+                <w:szCs w:val="22"/>
+              </w:rPr>
+              <w:t xml:space="preserve">O'tkazgich klapan (pereklyuchatelnyy)</w:t>
+            </w:r>
+          </w:p>
+        </w:tc>
+        <w:tc>
+          <w:tcPr>
+            <w:tcW w:w="4400" w:type="dxa"/>
+            <w:vAlign w:val="center"/>
+          </w:tcPr>
+          <w:p>
+            <w:pPr>
+              <w:spacing w:after="20"/>
+              <w:jc w:val="center"/>
+            </w:pPr>
+            <w:r>
+              <w:rPr>
+                <w:sz w:val="22"/>
+                <w:szCs w:val="22"/>
+              </w:rPr>
+              <w:t xml:space="preserve">Boshqaruv manbalarini almashtirish</w:t>
+            </w:r>
+          </w:p>
+        </w:tc>
+      </w:tr>
+      <w:tr>
+        <w:tc>
+          <w:tcPr>
+            <w:tcW w:w="5000" w:type="dxa"/>
+            <w:vAlign w:val="center"/>
+          </w:tcPr>
+          <w:p>
+            <w:pPr>
+              <w:spacing w:after="20"/>
+              <w:jc w:val="left"/>
+            </w:pPr>
+            <w:r>
+              <w:rPr>
+                <w:sz w:val="22"/>
+                <w:szCs w:val="22"/>
+              </w:rPr>
+              <w:t xml:space="preserve">Bo'shatish klapani (vypusknoy)</w:t>
+            </w:r>
+          </w:p>
+        </w:tc>
+        <w:tc>
+          <w:tcPr>
+            <w:tcW w:w="4400" w:type="dxa"/>
+            <w:vAlign w:val="center"/>
+          </w:tcPr>
+          <w:p>
+            <w:pPr>
+              <w:spacing w:after="20"/>
+              <w:jc w:val="center"/>
+            </w:pPr>
+            <w:r>
+              <w:rPr>
+                <w:sz w:val="22"/>
+                <w:szCs w:val="22"/>
+              </w:rPr>
+              <w:t xml:space="preserve">Tormozni qo'lda bo'shatish</w:t>
+            </w:r>
+          </w:p>
+        </w:tc>
+      </w:tr>
+      <w:tr>
+        <w:tc>
+          <w:tcPr>
+            <w:tcW w:w="5000" w:type="dxa"/>
+            <w:vAlign w:val="center"/>
+          </w:tcPr>
+          <w:p>
+            <w:pPr>
+              <w:spacing w:after="20"/>
+              <w:jc w:val="left"/>
+            </w:pPr>
+            <w:r>
+              <w:rPr>
+                <w:sz w:val="22"/>
+                <w:szCs w:val="22"/>
+              </w:rPr>
+              <w:t xml:space="preserve">Qaytmas klapan (obratnyy)</w:t>
+            </w:r>
+          </w:p>
+        </w:tc>
+        <w:tc>
+          <w:tcPr>
+            <w:tcW w:w="4400" w:type="dxa"/>
+            <w:vAlign w:val="center"/>
+          </w:tcPr>
+          <w:p>
+            <w:pPr>
+              <w:spacing w:after="20"/>
+              <w:jc w:val="center"/>
+            </w:pPr>
+            <w:r>
+              <w:rPr>
+                <w:sz w:val="22"/>
+                <w:szCs w:val="22"/>
+              </w:rPr>
+              <w:t xml:space="preserve">Havoning teskari oqimini to'sish</w:t>
+            </w:r>
+          </w:p>
+        </w:tc>
+      </w:tr>
+      <w:tr>
+        <w:tc>
+          <w:tcPr>
+            <w:tcW w:w="5000" w:type="dxa"/>
+            <w:vAlign w:val="center"/>
+          </w:tcPr>
+          <w:p>
+            <w:pPr>
+              <w:spacing w:after="20"/>
+              <w:jc w:val="left"/>
+            </w:pPr>
+            <w:r>
+              <w:rPr>
+                <w:sz w:val="22"/>
+                <w:szCs w:val="22"/>
+              </w:rPr>
+              <w:t xml:space="preserve">Ajratuvchi kranlar (razobshchitelnye)</w:t>
+            </w:r>
+          </w:p>
+        </w:tc>
+        <w:tc>
+          <w:tcPr>
+            <w:tcW w:w="4400" w:type="dxa"/>
+            <w:vAlign w:val="center"/>
+          </w:tcPr>
+          <w:p>
+            <w:pPr>
+              <w:spacing w:after="20"/>
+              <w:jc w:val="center"/>
+            </w:pPr>
+            <w:r>
+              <w:rPr>
+                <w:sz w:val="22"/>
+                <w:szCs w:val="22"/>
+              </w:rPr>
+              <w:t xml:space="preserve">Liniyalarni ulash/uzish</w:t>
+            </w:r>
+          </w:p>
+        </w:tc>
+      </w:tr>
+      <w:tr>
+        <w:tc>
+          <w:tcPr>
+            <w:tcW w:w="5000" w:type="dxa"/>
+            <w:vAlign w:val="center"/>
+          </w:tcPr>
+          <w:p>
+            <w:pPr>
+              <w:spacing w:after="20"/>
+              <w:jc w:val="left"/>
+            </w:pPr>
+            <w:r>
+              <w:rPr>
+                <w:sz w:val="22"/>
+                <w:szCs w:val="22"/>
+              </w:rPr>
+              <w:t xml:space="preserve">Filtr</w:t>
+            </w:r>
+          </w:p>
+        </w:tc>
+        <w:tc>
+          <w:tcPr>
+            <w:tcW w:w="4400" w:type="dxa"/>
+            <w:vAlign w:val="center"/>
+          </w:tcPr>
+          <w:p>
+            <w:pPr>
+              <w:spacing w:after="20"/>
+              <w:jc w:val="center"/>
+            </w:pPr>
+            <w:r>
+              <w:rPr>
+                <w:sz w:val="22"/>
+                <w:szCs w:val="22"/>
+              </w:rPr>
+              <w:t xml:space="preserve">Havoni mexanik aralashmalardan tozalash</w:t>
+            </w:r>
+          </w:p>
+        </w:tc>
+      </w:tr>
+    </w:tbl>
+    <w:p/>
+    <w:p>
+      <w:pPr>
+        <w:spacing w:after="120" w:line="360" w:lineRule="auto"/>
+        <w:ind w:firstLine="709"/>
+        <w:jc w:val="both"/>
+      </w:pPr>
+      <w:r>
+        <w:rPr>
+          <w:sz w:val="24"/>
+          <w:szCs w:val="24"/>
+        </w:rPr>
+        <w:t xml:space="preserve">Blok elementlarining pnevmatik bog'lanish (ulanish) sxemasi 1.1-rasmda soddalashtirilgan ko'rinishda keltirilgan. Havo tormoz magistralidan ajratuvchi kran va filtr orqali havo taqsimlagichga keladi; taqsimlagich bosim relesi orqali tormoz silindriga uzatiladigan bosimni boshqaradi; zaxira rezervuar esa havo zaxirasini ta'minlaydi.</w:t>
+      </w:r>
+    </w:p>
+    <w:tbl>
+      <w:tblPr>
+        <w:tblW w:w="7600" w:type="dxa"/>
+        <w:jc w:val="center"/>
+        <w:tblBorders>
+          <w:top w:val="single" w:sz="6" w:space="0" w:color="000000"/>
+          <w:left w:val="single" w:sz="6" w:space="0" w:color="000000"/>
+          <w:bottom w:val="single" w:sz="6" w:space="0" w:color="000000"/>
+          <w:right w:val="single" w:sz="6" w:space="0" w:color="000000"/>
+          <w:insideH w:val="single" w:sz="6" w:space="0" w:color="000000"/>
+          <w:insideV w:val="single" w:sz="6" w:space="0" w:color="000000"/>
+        </w:tblBorders>
+      </w:tblPr>
+      <w:tblGrid>
+        <w:gridCol w:w="7600"/>
+      </w:tblGrid>
+      <w:tr>
+        <w:tc>
+          <w:tcPr>
+            <w:tcW w:w="7600" w:type="dxa"/>
+            <w:vAlign w:val="center"/>
+          </w:tcPr>
+          <w:p>
+            <w:pPr>
+              <w:jc w:val="center"/>
+              <w:spacing w:after="0"/>
+            </w:pPr>
+            <w:r>
+              <w:rPr>
+                <w:b/>
+                <w:sz w:val="22"/>
+                <w:szCs w:val="22"/>
+              </w:rPr>
+              <w:t xml:space="preserve">Tormoz magistrali (TM)</w:t>
+            </w:r>
+          </w:p>
+        </w:tc>
+      </w:tr>
+    </w:tbl>
+    <w:p>
+      <w:pPr>
+        <w:jc w:val="center"/>
+        <w:spacing w:before="20" w:after="20"/>
+      </w:pPr>
+      <w:r>
+        <w:rPr>
+          <w:b/>
+          <w:sz w:val="30"/>
+          <w:szCs w:val="30"/>
+        </w:rPr>
+        <w:t xml:space="preserve">↓</w:t>
+      </w:r>
+    </w:p>
+    <w:tbl>
+      <w:tblPr>
+        <w:tblW w:w="7600" w:type="dxa"/>
+        <w:jc w:val="center"/>
+        <w:tblBorders>
+          <w:top w:val="single" w:sz="6" w:space="0" w:color="000000"/>
+          <w:left w:val="single" w:sz="6" w:space="0" w:color="000000"/>
+          <w:bottom w:val="single" w:sz="6" w:space="0" w:color="000000"/>
+          <w:right w:val="single" w:sz="6" w:space="0" w:color="000000"/>
+          <w:insideH w:val="single" w:sz="6" w:space="0" w:color="000000"/>
+          <w:insideV w:val="single" w:sz="6" w:space="0" w:color="000000"/>
+        </w:tblBorders>
+      </w:tblPr>
+      <w:tblGrid>
+        <w:gridCol w:w="7600"/>
+      </w:tblGrid>
+      <w:tr>
+        <w:tc>
+          <w:tcPr>
+            <w:tcW w:w="7600" w:type="dxa"/>
+            <w:vAlign w:val="center"/>
+          </w:tcPr>
+          <w:p>
+            <w:pPr>
+              <w:jc w:val="center"/>
+              <w:spacing w:after="0"/>
+            </w:pPr>
+            <w:r>
+              <w:rPr>
+                <w:b/>
+                <w:sz w:val="22"/>
+                <w:szCs w:val="22"/>
+              </w:rPr>
+              <w:t xml:space="preserve">Ajratuvchi kran + filtr</w:t>
+            </w:r>
+          </w:p>
+        </w:tc>
+      </w:tr>
+    </w:tbl>
+    <w:p>
+      <w:pPr>
+        <w:jc w:val="center"/>
+        <w:spacing w:before="20" w:after="20"/>
+      </w:pPr>
+      <w:r>
+        <w:rPr>
+          <w:b/>
+          <w:sz w:val="30"/>
+          <w:szCs w:val="30"/>
+        </w:rPr>
+        <w:t xml:space="preserve">↓</w:t>
+      </w:r>
+    </w:p>
+    <w:tbl>
+      <w:tblPr>
+        <w:tblW w:w="7600" w:type="dxa"/>
+        <w:jc w:val="center"/>
+        <w:tblBorders>
+          <w:top w:val="single" w:sz="6" w:space="0" w:color="000000"/>
+          <w:left w:val="single" w:sz="6" w:space="0" w:color="000000"/>
+          <w:bottom w:val="single" w:sz="6" w:space="0" w:color="000000"/>
+          <w:right w:val="single" w:sz="6" w:space="0" w:color="000000"/>
+          <w:insideH w:val="single" w:sz="6" w:space="0" w:color="000000"/>
+          <w:insideV w:val="single" w:sz="6" w:space="0" w:color="000000"/>
+        </w:tblBorders>
+      </w:tblPr>
+      <w:tblGrid>
+        <w:gridCol w:w="7600"/>
+      </w:tblGrid>
+      <w:tr>
+        <w:tc>
+          <w:tcPr>
+            <w:tcW w:w="7600" w:type="dxa"/>
+            <w:vAlign w:val="center"/>
+          </w:tcPr>
+          <w:p>
+            <w:pPr>
+              <w:jc w:val="center"/>
+              <w:spacing w:after="0"/>
+            </w:pPr>
+            <w:r>
+              <w:rPr>
+                <w:b/>
+                <w:sz w:val="22"/>
+                <w:szCs w:val="22"/>
+              </w:rPr>
+              <w:t xml:space="preserve">Havo taqsimlagich (vozduhoraspredelitel)</w:t>
+            </w:r>
+          </w:p>
+        </w:tc>
+      </w:tr>
+    </w:tbl>
+    <w:p>
+      <w:pPr>
+        <w:jc w:val="center"/>
+        <w:spacing w:before="20" w:after="20"/>
+      </w:pPr>
+      <w:r>
+        <w:rPr>
+          <w:b/>
+          <w:sz w:val="30"/>
+          <w:szCs w:val="30"/>
+        </w:rPr>
+        <w:t xml:space="preserve">↓</w:t>
+      </w:r>
+    </w:p>
+    <w:tbl>
+      <w:tblPr>
+        <w:tblW w:w="7600" w:type="dxa"/>
+        <w:jc w:val="center"/>
+        <w:tblBorders>
+          <w:top w:val="single" w:sz="6" w:space="0" w:color="000000"/>
+          <w:left w:val="single" w:sz="6" w:space="0" w:color="000000"/>
+          <w:bottom w:val="single" w:sz="6" w:space="0" w:color="000000"/>
+          <w:right w:val="single" w:sz="6" w:space="0" w:color="000000"/>
+          <w:insideH w:val="single" w:sz="6" w:space="0" w:color="000000"/>
+          <w:insideV w:val="single" w:sz="6" w:space="0" w:color="000000"/>
+        </w:tblBorders>
+      </w:tblPr>
+      <w:tblGrid>
+        <w:gridCol w:w="7600"/>
+      </w:tblGrid>
+      <w:tr>
+        <w:tc>
+          <w:tcPr>
+            <w:tcW w:w="7600" w:type="dxa"/>
+            <w:vAlign w:val="center"/>
+          </w:tcPr>
+          <w:p>
+            <w:pPr>
+              <w:jc w:val="center"/>
+              <w:spacing w:after="0"/>
+            </w:pPr>
+            <w:r>
+              <w:rPr>
+                <w:b/>
+                <w:sz w:val="22"/>
+                <w:szCs w:val="22"/>
+              </w:rPr>
+              <w:t xml:space="preserve">Bosim relesi (rele davleniya) ← zaxira rezervuar</w:t>
+            </w:r>
+          </w:p>
+        </w:tc>
+      </w:tr>
+    </w:tbl>
+    <w:p>
+      <w:pPr>
+        <w:jc w:val="center"/>
+        <w:spacing w:before="20" w:after="20"/>
+      </w:pPr>
+      <w:r>
+        <w:rPr>
+          <w:b/>
+          <w:sz w:val="30"/>
+          <w:szCs w:val="30"/>
+        </w:rPr>
+        <w:t xml:space="preserve">↓</w:t>
+      </w:r>
+    </w:p>
+    <w:tbl>
+      <w:tblPr>
+        <w:tblW w:w="7600" w:type="dxa"/>
+        <w:jc w:val="center"/>
+        <w:tblBorders>
+          <w:top w:val="single" w:sz="6" w:space="0" w:color="000000"/>
+          <w:left w:val="single" w:sz="6" w:space="0" w:color="000000"/>
+          <w:bottom w:val="single" w:sz="6" w:space="0" w:color="000000"/>
+          <w:right w:val="single" w:sz="6" w:space="0" w:color="000000"/>
+          <w:insideH w:val="single" w:sz="6" w:space="0" w:color="000000"/>
+          <w:insideV w:val="single" w:sz="6" w:space="0" w:color="000000"/>
+        </w:tblBorders>
+      </w:tblPr>
+      <w:tblGrid>
+        <w:gridCol w:w="7600"/>
+      </w:tblGrid>
+      <w:tr>
+        <w:tc>
+          <w:tcPr>
+            <w:tcW w:w="7600" w:type="dxa"/>
+            <w:vAlign w:val="center"/>
+          </w:tcPr>
+          <w:p>
+            <w:pPr>
+              <w:jc w:val="center"/>
+              <w:spacing w:after="0"/>
+            </w:pPr>
+            <w:r>
+              <w:rPr>
+                <w:b/>
+                <w:sz w:val="22"/>
+                <w:szCs w:val="22"/>
+              </w:rPr>
+              <w:t xml:space="preserve">Tormoz silindri (TS)</w:t>
+            </w:r>
+          </w:p>
+        </w:tc>
+      </w:tr>
+    </w:tbl>
+    <w:p/>
+    <w:p>
+      <w:pPr>
+        <w:jc w:val="center"/>
+        <w:spacing w:before="40" w:after="200"/>
+      </w:pPr>
+      <w:r>
+        <w:rPr>
+          <w:i/>
+          <w:sz w:val="22"/>
+          <w:szCs w:val="22"/>
+        </w:rPr>
+        <w:t xml:space="preserve">1.1-rasm. 072-blok (БТО-072) elementlarining pnevmatik ulanish sxemasi</w:t>
       </w:r>
     </w:p>
     <w:p>

</xml_diff>

<commit_message>
Add Chapters IV-VI, conclusion, references and appendices (full thesis)
</commit_message>
<xml_diff>
--- a/Diplom_ishi.docx
+++ b/Diplom_ishi.docx
@@ -18267,6 +18267,2532 @@
         <w:t xml:space="preserve">Uchinchi bob bo'yicha xulosa qilib aytganda, texnologik jarayonning vaqt me'yorlari va asosiy parametrlari hisoblandi, mahkamlovchi maxsus moslama loyihalanib mustahkamlikка tekshirildi hamda sinov stendining prinsipial sxemasi ishlab chiqildi. Olingan natijalar texnologik jarayonni konstruktorlik jihatdan asoslaydi va uni amaliyotга joriy etish imkonini beradi.</w:t>
       </w:r>
     </w:p>
+    <w:p>
+      <w:r>
+        <w:br w:type="page"/>
+      </w:r>
+    </w:p>
+    <w:p>
+      <w:pPr>
+        <w:jc w:val="center"/>
+        <w:spacing w:before="0" w:after="220"/>
+      </w:pPr>
+      <w:r>
+        <w:rPr>
+          <w:b/>
+          <w:sz w:val="26"/>
+          <w:szCs w:val="26"/>
+        </w:rPr>
+        <w:t xml:space="preserve">IV BOB. MEHNAT MUHOFAZASI VA XAVFSIZLIK TEXNIKASI</w:t>
+      </w:r>
+    </w:p>
+    <w:p>
+      <w:pPr>
+        <w:spacing w:before="240" w:after="120"/>
+        <w:keepNext/>
+      </w:pPr>
+      <w:r>
+        <w:rPr>
+          <w:b/>
+          <w:sz w:val="26"/>
+          <w:szCs w:val="26"/>
+        </w:rPr>
+        <w:t xml:space="preserve">4.1. Ta'mirlash uchastkasida xavfsizlik texnikasi</w:t>
+      </w:r>
+    </w:p>
+    <w:p>
+      <w:pPr>
+        <w:spacing w:after="120" w:line="360" w:lineRule="auto"/>
+        <w:ind w:firstLine="709"/>
+        <w:jc w:val="both"/>
+      </w:pPr>
+      <w:r>
+        <w:rPr>
+          <w:sz w:val="24"/>
+          <w:szCs w:val="24"/>
+        </w:rPr>
+        <w:t xml:space="preserve">Mehnat muhofazasi – ishlovchilarning hayoti va sog'lig'ini saqlashga qaratilgan huquqiy, ijtimoiy-iqtisodiy, tashkiliy-texnik, sanitariya-gigiyena va davolash-profilaktika tadbirlari tizimidir. Tormoz uskunalari blokini ta'mirlash uchastkasida xavfsizlik texnikasi qoidalariga rioya qilish baxtsiz hodisalar va kasb kasalliklarining oldini olishning asosiy shartidir.</w:t>
+      </w:r>
+    </w:p>
+    <w:p>
+      <w:pPr>
+        <w:spacing w:after="120" w:line="360" w:lineRule="auto"/>
+        <w:ind w:firstLine="709"/>
+        <w:jc w:val="both"/>
+      </w:pPr>
+      <w:r>
+        <w:rPr>
+          <w:sz w:val="24"/>
+          <w:szCs w:val="24"/>
+        </w:rPr>
+        <w:t xml:space="preserve">Ta'mirlash jarayonida ishlovchilarga ta'sir etishi mumkin bo'lgan asosiy xavfli va zararli ishlab chiqarish omillari quyidagilar:</w:t>
+      </w:r>
+    </w:p>
+    <w:p>
+      <w:pPr>
+        <w:spacing w:after="60" w:line="312" w:lineRule="auto"/>
+        <w:ind w:left="709" w:hanging="284"/>
+        <w:jc w:val="both"/>
+      </w:pPr>
+      <w:r>
+        <w:rPr>
+          <w:sz w:val="24"/>
+          <w:szCs w:val="24"/>
+        </w:rPr>
+        <w:t xml:space="preserve">–  </w:t>
+      </w:r>
+      <w:r>
+        <w:rPr>
+          <w:sz w:val="24"/>
+          <w:szCs w:val="24"/>
+        </w:rPr>
+        <w:t xml:space="preserve">harakatlanuvchi mashina va mexanizmlar, aylanuvchi qismlar;</w:t>
+      </w:r>
+    </w:p>
+    <w:p>
+      <w:pPr>
+        <w:spacing w:after="60" w:line="312" w:lineRule="auto"/>
+        <w:ind w:left="709" w:hanging="284"/>
+        <w:jc w:val="both"/>
+      </w:pPr>
+      <w:r>
+        <w:rPr>
+          <w:sz w:val="24"/>
+          <w:szCs w:val="24"/>
+        </w:rPr>
+        <w:t xml:space="preserve">–  </w:t>
+      </w:r>
+      <w:r>
+        <w:rPr>
+          <w:sz w:val="24"/>
+          <w:szCs w:val="24"/>
+        </w:rPr>
+        <w:t xml:space="preserve">bosim ostidagi siqilgan havo va pnevmatik tizimlar;</w:t>
+      </w:r>
+    </w:p>
+    <w:p>
+      <w:pPr>
+        <w:spacing w:after="60" w:line="312" w:lineRule="auto"/>
+        <w:ind w:left="709" w:hanging="284"/>
+        <w:jc w:val="both"/>
+      </w:pPr>
+      <w:r>
+        <w:rPr>
+          <w:sz w:val="24"/>
+          <w:szCs w:val="24"/>
+        </w:rPr>
+        <w:t xml:space="preserve">–  </w:t>
+      </w:r>
+      <w:r>
+        <w:rPr>
+          <w:sz w:val="24"/>
+          <w:szCs w:val="24"/>
+        </w:rPr>
+        <w:t xml:space="preserve">elektr toki bilan shikastlanish xavfi;</w:t>
+      </w:r>
+    </w:p>
+    <w:p>
+      <w:pPr>
+        <w:spacing w:after="60" w:line="312" w:lineRule="auto"/>
+        <w:ind w:left="709" w:hanging="284"/>
+        <w:jc w:val="both"/>
+      </w:pPr>
+      <w:r>
+        <w:rPr>
+          <w:sz w:val="24"/>
+          <w:szCs w:val="24"/>
+        </w:rPr>
+        <w:t xml:space="preserve">–  </w:t>
+      </w:r>
+      <w:r>
+        <w:rPr>
+          <w:sz w:val="24"/>
+          <w:szCs w:val="24"/>
+        </w:rPr>
+        <w:t xml:space="preserve">zararli kimyoviy moddalar (yuvish eritmalari, bo'yoqlar);</w:t>
+      </w:r>
+    </w:p>
+    <w:p>
+      <w:pPr>
+        <w:spacing w:after="60" w:line="312" w:lineRule="auto"/>
+        <w:ind w:left="709" w:hanging="284"/>
+        <w:jc w:val="both"/>
+      </w:pPr>
+      <w:r>
+        <w:rPr>
+          <w:sz w:val="24"/>
+          <w:szCs w:val="24"/>
+        </w:rPr>
+        <w:t xml:space="preserve">–  </w:t>
+      </w:r>
+      <w:r>
+        <w:rPr>
+          <w:sz w:val="24"/>
+          <w:szCs w:val="24"/>
+        </w:rPr>
+        <w:t xml:space="preserve">changlanish, shovqin va tebranish;</w:t>
+      </w:r>
+    </w:p>
+    <w:p>
+      <w:pPr>
+        <w:spacing w:after="60" w:line="312" w:lineRule="auto"/>
+        <w:ind w:left="709" w:hanging="284"/>
+        <w:jc w:val="both"/>
+      </w:pPr>
+      <w:r>
+        <w:rPr>
+          <w:sz w:val="24"/>
+          <w:szCs w:val="24"/>
+        </w:rPr>
+        <w:t xml:space="preserve">–  </w:t>
+      </w:r>
+      <w:r>
+        <w:rPr>
+          <w:sz w:val="24"/>
+          <w:szCs w:val="24"/>
+        </w:rPr>
+        <w:t xml:space="preserve">og'ir yuklarni ko'tarish va tashishdagi jismoniy zo'riqish.</w:t>
+      </w:r>
+    </w:p>
+    <w:p>
+      <w:pPr>
+        <w:spacing w:after="120" w:line="360" w:lineRule="auto"/>
+        <w:ind w:firstLine="709"/>
+        <w:jc w:val="both"/>
+      </w:pPr>
+      <w:r>
+        <w:rPr>
+          <w:sz w:val="24"/>
+          <w:szCs w:val="24"/>
+        </w:rPr>
+        <w:t xml:space="preserve">Xavfsizlikни ta'minlash uchun quyidagi tashkiliy tadbirlar amalga oshiriladi: ishchilar bilan kirish, dastlabki va davriy yo'riqnomalar (instruktaj) o'tkaziladi; ish o'rinlari xavfsizlik belgilari bilan jihozlanadi; faqat tegishli malaka va ruxsatga ega ishchilarga ishlash huquqi beriladi. Texnik tadbirlar sifatida jihozlarning himoya to'siqlari, blokirovkalari va saqlovchi qurilmalari nazarda tutiladi.</w:t>
+      </w:r>
+    </w:p>
+    <w:p>
+      <w:pPr>
+        <w:spacing w:after="120" w:line="360" w:lineRule="auto"/>
+        <w:ind w:firstLine="709"/>
+        <w:jc w:val="both"/>
+      </w:pPr>
+      <w:r>
+        <w:rPr>
+          <w:sz w:val="24"/>
+          <w:szCs w:val="24"/>
+        </w:rPr>
+        <w:t xml:space="preserve">Bosim ostida ishlaydigan sinov stendi alohida e'tibor talab qiladi. Stend saqlovchi klapan va nazorat manometri bilan jihozlanadi, sinov vaqtida ishchi himoya ekrani orqasida turishi kerak. Pnevmatik tizimga xizmat ko'rsatishdan oldin undagi bosim to'liq chiqarilishi shart. Yuk ko'tarish moslamalari (kran-balka, taldan) belgilangan muddatlarда texnik ko'rikdan o'tkaziladi.</w:t>
+      </w:r>
+    </w:p>
+    <w:p>
+      <w:pPr>
+        <w:spacing w:after="120" w:line="360" w:lineRule="auto"/>
+        <w:ind w:firstLine="709"/>
+        <w:jc w:val="both"/>
+      </w:pPr>
+      <w:r>
+        <w:rPr>
+          <w:sz w:val="24"/>
+          <w:szCs w:val="24"/>
+        </w:rPr>
+        <w:t xml:space="preserve">Ishchilar shaxsiy himoya vositalari bilan ta'minlanadi: ish kiyimi, qo'lqop, himoya ko'zoynagi, zarur hollarda respirator. Asbob-uskunalar soz holatda saqlanadi, nosoz asbob bilan ishlash taqiqlanadi. Bu talablarga rioya qilish jarohatlanish xavfini sezilarli kamaytiradi.</w:t>
+      </w:r>
+    </w:p>
+    <w:p>
+      <w:pPr>
+        <w:spacing w:before="240" w:after="120"/>
+        <w:keepNext/>
+      </w:pPr>
+      <w:r>
+        <w:rPr>
+          <w:b/>
+          <w:sz w:val="26"/>
+          <w:szCs w:val="26"/>
+        </w:rPr>
+        <w:t xml:space="preserve">4.2. Yong'in xavfsizligi va elektr xavfsizligi</w:t>
+      </w:r>
+    </w:p>
+    <w:p>
+      <w:pPr>
+        <w:spacing w:after="120" w:line="360" w:lineRule="auto"/>
+        <w:ind w:firstLine="709"/>
+        <w:jc w:val="both"/>
+      </w:pPr>
+      <w:r>
+        <w:rPr>
+          <w:sz w:val="24"/>
+          <w:szCs w:val="24"/>
+        </w:rPr>
+        <w:t xml:space="preserve">Ta'mirlash uchastkasida yong'in xavfsizligi katta ahamiyatga ega, chunki yuvish eritmalari, moylar va bo'yoqlar yonuvchan moddalar hisoblanadi. Yong'in xavfsizligini ta'minlash uchun yonuvchan materiallar maxsus metall idishlarda, alohida ajratilgan joyda saqlanadi; ularning miqdori smenalik ehtiyojdan oshmasligi kerak.</w:t>
+      </w:r>
+    </w:p>
+    <w:p>
+      <w:pPr>
+        <w:spacing w:after="120" w:line="360" w:lineRule="auto"/>
+        <w:ind w:firstLine="709"/>
+        <w:jc w:val="both"/>
+      </w:pPr>
+      <w:r>
+        <w:rPr>
+          <w:sz w:val="24"/>
+          <w:szCs w:val="24"/>
+        </w:rPr>
+        <w:t xml:space="preserve">Uchastka birlamchi yong'inga qarshi vositalar (o't o'chirgichlar, qum, kigiz) bilan ta'minlanadi va yong'in signalizatsiyasi tizimiga ulanadi. Ishchilar yong'in xavfsizligi qoidalari va evakuatsiya tartibi bilan tanishtiriladi. Ochiq olov bilan ishlash (payvandlash) faqat belgilangan joyda va ehtiyot choralarini ko'rgan holda bajariladi.</w:t>
+      </w:r>
+    </w:p>
+    <w:p>
+      <w:pPr>
+        <w:spacing w:after="120" w:line="360" w:lineRule="auto"/>
+        <w:ind w:firstLine="709"/>
+        <w:jc w:val="both"/>
+      </w:pPr>
+      <w:r>
+        <w:rPr>
+          <w:sz w:val="24"/>
+          <w:szCs w:val="24"/>
+        </w:rPr>
+        <w:t xml:space="preserve">Elektr xavfsizligi elektr jihozlari bilan ishlashda shikastlanishning oldini olishga qaratiladi. Barcha elektr jihozlari ishonchli yerga ulanadi (zazemleniye), izolyatsiya holati davriy tekshiriladi. Tarmoq kuchlanishi xavfli bo'lgani uchun korpuslar himoya yerga ulash yoki nolga ulash bilan himoyalanadi, himoya o'chirish qurilmalari o'rnatiladi.</w:t>
+      </w:r>
+    </w:p>
+    <w:p>
+      <w:pPr>
+        <w:spacing w:after="120" w:line="360" w:lineRule="auto"/>
+        <w:ind w:firstLine="709"/>
+        <w:jc w:val="both"/>
+      </w:pPr>
+      <w:r>
+        <w:rPr>
+          <w:sz w:val="24"/>
+          <w:szCs w:val="24"/>
+        </w:rPr>
+        <w:t xml:space="preserve">Nam joylarda va metall idishlar ichida ishlashda past kuchlanishli (12–36 V) yoritish va asboblardan foydalaniladi. Elektr jihozlarini ta'mirlash faqat tarmoqdan uzilgan holda, tegishli malakali xodim tomonidan bajariladi. Bu qoidalar elektr tokidan shikastlanish xavfini bartaraf etadi.</w:t>
+      </w:r>
+    </w:p>
+    <w:p>
+      <w:pPr>
+        <w:spacing w:before="240" w:after="120"/>
+        <w:keepNext/>
+      </w:pPr>
+      <w:r>
+        <w:rPr>
+          <w:b/>
+          <w:sz w:val="26"/>
+          <w:szCs w:val="26"/>
+        </w:rPr>
+        <w:t xml:space="preserve">4.3. Ishlab chiqarish sanitariyasi va gigiyena talablari</w:t>
+      </w:r>
+    </w:p>
+    <w:p>
+      <w:pPr>
+        <w:spacing w:after="120" w:line="360" w:lineRule="auto"/>
+        <w:ind w:firstLine="709"/>
+        <w:jc w:val="both"/>
+      </w:pPr>
+      <w:r>
+        <w:rPr>
+          <w:sz w:val="24"/>
+          <w:szCs w:val="24"/>
+        </w:rPr>
+        <w:t xml:space="preserve">Ishlab chiqarish sanitariyasi ishlovchilar uchun qulay va sog'lom mehnat sharoitini yaratishga qaratiladi. Uchastkada havo harorati, namligi va tozaligi sanitariya me'yorlari doirasida ushlab turiladi. Buning uchun isitish, shamollatish (ventilyatsiya) va konditsionerlash tizimlari qo'llaniladi.</w:t>
+      </w:r>
+    </w:p>
+    <w:p>
+      <w:pPr>
+        <w:spacing w:after="120" w:line="360" w:lineRule="auto"/>
+        <w:ind w:firstLine="709"/>
+        <w:jc w:val="both"/>
+      </w:pPr>
+      <w:r>
+        <w:rPr>
+          <w:sz w:val="24"/>
+          <w:szCs w:val="24"/>
+        </w:rPr>
+        <w:t xml:space="preserve">Yuvish va boshqa kimyoviy jarayonlar ajratilgan, so'rib oluvchi ventilyatsiya bilan jihozlangan joylarда bajariladi. Bu zararli bug'larning ish zonasiga tarqalishining oldini oladi. Ish zonasi havosidagi zararli moddalar konsentratsiyasi ruxsat etilgan chegaraviy konsentratsiyadan (RECh) oshmasligi kerak.</w:t>
+      </w:r>
+    </w:p>
+    <w:p>
+      <w:pPr>
+        <w:spacing w:after="120" w:line="360" w:lineRule="auto"/>
+        <w:ind w:firstLine="709"/>
+        <w:jc w:val="both"/>
+      </w:pPr>
+      <w:r>
+        <w:rPr>
+          <w:sz w:val="24"/>
+          <w:szCs w:val="24"/>
+        </w:rPr>
+        <w:t xml:space="preserve">Ish o'rinlarining yetarli yoritilganligi ta'minlanadi: tabiiy va sun'iy yoritish me'yorlarga muvofiq tashkil etiladi, nuqsonlash kabi aniqlik talab qiladigan operatsiyalar uchun qo'shimcha mahalliy yoritish qo'llaniladi. Shovqin va tebranish darajasi me'yordan oshganda shovqinни kamaytiruvchi vositalar va shaxsiy himoya vositalaridan foydalaniladi.</w:t>
+      </w:r>
+    </w:p>
+    <w:p>
+      <w:pPr>
+        <w:spacing w:after="120" w:line="360" w:lineRule="auto"/>
+        <w:ind w:firstLine="709"/>
+        <w:jc w:val="both"/>
+      </w:pPr>
+      <w:r>
+        <w:rPr>
+          <w:sz w:val="24"/>
+          <w:szCs w:val="24"/>
+        </w:rPr>
+        <w:t xml:space="preserve">Ishlovchilar uchun maishiy xonalar (yechinish, yuvinish, dam olish va ovqatlanish xonalari) tashkil etiladi. Davriy tibbiy ko'riklar o'tkaziladi. Ushbu sanitariya-gigiyena tadbirlari ishchilarning sog'lig'ini saqlaydi va mehnat unumdorligini oshiradi.</w:t>
+      </w:r>
+    </w:p>
+    <w:p>
+      <w:pPr>
+        <w:spacing w:after="120" w:line="360" w:lineRule="auto"/>
+        <w:ind w:firstLine="709"/>
+        <w:jc w:val="both"/>
+      </w:pPr>
+      <w:r>
+        <w:rPr>
+          <w:sz w:val="24"/>
+          <w:szCs w:val="24"/>
+        </w:rPr>
+        <w:t xml:space="preserve">To'rtinchi bob bo'yicha xulosa: ta'mirlash uchastkasida mehnat muhofazasi, yong'in va elektr xavfsizligi hamda ishlab chiqarish sanitariyasi bo'yicha zarur tadbirlar belgilandi. Ularga rioya qilish xavfsiz mehnat sharoitini ta'minlaydi va baxtsiz hodisalarning oldini oladi.</w:t>
+      </w:r>
+    </w:p>
+    <w:p>
+      <w:r>
+        <w:br w:type="page"/>
+      </w:r>
+    </w:p>
+    <w:p>
+      <w:pPr>
+        <w:jc w:val="center"/>
+        <w:spacing w:before="0" w:after="220"/>
+      </w:pPr>
+      <w:r>
+        <w:rPr>
+          <w:b/>
+          <w:sz w:val="28"/>
+          <w:szCs w:val="28"/>
+        </w:rPr>
+        <w:t xml:space="preserve">V BOB. EKOLOGIK QISM</w:t>
+      </w:r>
+    </w:p>
+    <w:p>
+      <w:pPr>
+        <w:spacing w:before="240" w:after="120"/>
+        <w:keepNext/>
+      </w:pPr>
+      <w:r>
+        <w:rPr>
+          <w:b/>
+          <w:sz w:val="26"/>
+          <w:szCs w:val="26"/>
+        </w:rPr>
+        <w:t xml:space="preserve">5.1. Ta'mirlash jarayonining atrof-muhitga ta'siri</w:t>
+      </w:r>
+    </w:p>
+    <w:p>
+      <w:pPr>
+        <w:spacing w:after="120" w:line="360" w:lineRule="auto"/>
+        <w:ind w:firstLine="709"/>
+        <w:jc w:val="both"/>
+      </w:pPr>
+      <w:r>
+        <w:rPr>
+          <w:sz w:val="24"/>
+          <w:szCs w:val="24"/>
+        </w:rPr>
+        <w:t xml:space="preserve">Atrof-muhitni muhofaza qilish zamonaviy ishlab chiqarishning ajralmas talabidir. Tormoz uskunalari blokini ta'mirlash jarayoni ham atrof-muhitga ma'lum darajada ta'sir ko'rsatadi, shu sababli bu ta'sirni baholash va kamaytirish chora-tadbirlarini ishlab chiqish zarur.</w:t>
+      </w:r>
+    </w:p>
+    <w:p>
+      <w:pPr>
+        <w:spacing w:after="120" w:line="360" w:lineRule="auto"/>
+        <w:ind w:firstLine="709"/>
+        <w:jc w:val="both"/>
+      </w:pPr>
+      <w:r>
+        <w:rPr>
+          <w:sz w:val="24"/>
+          <w:szCs w:val="24"/>
+        </w:rPr>
+        <w:t xml:space="preserve">Ta'mirlash jarayonida atrof-muhitга ta'sir etuvchi asosiy omillar:</w:t>
+      </w:r>
+    </w:p>
+    <w:p>
+      <w:pPr>
+        <w:spacing w:after="60" w:line="312" w:lineRule="auto"/>
+        <w:ind w:left="709" w:hanging="284"/>
+        <w:jc w:val="both"/>
+      </w:pPr>
+      <w:r>
+        <w:rPr>
+          <w:sz w:val="24"/>
+          <w:szCs w:val="24"/>
+        </w:rPr>
+        <w:t xml:space="preserve">–  </w:t>
+      </w:r>
+      <w:r>
+        <w:rPr>
+          <w:sz w:val="24"/>
+          <w:szCs w:val="24"/>
+        </w:rPr>
+        <w:t xml:space="preserve">ishlatilgan yuvish eritmalari va moylar (suvni ifloslantiruvchi suyuq chiqindilar);</w:t>
+      </w:r>
+    </w:p>
+    <w:p>
+      <w:pPr>
+        <w:spacing w:after="60" w:line="312" w:lineRule="auto"/>
+        <w:ind w:left="709" w:hanging="284"/>
+        <w:jc w:val="both"/>
+      </w:pPr>
+      <w:r>
+        <w:rPr>
+          <w:sz w:val="24"/>
+          <w:szCs w:val="24"/>
+        </w:rPr>
+        <w:t xml:space="preserve">–  </w:t>
+      </w:r>
+      <w:r>
+        <w:rPr>
+          <w:sz w:val="24"/>
+          <w:szCs w:val="24"/>
+        </w:rPr>
+        <w:t xml:space="preserve">metall qirindilari, eskirgan detallar va rezina chiqindilar (qattiq chiqindilar);</w:t>
+      </w:r>
+    </w:p>
+    <w:p>
+      <w:pPr>
+        <w:spacing w:after="60" w:line="312" w:lineRule="auto"/>
+        <w:ind w:left="709" w:hanging="284"/>
+        <w:jc w:val="both"/>
+      </w:pPr>
+      <w:r>
+        <w:rPr>
+          <w:sz w:val="24"/>
+          <w:szCs w:val="24"/>
+        </w:rPr>
+        <w:t xml:space="preserve">–  </w:t>
+      </w:r>
+      <w:r>
+        <w:rPr>
+          <w:sz w:val="24"/>
+          <w:szCs w:val="24"/>
+        </w:rPr>
+        <w:t xml:space="preserve">payvandlash va bo'yash jarayonidagi gaz va aerozollar (havoni ifloslantirish);</w:t>
+      </w:r>
+    </w:p>
+    <w:p>
+      <w:pPr>
+        <w:spacing w:after="60" w:line="312" w:lineRule="auto"/>
+        <w:ind w:left="709" w:hanging="284"/>
+        <w:jc w:val="both"/>
+      </w:pPr>
+      <w:r>
+        <w:rPr>
+          <w:sz w:val="24"/>
+          <w:szCs w:val="24"/>
+        </w:rPr>
+        <w:t xml:space="preserve">–  </w:t>
+      </w:r>
+      <w:r>
+        <w:rPr>
+          <w:sz w:val="24"/>
+          <w:szCs w:val="24"/>
+        </w:rPr>
+        <w:t xml:space="preserve">shovqin va energiya sarfi.</w:t>
+      </w:r>
+    </w:p>
+    <w:p>
+      <w:pPr>
+        <w:spacing w:after="120" w:line="360" w:lineRule="auto"/>
+        <w:ind w:firstLine="709"/>
+        <w:jc w:val="both"/>
+      </w:pPr>
+      <w:r>
+        <w:rPr>
+          <w:sz w:val="24"/>
+          <w:szCs w:val="24"/>
+        </w:rPr>
+        <w:t xml:space="preserve">Suyuq chiqindilar, ayniqsa ishlatilgan ishqoriy yuvish eritmalari va moylar, tozalanmasdan kanalizatsiyaga yoki tuproqqa tushsa, suv havzalarini va tuproqни ifloslantiradi. Metall va rezina qattiq chiqindilar to'planib, atrof-muhitga salbiy ta'sir ko'rsatadi. Shu sababli har bir chiqindi turi bo'yicha to'g'ri ishlov berish va utilizatsiya qilish tartibi belgilanadi.</w:t>
+      </w:r>
+    </w:p>
+    <w:p>
+      <w:pPr>
+        <w:spacing w:after="120" w:line="360" w:lineRule="auto"/>
+        <w:ind w:firstLine="709"/>
+        <w:jc w:val="both"/>
+      </w:pPr>
+      <w:r>
+        <w:rPr>
+          <w:sz w:val="24"/>
+          <w:szCs w:val="24"/>
+        </w:rPr>
+        <w:t xml:space="preserve">Ta'mirlash uchastkasining atrof-muhitга ta'sirini baholashda chiqindi turlari, ularning hosil bo'lish hajmi va xavflilik sinfi aniqlanadi. Bu ma'lumotlar asosida muhofaza tadbirlari rejasi tuziladi va ularning samaradorligi nazorat qilinadi.</w:t>
+      </w:r>
+    </w:p>
+    <w:p>
+      <w:pPr>
+        <w:spacing w:before="240" w:after="120"/>
+        <w:keepNext/>
+      </w:pPr>
+      <w:r>
+        <w:rPr>
+          <w:b/>
+          <w:sz w:val="26"/>
+          <w:szCs w:val="26"/>
+        </w:rPr>
+        <w:t xml:space="preserve">5.2. Chiqindilarni utilizatsiya qilish va muhofaza tadbirlari</w:t>
+      </w:r>
+    </w:p>
+    <w:p>
+      <w:pPr>
+        <w:spacing w:after="120" w:line="360" w:lineRule="auto"/>
+        <w:ind w:firstLine="709"/>
+        <w:jc w:val="both"/>
+      </w:pPr>
+      <w:r>
+        <w:rPr>
+          <w:sz w:val="24"/>
+          <w:szCs w:val="24"/>
+        </w:rPr>
+        <w:t xml:space="preserve">Atrof-muhitни muhofaza qilish bo'yicha quyidagi asosiy tadbirlar nazarda tutiladi:</w:t>
+      </w:r>
+    </w:p>
+    <w:p>
+      <w:pPr>
+        <w:spacing w:after="60" w:line="312" w:lineRule="auto"/>
+        <w:ind w:left="709" w:hanging="284"/>
+        <w:jc w:val="both"/>
+      </w:pPr>
+      <w:r>
+        <w:rPr>
+          <w:sz w:val="24"/>
+          <w:szCs w:val="24"/>
+        </w:rPr>
+        <w:t xml:space="preserve">–  </w:t>
+      </w:r>
+      <w:r>
+        <w:rPr>
+          <w:sz w:val="24"/>
+          <w:szCs w:val="24"/>
+        </w:rPr>
+        <w:t xml:space="preserve">ishlatilgan yuvish eritmalari va moylarni maxsus idishlarда yig'ish va tozalash;</w:t>
+      </w:r>
+    </w:p>
+    <w:p>
+      <w:pPr>
+        <w:spacing w:after="60" w:line="312" w:lineRule="auto"/>
+        <w:ind w:left="709" w:hanging="284"/>
+        <w:jc w:val="both"/>
+      </w:pPr>
+      <w:r>
+        <w:rPr>
+          <w:sz w:val="24"/>
+          <w:szCs w:val="24"/>
+        </w:rPr>
+        <w:t xml:space="preserve">–  </w:t>
+      </w:r>
+      <w:r>
+        <w:rPr>
+          <w:sz w:val="24"/>
+          <w:szCs w:val="24"/>
+        </w:rPr>
+        <w:t xml:space="preserve">suyuq chiqindilarni neytrallash va tozalash inshootlaridan o'tkazish;</w:t>
+      </w:r>
+    </w:p>
+    <w:p>
+      <w:pPr>
+        <w:spacing w:after="60" w:line="312" w:lineRule="auto"/>
+        <w:ind w:left="709" w:hanging="284"/>
+        <w:jc w:val="both"/>
+      </w:pPr>
+      <w:r>
+        <w:rPr>
+          <w:sz w:val="24"/>
+          <w:szCs w:val="24"/>
+        </w:rPr>
+        <w:t xml:space="preserve">–  </w:t>
+      </w:r>
+      <w:r>
+        <w:rPr>
+          <w:sz w:val="24"/>
+          <w:szCs w:val="24"/>
+        </w:rPr>
+        <w:t xml:space="preserve">metall chiqindilarini saralab, qayta ishlashga (metallurgiyaga) topshirish;</w:t>
+      </w:r>
+    </w:p>
+    <w:p>
+      <w:pPr>
+        <w:spacing w:after="60" w:line="312" w:lineRule="auto"/>
+        <w:ind w:left="709" w:hanging="284"/>
+        <w:jc w:val="both"/>
+      </w:pPr>
+      <w:r>
+        <w:rPr>
+          <w:sz w:val="24"/>
+          <w:szCs w:val="24"/>
+        </w:rPr>
+        <w:t xml:space="preserve">–  </w:t>
+      </w:r>
+      <w:r>
+        <w:rPr>
+          <w:sz w:val="24"/>
+          <w:szCs w:val="24"/>
+        </w:rPr>
+        <w:t xml:space="preserve">rezina va polimer chiqindilarini belgilangan tartibда utilizatsiya qilish;</w:t>
+      </w:r>
+    </w:p>
+    <w:p>
+      <w:pPr>
+        <w:spacing w:after="60" w:line="312" w:lineRule="auto"/>
+        <w:ind w:left="709" w:hanging="284"/>
+        <w:jc w:val="both"/>
+      </w:pPr>
+      <w:r>
+        <w:rPr>
+          <w:sz w:val="24"/>
+          <w:szCs w:val="24"/>
+        </w:rPr>
+        <w:t xml:space="preserve">–  </w:t>
+      </w:r>
+      <w:r>
+        <w:rPr>
+          <w:sz w:val="24"/>
+          <w:szCs w:val="24"/>
+        </w:rPr>
+        <w:t xml:space="preserve">payvandlash va bo'yash joylarini so'rib oluvchi ventilyatsiya bilan jihozlash;</w:t>
+      </w:r>
+    </w:p>
+    <w:p>
+      <w:pPr>
+        <w:spacing w:after="60" w:line="312" w:lineRule="auto"/>
+        <w:ind w:left="709" w:hanging="284"/>
+        <w:jc w:val="both"/>
+      </w:pPr>
+      <w:r>
+        <w:rPr>
+          <w:sz w:val="24"/>
+          <w:szCs w:val="24"/>
+        </w:rPr>
+        <w:t xml:space="preserve">–  </w:t>
+      </w:r>
+      <w:r>
+        <w:rPr>
+          <w:sz w:val="24"/>
+          <w:szCs w:val="24"/>
+        </w:rPr>
+        <w:t xml:space="preserve">havoga chiqariladigan gazlarni filtrlarда tozalash.</w:t>
+      </w:r>
+    </w:p>
+    <w:p>
+      <w:pPr>
+        <w:spacing w:after="120" w:line="360" w:lineRule="auto"/>
+        <w:ind w:firstLine="709"/>
+        <w:jc w:val="both"/>
+      </w:pPr>
+      <w:r>
+        <w:rPr>
+          <w:sz w:val="24"/>
+          <w:szCs w:val="24"/>
+        </w:rPr>
+        <w:t xml:space="preserve">Ishlatilgan moylar va eritmalar qimmatli ikkilamchi xom ashyo hisoblanadi: ular yig'ilib, regeneratsiya (qayta tiklash) yoki utilizatsiya qilish korxonalariga topshiriladi. Metall chiqindilar (qirindilar, yaroqsiz detallar) saralanib, metallurgiya korxonalarида qayta eritiladi. Bu resurslarни tejaydi va chiqindilar hajmini kamaytiradi.</w:t>
+      </w:r>
+    </w:p>
+    <w:p>
+      <w:pPr>
+        <w:spacing w:after="120" w:line="360" w:lineRule="auto"/>
+        <w:ind w:firstLine="709"/>
+        <w:jc w:val="both"/>
+      </w:pPr>
+      <w:r>
+        <w:rPr>
+          <w:sz w:val="24"/>
+          <w:szCs w:val="24"/>
+        </w:rPr>
+        <w:t xml:space="preserve">Resurs va energiya tejovchi texnologiyalarни joriy etish ekologik ta'sirни kamaytirishning samarali yo'lidir. Detallarni tiklash (yangisi bilan almashtirish o'rniga) metall sarfini va chiqindilarни kamaytiradi. Yuvish eritmalarining yopiq aylanma tizimi suv sarfini va suyuq chiqindilar hajmini sezilarli qisqartiradi.</w:t>
+      </w:r>
+    </w:p>
+    <w:p>
+      <w:pPr>
+        <w:spacing w:after="120" w:line="360" w:lineRule="auto"/>
+        <w:ind w:firstLine="709"/>
+        <w:jc w:val="both"/>
+      </w:pPr>
+      <w:r>
+        <w:rPr>
+          <w:sz w:val="24"/>
+          <w:szCs w:val="24"/>
+        </w:rPr>
+        <w:t xml:space="preserve">Beshinchi bob bo'yicha xulosa: ta'mirlash jarayonining atrof-muhitга ta'siri tahlil qilindi va chiqindilarни utilizatsiya qilish hamda muhofaza tadbirlari belgilandi. Bu tadbirlar ekologik xavfsizlikни ta'minlaydi va tabiiy resurslardan oqilona foydalanishга xizmat qiladi.</w:t>
+      </w:r>
+    </w:p>
+    <w:p>
+      <w:r>
+        <w:br w:type="page"/>
+      </w:r>
+    </w:p>
+    <w:p>
+      <w:pPr>
+        <w:jc w:val="center"/>
+        <w:spacing w:before="0" w:after="220"/>
+      </w:pPr>
+      <w:r>
+        <w:rPr>
+          <w:b/>
+          <w:sz w:val="28"/>
+          <w:szCs w:val="28"/>
+        </w:rPr>
+        <w:t xml:space="preserve">VI BOB. IQTISODIY QISM</w:t>
+      </w:r>
+    </w:p>
+    <w:p>
+      <w:pPr>
+        <w:spacing w:before="240" w:after="120"/>
+        <w:keepNext/>
+      </w:pPr>
+      <w:r>
+        <w:rPr>
+          <w:b/>
+          <w:sz w:val="26"/>
+          <w:szCs w:val="26"/>
+        </w:rPr>
+        <w:t xml:space="preserve">6.1. Ta'mirlash tannarxini kalkulyatsiya qilish</w:t>
+      </w:r>
+    </w:p>
+    <w:p>
+      <w:pPr>
+        <w:spacing w:after="120" w:line="360" w:lineRule="auto"/>
+        <w:ind w:firstLine="709"/>
+        <w:jc w:val="both"/>
+      </w:pPr>
+      <w:r>
+        <w:rPr>
+          <w:sz w:val="24"/>
+          <w:szCs w:val="24"/>
+        </w:rPr>
+        <w:t xml:space="preserve">Iqtisodiy qismning maqsadi – ishlab chiqilgan texnologik jarayonning iqtisodiy samaradorligini asoslashdan iborat. Buning uchun avvalo bitta blokni kapital ta'mirlash tannarxi kalkulyatsiya qilinadi. Tannarx – ta'mirlashga sarflanadigan barcha xarajatlarning pul ko'rinishidagi yig'indisidir.</w:t>
+      </w:r>
+    </w:p>
+    <w:p>
+      <w:pPr>
+        <w:spacing w:after="120" w:line="360" w:lineRule="auto"/>
+        <w:ind w:firstLine="709"/>
+        <w:jc w:val="both"/>
+      </w:pPr>
+      <w:r>
+        <w:rPr>
+          <w:sz w:val="24"/>
+          <w:szCs w:val="24"/>
+        </w:rPr>
+        <w:t xml:space="preserve">Ta'mirlash tannarxi quyidagi asosiy moddalardan tashkil topadi:</w:t>
+      </w:r>
+    </w:p>
+    <w:p>
+      <w:pPr>
+        <w:spacing w:after="60" w:line="312" w:lineRule="auto"/>
+        <w:ind w:left="709" w:hanging="284"/>
+        <w:jc w:val="both"/>
+      </w:pPr>
+      <w:r>
+        <w:rPr>
+          <w:sz w:val="24"/>
+          <w:szCs w:val="24"/>
+        </w:rPr>
+        <w:t xml:space="preserve">–  </w:t>
+      </w:r>
+      <w:r>
+        <w:rPr>
+          <w:sz w:val="24"/>
+          <w:szCs w:val="24"/>
+        </w:rPr>
+        <w:t xml:space="preserve">asosiy materiallar va ehtiyot qismlar xarajatlari;</w:t>
+      </w:r>
+    </w:p>
+    <w:p>
+      <w:pPr>
+        <w:spacing w:after="60" w:line="312" w:lineRule="auto"/>
+        <w:ind w:left="709" w:hanging="284"/>
+        <w:jc w:val="both"/>
+      </w:pPr>
+      <w:r>
+        <w:rPr>
+          <w:sz w:val="24"/>
+          <w:szCs w:val="24"/>
+        </w:rPr>
+        <w:t xml:space="preserve">–  </w:t>
+      </w:r>
+      <w:r>
+        <w:rPr>
+          <w:sz w:val="24"/>
+          <w:szCs w:val="24"/>
+        </w:rPr>
+        <w:t xml:space="preserve">ishlab chiqarish ishchilarining asosiy va qo'shimcha ish haqi;</w:t>
+      </w:r>
+    </w:p>
+    <w:p>
+      <w:pPr>
+        <w:spacing w:after="60" w:line="312" w:lineRule="auto"/>
+        <w:ind w:left="709" w:hanging="284"/>
+        <w:jc w:val="both"/>
+      </w:pPr>
+      <w:r>
+        <w:rPr>
+          <w:sz w:val="24"/>
+          <w:szCs w:val="24"/>
+        </w:rPr>
+        <w:t xml:space="preserve">–  </w:t>
+      </w:r>
+      <w:r>
+        <w:rPr>
+          <w:sz w:val="24"/>
+          <w:szCs w:val="24"/>
+        </w:rPr>
+        <w:t xml:space="preserve">ish haqidan ijtimoiy sug'urta ajratmalari;</w:t>
+      </w:r>
+    </w:p>
+    <w:p>
+      <w:pPr>
+        <w:spacing w:after="60" w:line="312" w:lineRule="auto"/>
+        <w:ind w:left="709" w:hanging="284"/>
+        <w:jc w:val="both"/>
+      </w:pPr>
+      <w:r>
+        <w:rPr>
+          <w:sz w:val="24"/>
+          <w:szCs w:val="24"/>
+        </w:rPr>
+        <w:t xml:space="preserve">–  </w:t>
+      </w:r>
+      <w:r>
+        <w:rPr>
+          <w:sz w:val="24"/>
+          <w:szCs w:val="24"/>
+        </w:rPr>
+        <w:t xml:space="preserve">jihozlar amortizatsiyasi va energiya xarajatlari;</w:t>
+      </w:r>
+    </w:p>
+    <w:p>
+      <w:pPr>
+        <w:spacing w:after="60" w:line="312" w:lineRule="auto"/>
+        <w:ind w:left="709" w:hanging="284"/>
+        <w:jc w:val="both"/>
+      </w:pPr>
+      <w:r>
+        <w:rPr>
+          <w:sz w:val="24"/>
+          <w:szCs w:val="24"/>
+        </w:rPr>
+        <w:t xml:space="preserve">–  </w:t>
+      </w:r>
+      <w:r>
+        <w:rPr>
+          <w:sz w:val="24"/>
+          <w:szCs w:val="24"/>
+        </w:rPr>
+        <w:t xml:space="preserve">uchastkani saqlash va boshqaruv (ustama) xarajatlari.</w:t>
+      </w:r>
+    </w:p>
+    <w:p>
+      <w:pPr>
+        <w:spacing w:after="120" w:line="360" w:lineRule="auto"/>
+        <w:ind w:firstLine="709"/>
+        <w:jc w:val="both"/>
+      </w:pPr>
+      <w:r>
+        <w:rPr>
+          <w:sz w:val="24"/>
+          <w:szCs w:val="24"/>
+        </w:rPr>
+        <w:t xml:space="preserve">Ishchilarning asosiy ish haqi operatsiyalar mehnat hajmi va soatlik tarif stavkasi asosida hisoblanadi:</w:t>
+      </w:r>
+    </w:p>
+    <w:p>
+      <w:pPr>
+        <w:jc w:val="center"/>
+        <w:spacing w:before="80" w:after="120"/>
+      </w:pPr>
+      <w:r>
+        <w:rPr>
+          <w:i/>
+          <w:sz w:val="26"/>
+          <w:szCs w:val="26"/>
+        </w:rPr>
+        <w:t xml:space="preserve">Zₒ = Tₛₕ · Cₜ</w:t>
+      </w:r>
+    </w:p>
+    <w:p>
+      <w:pPr>
+        <w:spacing w:after="120" w:line="360" w:lineRule="auto"/>
+        <w:ind w:firstLine="709"/>
+        <w:jc w:val="both"/>
+      </w:pPr>
+      <w:r>
+        <w:rPr>
+          <w:sz w:val="24"/>
+          <w:szCs w:val="24"/>
+        </w:rPr>
+        <w:t xml:space="preserve">bu yerda: Zₒ – bitta blok uchun asosiy ish haqi; Tₛₕ – umumiy mehnat hajmi (norma-soat); Cₜ – o'rtacha soatlik tarif stavkasi. Qo'shimcha ish haqi va ijtimoiy ajratmalar asosiy ish haqining belgilangan foizi sifatida olinadi. Tannarxning namunaviy kalkulyatsiyasi 6.1-jadvalda keltirilgan (qiymatlar shartli, nisbiy birliklarda).</w:t>
+      </w:r>
+    </w:p>
+    <w:tbl>
+      <w:tblPr>
+        <w:tblW w:w="0" w:type="auto"/>
+        <w:jc w:val="center"/>
+        <w:tblBorders>
+          <w:top w:val="single" w:sz="6" w:space="0" w:color="000000"/>
+          <w:left w:val="single" w:sz="6" w:space="0" w:color="000000"/>
+          <w:bottom w:val="single" w:sz="6" w:space="0" w:color="000000"/>
+          <w:right w:val="single" w:sz="6" w:space="0" w:color="000000"/>
+          <w:insideH w:val="single" w:sz="6" w:space="0" w:color="000000"/>
+          <w:insideV w:val="single" w:sz="6" w:space="0" w:color="000000"/>
+        </w:tblBorders>
+      </w:tblPr>
+      <w:tblGrid>
+        <w:gridCol w:w="4400"/>
+        <w:gridCol w:w="2200"/>
+        <w:gridCol w:w="2800"/>
+      </w:tblGrid>
+      <w:tr>
+        <w:tc>
+          <w:tcPr>
+            <w:tcW w:w="4400" w:type="dxa"/>
+            <w:vAlign w:val="center"/>
+          </w:tcPr>
+          <w:p>
+            <w:pPr>
+              <w:spacing w:after="20"/>
+              <w:jc w:val="center"/>
+            </w:pPr>
+            <w:r>
+              <w:rPr>
+                <w:b/>
+                <w:sz w:val="22"/>
+                <w:szCs w:val="22"/>
+              </w:rPr>
+              <w:t xml:space="preserve">Xarajat moddasi</w:t>
+            </w:r>
+          </w:p>
+        </w:tc>
+        <w:tc>
+          <w:tcPr>
+            <w:tcW w:w="2200" w:type="dxa"/>
+            <w:vAlign w:val="center"/>
+          </w:tcPr>
+          <w:p>
+            <w:pPr>
+              <w:spacing w:after="20"/>
+              <w:jc w:val="center"/>
+            </w:pPr>
+            <w:r>
+              <w:rPr>
+                <w:b/>
+                <w:sz w:val="22"/>
+                <w:szCs w:val="22"/>
+              </w:rPr>
+              <w:t xml:space="preserve">Qiymati, %</w:t>
+            </w:r>
+          </w:p>
+        </w:tc>
+        <w:tc>
+          <w:tcPr>
+            <w:tcW w:w="2800" w:type="dxa"/>
+            <w:vAlign w:val="center"/>
+          </w:tcPr>
+          <w:p>
+            <w:pPr>
+              <w:spacing w:after="20"/>
+              <w:jc w:val="center"/>
+            </w:pPr>
+            <w:r>
+              <w:rPr>
+                <w:b/>
+                <w:sz w:val="22"/>
+                <w:szCs w:val="22"/>
+              </w:rPr>
+              <w:t xml:space="preserve">Izoh</w:t>
+            </w:r>
+          </w:p>
+        </w:tc>
+      </w:tr>
+      <w:tr>
+        <w:tc>
+          <w:tcPr>
+            <w:tcW w:w="4400" w:type="dxa"/>
+            <w:vAlign w:val="center"/>
+          </w:tcPr>
+          <w:p>
+            <w:pPr>
+              <w:spacing w:after="20"/>
+              <w:jc w:val="left"/>
+            </w:pPr>
+            <w:r>
+              <w:rPr>
+                <w:sz w:val="22"/>
+                <w:szCs w:val="22"/>
+              </w:rPr>
+              <w:t xml:space="preserve">Materiallar va ehtiyot qismlar</w:t>
+            </w:r>
+          </w:p>
+        </w:tc>
+        <w:tc>
+          <w:tcPr>
+            <w:tcW w:w="2200" w:type="dxa"/>
+            <w:vAlign w:val="center"/>
+          </w:tcPr>
+          <w:p>
+            <w:pPr>
+              <w:spacing w:after="20"/>
+              <w:jc w:val="center"/>
+            </w:pPr>
+            <w:r>
+              <w:rPr>
+                <w:sz w:val="22"/>
+                <w:szCs w:val="22"/>
+              </w:rPr>
+              <w:t xml:space="preserve">35</w:t>
+            </w:r>
+          </w:p>
+        </w:tc>
+        <w:tc>
+          <w:tcPr>
+            <w:tcW w:w="2800" w:type="dxa"/>
+            <w:vAlign w:val="center"/>
+          </w:tcPr>
+          <w:p>
+            <w:pPr>
+              <w:spacing w:after="20"/>
+              <w:jc w:val="center"/>
+            </w:pPr>
+            <w:r>
+              <w:rPr>
+                <w:sz w:val="22"/>
+                <w:szCs w:val="22"/>
+              </w:rPr>
+              <w:t xml:space="preserve">Zichlagich, klapan, detallar</w:t>
+            </w:r>
+          </w:p>
+        </w:tc>
+      </w:tr>
+      <w:tr>
+        <w:tc>
+          <w:tcPr>
+            <w:tcW w:w="4400" w:type="dxa"/>
+            <w:vAlign w:val="center"/>
+          </w:tcPr>
+          <w:p>
+            <w:pPr>
+              <w:spacing w:after="20"/>
+              <w:jc w:val="left"/>
+            </w:pPr>
+            <w:r>
+              <w:rPr>
+                <w:sz w:val="22"/>
+                <w:szCs w:val="22"/>
+              </w:rPr>
+              <w:t xml:space="preserve">Asosiy ish haqi</w:t>
+            </w:r>
+          </w:p>
+        </w:tc>
+        <w:tc>
+          <w:tcPr>
+            <w:tcW w:w="2200" w:type="dxa"/>
+            <w:vAlign w:val="center"/>
+          </w:tcPr>
+          <w:p>
+            <w:pPr>
+              <w:spacing w:after="20"/>
+              <w:jc w:val="center"/>
+            </w:pPr>
+            <w:r>
+              <w:rPr>
+                <w:sz w:val="22"/>
+                <w:szCs w:val="22"/>
+              </w:rPr>
+              <w:t xml:space="preserve">25</w:t>
+            </w:r>
+          </w:p>
+        </w:tc>
+        <w:tc>
+          <w:tcPr>
+            <w:tcW w:w="2800" w:type="dxa"/>
+            <w:vAlign w:val="center"/>
+          </w:tcPr>
+          <w:p>
+            <w:pPr>
+              <w:spacing w:after="20"/>
+              <w:jc w:val="center"/>
+            </w:pPr>
+            <w:r>
+              <w:rPr>
+                <w:sz w:val="22"/>
+                <w:szCs w:val="22"/>
+              </w:rPr>
+              <w:t xml:space="preserve">Mehnat hajmi bo'yicha</w:t>
+            </w:r>
+          </w:p>
+        </w:tc>
+      </w:tr>
+      <w:tr>
+        <w:tc>
+          <w:tcPr>
+            <w:tcW w:w="4400" w:type="dxa"/>
+            <w:vAlign w:val="center"/>
+          </w:tcPr>
+          <w:p>
+            <w:pPr>
+              <w:spacing w:after="20"/>
+              <w:jc w:val="left"/>
+            </w:pPr>
+            <w:r>
+              <w:rPr>
+                <w:sz w:val="22"/>
+                <w:szCs w:val="22"/>
+              </w:rPr>
+              <w:t xml:space="preserve">Qo'shimcha ish haqi</w:t>
+            </w:r>
+          </w:p>
+        </w:tc>
+        <w:tc>
+          <w:tcPr>
+            <w:tcW w:w="2200" w:type="dxa"/>
+            <w:vAlign w:val="center"/>
+          </w:tcPr>
+          <w:p>
+            <w:pPr>
+              <w:spacing w:after="20"/>
+              <w:jc w:val="center"/>
+            </w:pPr>
+            <w:r>
+              <w:rPr>
+                <w:sz w:val="22"/>
+                <w:szCs w:val="22"/>
+              </w:rPr>
+              <w:t xml:space="preserve">5</w:t>
+            </w:r>
+          </w:p>
+        </w:tc>
+        <w:tc>
+          <w:tcPr>
+            <w:tcW w:w="2800" w:type="dxa"/>
+            <w:vAlign w:val="center"/>
+          </w:tcPr>
+          <w:p>
+            <w:pPr>
+              <w:spacing w:after="20"/>
+              <w:jc w:val="center"/>
+            </w:pPr>
+            <w:r>
+              <w:rPr>
+                <w:sz w:val="22"/>
+                <w:szCs w:val="22"/>
+              </w:rPr>
+              <w:t xml:space="preserve">Asosiyning ~20%</w:t>
+            </w:r>
+          </w:p>
+        </w:tc>
+      </w:tr>
+      <w:tr>
+        <w:tc>
+          <w:tcPr>
+            <w:tcW w:w="4400" w:type="dxa"/>
+            <w:vAlign w:val="center"/>
+          </w:tcPr>
+          <w:p>
+            <w:pPr>
+              <w:spacing w:after="20"/>
+              <w:jc w:val="left"/>
+            </w:pPr>
+            <w:r>
+              <w:rPr>
+                <w:sz w:val="22"/>
+                <w:szCs w:val="22"/>
+              </w:rPr>
+              <w:t xml:space="preserve">Ijtimoiy ajratmalar</w:t>
+            </w:r>
+          </w:p>
+        </w:tc>
+        <w:tc>
+          <w:tcPr>
+            <w:tcW w:w="2200" w:type="dxa"/>
+            <w:vAlign w:val="center"/>
+          </w:tcPr>
+          <w:p>
+            <w:pPr>
+              <w:spacing w:after="20"/>
+              <w:jc w:val="center"/>
+            </w:pPr>
+            <w:r>
+              <w:rPr>
+                <w:sz w:val="22"/>
+                <w:szCs w:val="22"/>
+              </w:rPr>
+              <w:t xml:space="preserve">8</w:t>
+            </w:r>
+          </w:p>
+        </w:tc>
+        <w:tc>
+          <w:tcPr>
+            <w:tcW w:w="2800" w:type="dxa"/>
+            <w:vAlign w:val="center"/>
+          </w:tcPr>
+          <w:p>
+            <w:pPr>
+              <w:spacing w:after="20"/>
+              <w:jc w:val="center"/>
+            </w:pPr>
+            <w:r>
+              <w:rPr>
+                <w:sz w:val="22"/>
+                <w:szCs w:val="22"/>
+              </w:rPr>
+              <w:t xml:space="preserve">Belgilangan stavkada</w:t>
+            </w:r>
+          </w:p>
+        </w:tc>
+      </w:tr>
+      <w:tr>
+        <w:tc>
+          <w:tcPr>
+            <w:tcW w:w="4400" w:type="dxa"/>
+            <w:vAlign w:val="center"/>
+          </w:tcPr>
+          <w:p>
+            <w:pPr>
+              <w:spacing w:after="20"/>
+              <w:jc w:val="left"/>
+            </w:pPr>
+            <w:r>
+              <w:rPr>
+                <w:sz w:val="22"/>
+                <w:szCs w:val="22"/>
+              </w:rPr>
+              <w:t xml:space="preserve">Amortizatsiya va energiya</w:t>
+            </w:r>
+          </w:p>
+        </w:tc>
+        <w:tc>
+          <w:tcPr>
+            <w:tcW w:w="2200" w:type="dxa"/>
+            <w:vAlign w:val="center"/>
+          </w:tcPr>
+          <w:p>
+            <w:pPr>
+              <w:spacing w:after="20"/>
+              <w:jc w:val="center"/>
+            </w:pPr>
+            <w:r>
+              <w:rPr>
+                <w:sz w:val="22"/>
+                <w:szCs w:val="22"/>
+              </w:rPr>
+              <w:t xml:space="preserve">10</w:t>
+            </w:r>
+          </w:p>
+        </w:tc>
+        <w:tc>
+          <w:tcPr>
+            <w:tcW w:w="2800" w:type="dxa"/>
+            <w:vAlign w:val="center"/>
+          </w:tcPr>
+          <w:p>
+            <w:pPr>
+              <w:spacing w:after="20"/>
+              <w:jc w:val="center"/>
+            </w:pPr>
+            <w:r>
+              <w:rPr>
+                <w:sz w:val="22"/>
+                <w:szCs w:val="22"/>
+              </w:rPr>
+              <w:t xml:space="preserve">Jihozlar, havo, elektr</w:t>
+            </w:r>
+          </w:p>
+        </w:tc>
+      </w:tr>
+      <w:tr>
+        <w:tc>
+          <w:tcPr>
+            <w:tcW w:w="4400" w:type="dxa"/>
+            <w:vAlign w:val="center"/>
+          </w:tcPr>
+          <w:p>
+            <w:pPr>
+              <w:spacing w:after="20"/>
+              <w:jc w:val="left"/>
+            </w:pPr>
+            <w:r>
+              <w:rPr>
+                <w:sz w:val="22"/>
+                <w:szCs w:val="22"/>
+              </w:rPr>
+              <w:t xml:space="preserve">Ustama xarajatlar</w:t>
+            </w:r>
+          </w:p>
+        </w:tc>
+        <w:tc>
+          <w:tcPr>
+            <w:tcW w:w="2200" w:type="dxa"/>
+            <w:vAlign w:val="center"/>
+          </w:tcPr>
+          <w:p>
+            <w:pPr>
+              <w:spacing w:after="20"/>
+              <w:jc w:val="center"/>
+            </w:pPr>
+            <w:r>
+              <w:rPr>
+                <w:sz w:val="22"/>
+                <w:szCs w:val="22"/>
+              </w:rPr>
+              <w:t xml:space="preserve">17</w:t>
+            </w:r>
+          </w:p>
+        </w:tc>
+        <w:tc>
+          <w:tcPr>
+            <w:tcW w:w="2800" w:type="dxa"/>
+            <w:vAlign w:val="center"/>
+          </w:tcPr>
+          <w:p>
+            <w:pPr>
+              <w:spacing w:after="20"/>
+              <w:jc w:val="center"/>
+            </w:pPr>
+            <w:r>
+              <w:rPr>
+                <w:sz w:val="22"/>
+                <w:szCs w:val="22"/>
+              </w:rPr>
+              <w:t xml:space="preserve">Boshqaruv, saqlash</w:t>
+            </w:r>
+          </w:p>
+        </w:tc>
+      </w:tr>
+      <w:tr>
+        <w:tc>
+          <w:tcPr>
+            <w:tcW w:w="4400" w:type="dxa"/>
+            <w:vAlign w:val="center"/>
+          </w:tcPr>
+          <w:p>
+            <w:pPr>
+              <w:spacing w:after="20"/>
+              <w:jc w:val="left"/>
+            </w:pPr>
+            <w:r>
+              <w:rPr>
+                <w:sz w:val="22"/>
+                <w:szCs w:val="22"/>
+              </w:rPr>
+              <w:t xml:space="preserve">Jami tannarx</w:t>
+            </w:r>
+          </w:p>
+        </w:tc>
+        <w:tc>
+          <w:tcPr>
+            <w:tcW w:w="2200" w:type="dxa"/>
+            <w:vAlign w:val="center"/>
+          </w:tcPr>
+          <w:p>
+            <w:pPr>
+              <w:spacing w:after="20"/>
+              <w:jc w:val="center"/>
+            </w:pPr>
+            <w:r>
+              <w:rPr>
+                <w:sz w:val="22"/>
+                <w:szCs w:val="22"/>
+              </w:rPr>
+              <w:t xml:space="preserve">100</w:t>
+            </w:r>
+          </w:p>
+        </w:tc>
+        <w:tc>
+          <w:tcPr>
+            <w:tcW w:w="2800" w:type="dxa"/>
+            <w:vAlign w:val="center"/>
+          </w:tcPr>
+          <w:p>
+            <w:pPr>
+              <w:spacing w:after="20"/>
+              <w:jc w:val="center"/>
+            </w:pPr>
+            <w:r>
+              <w:rPr>
+                <w:sz w:val="22"/>
+                <w:szCs w:val="22"/>
+              </w:rPr>
+              <w:t xml:space="preserve">—</w:t>
+            </w:r>
+          </w:p>
+        </w:tc>
+      </w:tr>
+    </w:tbl>
+    <w:p/>
+    <w:p>
+      <w:pPr>
+        <w:spacing w:after="120" w:line="360" w:lineRule="auto"/>
+        <w:ind w:firstLine="709"/>
+        <w:jc w:val="both"/>
+      </w:pPr>
+      <w:r>
+        <w:rPr>
+          <w:sz w:val="24"/>
+          <w:szCs w:val="24"/>
+        </w:rPr>
+        <w:t xml:space="preserve">Kalkulyatsiyadan ko'rinib turibdiki, tannarxda eng katta ulushni materiallar (ehtiyot qismlar) va ish haqi tashkil etadi. Demak, tannarxни kamaytirishning asosiy yo'nalishlari – detallarni tiklash hisobiga ehtiyot qismlar xarajatini kamaytirish va mehnat unumdorligini oshirish hisobiga ish haqi ulushini optimallashtirishdir.</w:t>
+      </w:r>
+    </w:p>
+    <w:p>
+      <w:pPr>
+        <w:spacing w:before="240" w:after="120"/>
+        <w:keepNext/>
+      </w:pPr>
+      <w:r>
+        <w:rPr>
+          <w:b/>
+          <w:sz w:val="26"/>
+          <w:szCs w:val="26"/>
+        </w:rPr>
+        <w:t xml:space="preserve">6.2. Texnologiyaning iqtisodiy samaradorligini hisoblash</w:t>
+      </w:r>
+    </w:p>
+    <w:p>
+      <w:pPr>
+        <w:spacing w:after="120" w:line="360" w:lineRule="auto"/>
+        <w:ind w:firstLine="709"/>
+        <w:jc w:val="both"/>
+      </w:pPr>
+      <w:r>
+        <w:rPr>
+          <w:sz w:val="24"/>
+          <w:szCs w:val="24"/>
+        </w:rPr>
+        <w:t xml:space="preserve">Ishlab chiqilgan texnologik jarayonning iqtisodiy samaradorligi uni mavjud (bazaviy) texnologiya bilan taqqoslash orqali baholanadi. Asosiy samara manbalari – mehnat sarfining kamayishi, brak ulushining qisqarishi va detallarni tiklash hisobiga material xarajatining kamayishidir.</w:t>
+      </w:r>
+    </w:p>
+    <w:p>
+      <w:pPr>
+        <w:spacing w:after="120" w:line="360" w:lineRule="auto"/>
+        <w:ind w:firstLine="709"/>
+        <w:jc w:val="both"/>
+      </w:pPr>
+      <w:r>
+        <w:rPr>
+          <w:sz w:val="24"/>
+          <w:szCs w:val="24"/>
+        </w:rPr>
+        <w:t xml:space="preserve">Bitta blokni ta'mirlashda erishilgan tejamkorlik yangi va bazaviy tannarxlar farqi sifatida aniqlanadi:</w:t>
+      </w:r>
+    </w:p>
+    <w:p>
+      <w:pPr>
+        <w:jc w:val="center"/>
+        <w:spacing w:before="80" w:after="120"/>
+      </w:pPr>
+      <w:r>
+        <w:rPr>
+          <w:i/>
+          <w:sz w:val="26"/>
+          <w:szCs w:val="26"/>
+        </w:rPr>
+        <w:t xml:space="preserve">ΔC = Cб − Cн</w:t>
+      </w:r>
+    </w:p>
+    <w:p>
+      <w:pPr>
+        <w:spacing w:after="120" w:line="360" w:lineRule="auto"/>
+        <w:ind w:firstLine="709"/>
+        <w:jc w:val="both"/>
+      </w:pPr>
+      <w:r>
+        <w:rPr>
+          <w:sz w:val="24"/>
+          <w:szCs w:val="24"/>
+        </w:rPr>
+        <w:t xml:space="preserve">bu yerda: ΔC – bitta blokка tejam; Cб – bazaviy (eski) tannarx; Cн – yangi texnologiya bo'yicha tannarx. Yillik iqtisodiy samara esa bitta blokка tejamni yillik dasturга ko'paytirish orqali topiladi:</w:t>
+      </w:r>
+    </w:p>
+    <w:p>
+      <w:pPr>
+        <w:jc w:val="center"/>
+        <w:spacing w:before="80" w:after="120"/>
+      </w:pPr>
+      <w:r>
+        <w:rPr>
+          <w:i/>
+          <w:sz w:val="26"/>
+          <w:szCs w:val="26"/>
+        </w:rPr>
+        <w:t xml:space="preserve">Eг = ΔC · N</w:t>
+      </w:r>
+    </w:p>
+    <w:p>
+      <w:pPr>
+        <w:spacing w:after="120" w:line="360" w:lineRule="auto"/>
+        <w:ind w:firstLine="709"/>
+        <w:jc w:val="both"/>
+      </w:pPr>
+      <w:r>
+        <w:rPr>
+          <w:sz w:val="24"/>
+          <w:szCs w:val="24"/>
+        </w:rPr>
+        <w:t xml:space="preserve">bu yerda: Eг – yillik iqtisodiy samara; N – yillik ta'mirlash dasturi (12000 blok). Masalan, yangi texnologiya bitta blok tannarxini 8% ga kamaytirsa, yillik dastur miqyosida bu sezilarli umumiy tejamга aylanadi.</w:t>
+      </w:r>
+    </w:p>
+    <w:p>
+      <w:pPr>
+        <w:spacing w:after="120" w:line="360" w:lineRule="auto"/>
+        <w:ind w:firstLine="709"/>
+        <w:jc w:val="both"/>
+      </w:pPr>
+      <w:r>
+        <w:rPr>
+          <w:sz w:val="24"/>
+          <w:szCs w:val="24"/>
+        </w:rPr>
+        <w:t xml:space="preserve">Yangi texnologiyani joriy etish uchun qo'shimcha kapital sarflar (yangi jihoz, moslama, stend) talab etilsa, ularning o'zini qoplash muddati hisoblanadi:</w:t>
+      </w:r>
+    </w:p>
+    <w:p>
+      <w:pPr>
+        <w:jc w:val="center"/>
+        <w:spacing w:before="80" w:after="120"/>
+      </w:pPr>
+      <w:r>
+        <w:rPr>
+          <w:i/>
+          <w:sz w:val="26"/>
+          <w:szCs w:val="26"/>
+        </w:rPr>
+        <w:t xml:space="preserve">Tₒқ = K / Eг</w:t>
+      </w:r>
+    </w:p>
+    <w:p>
+      <w:pPr>
+        <w:spacing w:after="120" w:line="360" w:lineRule="auto"/>
+        <w:ind w:firstLine="709"/>
+        <w:jc w:val="both"/>
+      </w:pPr>
+      <w:r>
+        <w:rPr>
+          <w:sz w:val="24"/>
+          <w:szCs w:val="24"/>
+        </w:rPr>
+        <w:t xml:space="preserve">bu yerda: Tₒқ – o'zini qoplash muddati (yil); K – qo'shimcha kapital sarflar; Eг – yillik iqtisodiy samara. Agar hisoblangan o'zini qoplash muddati me'yoriy qiymatdan (odatda 5–7 yil) kichik bo'lsa, loyiha iqtisodiy jihatdan maqsadga muvofiq hisoblanadi.</w:t>
+      </w:r>
+    </w:p>
+    <w:p>
+      <w:pPr>
+        <w:spacing w:after="120" w:line="360" w:lineRule="auto"/>
+        <w:ind w:firstLine="709"/>
+        <w:jc w:val="both"/>
+      </w:pPr>
+      <w:r>
+        <w:rPr>
+          <w:sz w:val="24"/>
+          <w:szCs w:val="24"/>
+        </w:rPr>
+        <w:t xml:space="preserve">Iqtisodiy samaradorlikning asosiy ko'rsatkichlari 6.2-jadvalда umumlashtirilgan. Ular ishlab chiqilgan texnologik jarayonning afzalligini yaqqol ko'rsatadi.</w:t>
+      </w:r>
+    </w:p>
+    <w:tbl>
+      <w:tblPr>
+        <w:tblW w:w="0" w:type="auto"/>
+        <w:jc w:val="center"/>
+        <w:tblBorders>
+          <w:top w:val="single" w:sz="6" w:space="0" w:color="000000"/>
+          <w:left w:val="single" w:sz="6" w:space="0" w:color="000000"/>
+          <w:bottom w:val="single" w:sz="6" w:space="0" w:color="000000"/>
+          <w:right w:val="single" w:sz="6" w:space="0" w:color="000000"/>
+          <w:insideH w:val="single" w:sz="6" w:space="0" w:color="000000"/>
+          <w:insideV w:val="single" w:sz="6" w:space="0" w:color="000000"/>
+        </w:tblBorders>
+      </w:tblPr>
+      <w:tblGrid>
+        <w:gridCol w:w="3800"/>
+        <w:gridCol w:w="2900"/>
+        <w:gridCol w:w="2900"/>
+      </w:tblGrid>
+      <w:tr>
+        <w:tc>
+          <w:tcPr>
+            <w:tcW w:w="3800" w:type="dxa"/>
+            <w:vAlign w:val="center"/>
+          </w:tcPr>
+          <w:p>
+            <w:pPr>
+              <w:spacing w:after="20"/>
+              <w:jc w:val="center"/>
+            </w:pPr>
+            <w:r>
+              <w:rPr>
+                <w:b/>
+                <w:sz w:val="22"/>
+                <w:szCs w:val="22"/>
+              </w:rPr>
+              <w:t xml:space="preserve">Ko'rsatkich</w:t>
+            </w:r>
+          </w:p>
+        </w:tc>
+        <w:tc>
+          <w:tcPr>
+            <w:tcW w:w="2900" w:type="dxa"/>
+            <w:vAlign w:val="center"/>
+          </w:tcPr>
+          <w:p>
+            <w:pPr>
+              <w:spacing w:after="20"/>
+              <w:jc w:val="center"/>
+            </w:pPr>
+            <w:r>
+              <w:rPr>
+                <w:b/>
+                <w:sz w:val="22"/>
+                <w:szCs w:val="22"/>
+              </w:rPr>
+              <w:t xml:space="preserve">Bazaviy</w:t>
+            </w:r>
+          </w:p>
+        </w:tc>
+        <w:tc>
+          <w:tcPr>
+            <w:tcW w:w="2900" w:type="dxa"/>
+            <w:vAlign w:val="center"/>
+          </w:tcPr>
+          <w:p>
+            <w:pPr>
+              <w:spacing w:after="20"/>
+              <w:jc w:val="center"/>
+            </w:pPr>
+            <w:r>
+              <w:rPr>
+                <w:b/>
+                <w:sz w:val="22"/>
+                <w:szCs w:val="22"/>
+              </w:rPr>
+              <w:t xml:space="preserve">Yangi</w:t>
+            </w:r>
+          </w:p>
+        </w:tc>
+      </w:tr>
+      <w:tr>
+        <w:tc>
+          <w:tcPr>
+            <w:tcW w:w="3800" w:type="dxa"/>
+            <w:vAlign w:val="center"/>
+          </w:tcPr>
+          <w:p>
+            <w:pPr>
+              <w:spacing w:after="20"/>
+              <w:jc w:val="left"/>
+            </w:pPr>
+            <w:r>
+              <w:rPr>
+                <w:sz w:val="22"/>
+                <w:szCs w:val="22"/>
+              </w:rPr>
+              <w:t xml:space="preserve">Bir blok mehnat hajmi</w:t>
+            </w:r>
+          </w:p>
+        </w:tc>
+        <w:tc>
+          <w:tcPr>
+            <w:tcW w:w="2900" w:type="dxa"/>
+            <w:vAlign w:val="center"/>
+          </w:tcPr>
+          <w:p>
+            <w:pPr>
+              <w:spacing w:after="20"/>
+              <w:jc w:val="center"/>
+            </w:pPr>
+            <w:r>
+              <w:rPr>
+                <w:sz w:val="22"/>
+                <w:szCs w:val="22"/>
+              </w:rPr>
+              <w:t xml:space="preserve">yuqori</w:t>
+            </w:r>
+          </w:p>
+        </w:tc>
+        <w:tc>
+          <w:tcPr>
+            <w:tcW w:w="2900" w:type="dxa"/>
+            <w:vAlign w:val="center"/>
+          </w:tcPr>
+          <w:p>
+            <w:pPr>
+              <w:spacing w:after="20"/>
+              <w:jc w:val="center"/>
+            </w:pPr>
+            <w:r>
+              <w:rPr>
+                <w:sz w:val="22"/>
+                <w:szCs w:val="22"/>
+              </w:rPr>
+              <w:t xml:space="preserve">kamaygan</w:t>
+            </w:r>
+          </w:p>
+        </w:tc>
+      </w:tr>
+      <w:tr>
+        <w:tc>
+          <w:tcPr>
+            <w:tcW w:w="3800" w:type="dxa"/>
+            <w:vAlign w:val="center"/>
+          </w:tcPr>
+          <w:p>
+            <w:pPr>
+              <w:spacing w:after="20"/>
+              <w:jc w:val="left"/>
+            </w:pPr>
+            <w:r>
+              <w:rPr>
+                <w:sz w:val="22"/>
+                <w:szCs w:val="22"/>
+              </w:rPr>
+              <w:t xml:space="preserve">Brak ulushi</w:t>
+            </w:r>
+          </w:p>
+        </w:tc>
+        <w:tc>
+          <w:tcPr>
+            <w:tcW w:w="2900" w:type="dxa"/>
+            <w:vAlign w:val="center"/>
+          </w:tcPr>
+          <w:p>
+            <w:pPr>
+              <w:spacing w:after="20"/>
+              <w:jc w:val="center"/>
+            </w:pPr>
+            <w:r>
+              <w:rPr>
+                <w:sz w:val="22"/>
+                <w:szCs w:val="22"/>
+              </w:rPr>
+              <w:t xml:space="preserve">yuqori</w:t>
+            </w:r>
+          </w:p>
+        </w:tc>
+        <w:tc>
+          <w:tcPr>
+            <w:tcW w:w="2900" w:type="dxa"/>
+            <w:vAlign w:val="center"/>
+          </w:tcPr>
+          <w:p>
+            <w:pPr>
+              <w:spacing w:after="20"/>
+              <w:jc w:val="center"/>
+            </w:pPr>
+            <w:r>
+              <w:rPr>
+                <w:sz w:val="22"/>
+                <w:szCs w:val="22"/>
+              </w:rPr>
+              <w:t xml:space="preserve">kamaygan</w:t>
+            </w:r>
+          </w:p>
+        </w:tc>
+      </w:tr>
+      <w:tr>
+        <w:tc>
+          <w:tcPr>
+            <w:tcW w:w="3800" w:type="dxa"/>
+            <w:vAlign w:val="center"/>
+          </w:tcPr>
+          <w:p>
+            <w:pPr>
+              <w:spacing w:after="20"/>
+              <w:jc w:val="left"/>
+            </w:pPr>
+            <w:r>
+              <w:rPr>
+                <w:sz w:val="22"/>
+                <w:szCs w:val="22"/>
+              </w:rPr>
+              <w:t xml:space="preserve">Material sarfi</w:t>
+            </w:r>
+          </w:p>
+        </w:tc>
+        <w:tc>
+          <w:tcPr>
+            <w:tcW w:w="2900" w:type="dxa"/>
+            <w:vAlign w:val="center"/>
+          </w:tcPr>
+          <w:p>
+            <w:pPr>
+              <w:spacing w:after="20"/>
+              <w:jc w:val="center"/>
+            </w:pPr>
+            <w:r>
+              <w:rPr>
+                <w:sz w:val="22"/>
+                <w:szCs w:val="22"/>
+              </w:rPr>
+              <w:t xml:space="preserve">yuqori</w:t>
+            </w:r>
+          </w:p>
+        </w:tc>
+        <w:tc>
+          <w:tcPr>
+            <w:tcW w:w="2900" w:type="dxa"/>
+            <w:vAlign w:val="center"/>
+          </w:tcPr>
+          <w:p>
+            <w:pPr>
+              <w:spacing w:after="20"/>
+              <w:jc w:val="center"/>
+            </w:pPr>
+            <w:r>
+              <w:rPr>
+                <w:sz w:val="22"/>
+                <w:szCs w:val="22"/>
+              </w:rPr>
+              <w:t xml:space="preserve">tiklash hisobiga kam</w:t>
+            </w:r>
+          </w:p>
+        </w:tc>
+      </w:tr>
+      <w:tr>
+        <w:tc>
+          <w:tcPr>
+            <w:tcW w:w="3800" w:type="dxa"/>
+            <w:vAlign w:val="center"/>
+          </w:tcPr>
+          <w:p>
+            <w:pPr>
+              <w:spacing w:after="20"/>
+              <w:jc w:val="left"/>
+            </w:pPr>
+            <w:r>
+              <w:rPr>
+                <w:sz w:val="22"/>
+                <w:szCs w:val="22"/>
+              </w:rPr>
+              <w:t xml:space="preserve">Bir blok tannarxi</w:t>
+            </w:r>
+          </w:p>
+        </w:tc>
+        <w:tc>
+          <w:tcPr>
+            <w:tcW w:w="2900" w:type="dxa"/>
+            <w:vAlign w:val="center"/>
+          </w:tcPr>
+          <w:p>
+            <w:pPr>
+              <w:spacing w:after="20"/>
+              <w:jc w:val="center"/>
+            </w:pPr>
+            <w:r>
+              <w:rPr>
+                <w:sz w:val="22"/>
+                <w:szCs w:val="22"/>
+              </w:rPr>
+              <w:t xml:space="preserve">100%</w:t>
+            </w:r>
+          </w:p>
+        </w:tc>
+        <w:tc>
+          <w:tcPr>
+            <w:tcW w:w="2900" w:type="dxa"/>
+            <w:vAlign w:val="center"/>
+          </w:tcPr>
+          <w:p>
+            <w:pPr>
+              <w:spacing w:after="20"/>
+              <w:jc w:val="center"/>
+            </w:pPr>
+            <w:r>
+              <w:rPr>
+                <w:sz w:val="22"/>
+                <w:szCs w:val="22"/>
+              </w:rPr>
+              <w:t xml:space="preserve">~92%</w:t>
+            </w:r>
+          </w:p>
+        </w:tc>
+      </w:tr>
+      <w:tr>
+        <w:tc>
+          <w:tcPr>
+            <w:tcW w:w="3800" w:type="dxa"/>
+            <w:vAlign w:val="center"/>
+          </w:tcPr>
+          <w:p>
+            <w:pPr>
+              <w:spacing w:after="20"/>
+              <w:jc w:val="left"/>
+            </w:pPr>
+            <w:r>
+              <w:rPr>
+                <w:sz w:val="22"/>
+                <w:szCs w:val="22"/>
+              </w:rPr>
+              <w:t xml:space="preserve">Ta'mirlash sifati</w:t>
+            </w:r>
+          </w:p>
+        </w:tc>
+        <w:tc>
+          <w:tcPr>
+            <w:tcW w:w="2900" w:type="dxa"/>
+            <w:vAlign w:val="center"/>
+          </w:tcPr>
+          <w:p>
+            <w:pPr>
+              <w:spacing w:after="20"/>
+              <w:jc w:val="center"/>
+            </w:pPr>
+            <w:r>
+              <w:rPr>
+                <w:sz w:val="22"/>
+                <w:szCs w:val="22"/>
+              </w:rPr>
+              <w:t xml:space="preserve">o'rtacha</w:t>
+            </w:r>
+          </w:p>
+        </w:tc>
+        <w:tc>
+          <w:tcPr>
+            <w:tcW w:w="2900" w:type="dxa"/>
+            <w:vAlign w:val="center"/>
+          </w:tcPr>
+          <w:p>
+            <w:pPr>
+              <w:spacing w:after="20"/>
+              <w:jc w:val="center"/>
+            </w:pPr>
+            <w:r>
+              <w:rPr>
+                <w:sz w:val="22"/>
+                <w:szCs w:val="22"/>
+              </w:rPr>
+              <w:t xml:space="preserve">oshgan</w:t>
+            </w:r>
+          </w:p>
+        </w:tc>
+      </w:tr>
+    </w:tbl>
+    <w:p/>
+    <w:p>
+      <w:pPr>
+        <w:spacing w:after="120" w:line="360" w:lineRule="auto"/>
+        <w:ind w:firstLine="709"/>
+        <w:jc w:val="both"/>
+      </w:pPr>
+      <w:r>
+        <w:rPr>
+          <w:sz w:val="24"/>
+          <w:szCs w:val="24"/>
+        </w:rPr>
+        <w:t xml:space="preserve">Oltinchi bob bo'yicha xulosa: ta'mirlash tannarxi kalkulyatsiya qilindi va ishlab chiqilgan texnologik jarayonning iqtisodiy samaradorligi asoslandi. Hisoblar yangi texnologiya tannarxni kamaytirish, mehnat unumdorligini va ta'mirlash sifатини oshirish hisobiga iqtisodiy jihatdan samarali ekanligini ko'rsatdi.</w:t>
+      </w:r>
+    </w:p>
+    <w:p>
+      <w:r>
+        <w:br w:type="page"/>
+      </w:r>
+    </w:p>
+    <w:p>
+      <w:pPr>
+        <w:jc w:val="center"/>
+        <w:spacing w:before="0" w:after="220"/>
+      </w:pPr>
+      <w:r>
+        <w:rPr>
+          <w:b/>
+          <w:sz w:val="28"/>
+          <w:szCs w:val="28"/>
+        </w:rPr>
+        <w:t xml:space="preserve">XULOSA VA TAKLIFLAR</w:t>
+      </w:r>
+    </w:p>
+    <w:p>
+      <w:pPr>
+        <w:spacing w:after="120" w:line="360" w:lineRule="auto"/>
+        <w:ind w:firstLine="709"/>
+        <w:jc w:val="both"/>
+      </w:pPr>
+      <w:r>
+        <w:rPr>
+          <w:sz w:val="24"/>
+          <w:szCs w:val="24"/>
+        </w:rPr>
+        <w:t xml:space="preserve">Ushbu bitiruv malakaviy ishida 072-tormoz qurilmasi blokini (БТО-072) kapital ta'mirlash texnologik jarayoni ishlab chiqildi. Bajarilgan ishlar natijasida quyidagi asosiy xulosalarга kelindi:</w:t>
+      </w:r>
+    </w:p>
+    <w:p>
+      <w:pPr>
+        <w:spacing w:after="60" w:line="312" w:lineRule="auto"/>
+        <w:ind w:left="709" w:hanging="284"/>
+        <w:jc w:val="both"/>
+      </w:pPr>
+      <w:r>
+        <w:rPr>
+          <w:sz w:val="24"/>
+          <w:szCs w:val="24"/>
+        </w:rPr>
+        <w:t xml:space="preserve">–  </w:t>
+      </w:r>
+      <w:r>
+        <w:rPr>
+          <w:sz w:val="24"/>
+          <w:szCs w:val="24"/>
+        </w:rPr>
+        <w:t xml:space="preserve">072-blokning vazifasi, konstruksiyasi, tarkibiy qismlari va ishlash prinsipi o'rganildi;</w:t>
+      </w:r>
+    </w:p>
+    <w:p>
+      <w:pPr>
+        <w:spacing w:after="60" w:line="312" w:lineRule="auto"/>
+        <w:ind w:left="709" w:hanging="284"/>
+        <w:jc w:val="both"/>
+      </w:pPr>
+      <w:r>
+        <w:rPr>
+          <w:sz w:val="24"/>
+          <w:szCs w:val="24"/>
+        </w:rPr>
+        <w:t xml:space="preserve">–  </w:t>
+      </w:r>
+      <w:r>
+        <w:rPr>
+          <w:sz w:val="24"/>
+          <w:szCs w:val="24"/>
+        </w:rPr>
+        <w:t xml:space="preserve">ekspluatatsiyada yuzaga keladigan xarakterli nuqsonlar tahlil qilinib tasniflandi;</w:t>
+      </w:r>
+    </w:p>
+    <w:p>
+      <w:pPr>
+        <w:spacing w:after="60" w:line="312" w:lineRule="auto"/>
+        <w:ind w:left="709" w:hanging="284"/>
+        <w:jc w:val="both"/>
+      </w:pPr>
+      <w:r>
+        <w:rPr>
+          <w:sz w:val="24"/>
+          <w:szCs w:val="24"/>
+        </w:rPr>
+        <w:t xml:space="preserve">–  </w:t>
+      </w:r>
+      <w:r>
+        <w:rPr>
+          <w:sz w:val="24"/>
+          <w:szCs w:val="24"/>
+        </w:rPr>
+        <w:t xml:space="preserve">mavjud ta'mirlash texnologiyalari tahlil qilinib, ularning kamchiliklari aniqlandi;</w:t>
+      </w:r>
+    </w:p>
+    <w:p>
+      <w:pPr>
+        <w:spacing w:after="60" w:line="312" w:lineRule="auto"/>
+        <w:ind w:left="709" w:hanging="284"/>
+        <w:jc w:val="both"/>
+      </w:pPr>
+      <w:r>
+        <w:rPr>
+          <w:sz w:val="24"/>
+          <w:szCs w:val="24"/>
+        </w:rPr>
+        <w:t xml:space="preserve">–  </w:t>
+      </w:r>
+      <w:r>
+        <w:rPr>
+          <w:sz w:val="24"/>
+          <w:szCs w:val="24"/>
+        </w:rPr>
+        <w:t xml:space="preserve">kapital ta'mirlashning to'liq, takomillashtirilgan texnologik jarayoni ishlab chiqildi;</w:t>
+      </w:r>
+    </w:p>
+    <w:p>
+      <w:pPr>
+        <w:spacing w:after="60" w:line="312" w:lineRule="auto"/>
+        <w:ind w:left="709" w:hanging="284"/>
+        <w:jc w:val="both"/>
+      </w:pPr>
+      <w:r>
+        <w:rPr>
+          <w:sz w:val="24"/>
+          <w:szCs w:val="24"/>
+        </w:rPr>
+        <w:t xml:space="preserve">–  </w:t>
+      </w:r>
+      <w:r>
+        <w:rPr>
+          <w:sz w:val="24"/>
+          <w:szCs w:val="24"/>
+        </w:rPr>
+        <w:t xml:space="preserve">vaqt me'yorlari, jihozlar va ishchilar soni hisoblandi, maxsus moslama loyihalanib mustahkamlikка tekshirildi;</w:t>
+      </w:r>
+    </w:p>
+    <w:p>
+      <w:pPr>
+        <w:spacing w:after="60" w:line="312" w:lineRule="auto"/>
+        <w:ind w:left="709" w:hanging="284"/>
+        <w:jc w:val="both"/>
+      </w:pPr>
+      <w:r>
+        <w:rPr>
+          <w:sz w:val="24"/>
+          <w:szCs w:val="24"/>
+        </w:rPr>
+        <w:t xml:space="preserve">–  </w:t>
+      </w:r>
+      <w:r>
+        <w:rPr>
+          <w:sz w:val="24"/>
+          <w:szCs w:val="24"/>
+        </w:rPr>
+        <w:t xml:space="preserve">sinov stendi sxemasi ishlab chiqildi;</w:t>
+      </w:r>
+    </w:p>
+    <w:p>
+      <w:pPr>
+        <w:spacing w:after="60" w:line="312" w:lineRule="auto"/>
+        <w:ind w:left="709" w:hanging="284"/>
+        <w:jc w:val="both"/>
+      </w:pPr>
+      <w:r>
+        <w:rPr>
+          <w:sz w:val="24"/>
+          <w:szCs w:val="24"/>
+        </w:rPr>
+        <w:t xml:space="preserve">–  </w:t>
+      </w:r>
+      <w:r>
+        <w:rPr>
+          <w:sz w:val="24"/>
+          <w:szCs w:val="24"/>
+        </w:rPr>
+        <w:t xml:space="preserve">mehnat muhofazasi, ekologik va iqtisodiy masalalar asoslandi.</w:t>
+      </w:r>
+    </w:p>
+    <w:p>
+      <w:pPr>
+        <w:spacing w:after="120" w:line="360" w:lineRule="auto"/>
+        <w:ind w:firstLine="709"/>
+        <w:jc w:val="both"/>
+      </w:pPr>
+      <w:r>
+        <w:rPr>
+          <w:sz w:val="24"/>
+          <w:szCs w:val="24"/>
+        </w:rPr>
+        <w:t xml:space="preserve">Olib borilgan tadqiqot asosida quyidagi takliflar ilgari suriladi:</w:t>
+      </w:r>
+    </w:p>
+    <w:p>
+      <w:pPr>
+        <w:spacing w:after="60" w:line="312" w:lineRule="auto"/>
+        <w:ind w:left="709" w:hanging="284"/>
+        <w:jc w:val="both"/>
+      </w:pPr>
+      <w:r>
+        <w:rPr>
+          <w:sz w:val="24"/>
+          <w:szCs w:val="24"/>
+        </w:rPr>
+        <w:t xml:space="preserve">–  </w:t>
+      </w:r>
+      <w:r>
+        <w:rPr>
+          <w:sz w:val="24"/>
+          <w:szCs w:val="24"/>
+        </w:rPr>
+        <w:t xml:space="preserve">nuqsonlash va sinash bosqichlarида zamonaviy diagnostika va avtomatlashtirilgan vositalardan foydalanish;</w:t>
+      </w:r>
+    </w:p>
+    <w:p>
+      <w:pPr>
+        <w:spacing w:after="60" w:line="312" w:lineRule="auto"/>
+        <w:ind w:left="709" w:hanging="284"/>
+        <w:jc w:val="both"/>
+      </w:pPr>
+      <w:r>
+        <w:rPr>
+          <w:sz w:val="24"/>
+          <w:szCs w:val="24"/>
+        </w:rPr>
+        <w:t xml:space="preserve">–  </w:t>
+      </w:r>
+      <w:r>
+        <w:rPr>
+          <w:sz w:val="24"/>
+          <w:szCs w:val="24"/>
+        </w:rPr>
+        <w:t xml:space="preserve">detallarni tiklash usullarini kengaytirib, ehtiyot qismlar xarajatини kamaytirish;</w:t>
+      </w:r>
+    </w:p>
+    <w:p>
+      <w:pPr>
+        <w:spacing w:after="60" w:line="312" w:lineRule="auto"/>
+        <w:ind w:left="709" w:hanging="284"/>
+        <w:jc w:val="both"/>
+      </w:pPr>
+      <w:r>
+        <w:rPr>
+          <w:sz w:val="24"/>
+          <w:szCs w:val="24"/>
+        </w:rPr>
+        <w:t xml:space="preserve">–  </w:t>
+      </w:r>
+      <w:r>
+        <w:rPr>
+          <w:sz w:val="24"/>
+          <w:szCs w:val="24"/>
+        </w:rPr>
+        <w:t xml:space="preserve">texnologik jarayonни operatsiyalar bo'yicha aniq reglamentlashtirish va sifat nazoratини kuchaytirish;</w:t>
+      </w:r>
+    </w:p>
+    <w:p>
+      <w:pPr>
+        <w:spacing w:after="60" w:line="312" w:lineRule="auto"/>
+        <w:ind w:left="709" w:hanging="284"/>
+        <w:jc w:val="both"/>
+      </w:pPr>
+      <w:r>
+        <w:rPr>
+          <w:sz w:val="24"/>
+          <w:szCs w:val="24"/>
+        </w:rPr>
+        <w:t xml:space="preserve">–  </w:t>
+      </w:r>
+      <w:r>
+        <w:rPr>
+          <w:sz w:val="24"/>
+          <w:szCs w:val="24"/>
+        </w:rPr>
+        <w:t xml:space="preserve">resurs va energiya tejovchi hamda ekologik xavfsiz texnologiyalarни joriy etish.</w:t>
+      </w:r>
+    </w:p>
+    <w:p>
+      <w:pPr>
+        <w:spacing w:after="120" w:line="360" w:lineRule="auto"/>
+        <w:ind w:firstLine="709"/>
+        <w:jc w:val="both"/>
+      </w:pPr>
+      <w:r>
+        <w:rPr>
+          <w:sz w:val="24"/>
+          <w:szCs w:val="24"/>
+        </w:rPr>
+        <w:t xml:space="preserve">Ishlab chiqilgan texnologik jarayon ta'mirlash sifатини va tiklangan blok ishonchliligини oshirish, mehnat sarfи va ta'mirlash muddатини qisqartirish hamda iqtisodiy samaradorlikка erishish imkonини beradi. Ishning natijalaridан ta'mirlash korxonalарида va o'quv jarayонида foydalanish mumkin.</w:t>
+      </w:r>
+    </w:p>
+    <w:p>
+      <w:r>
+        <w:br w:type="page"/>
+      </w:r>
+    </w:p>
+    <w:p>
+      <w:pPr>
+        <w:jc w:val="center"/>
+        <w:spacing w:before="0" w:after="220"/>
+      </w:pPr>
+      <w:r>
+        <w:rPr>
+          <w:b/>
+          <w:sz w:val="26"/>
+          <w:szCs w:val="26"/>
+        </w:rPr>
+        <w:t xml:space="preserve">FOYDALANILGAN ADABIYOTLAR RO'YXATI</w:t>
+      </w:r>
+    </w:p>
+    <w:p>
+      <w:pPr>
+        <w:spacing w:after="80" w:line="312" w:lineRule="auto"/>
+        <w:ind w:left="425" w:hanging="425"/>
+        <w:jc w:val="both"/>
+      </w:pPr>
+      <w:r>
+        <w:rPr>
+          <w:sz w:val="24"/>
+          <w:szCs w:val="24"/>
+        </w:rPr>
+        <w:t xml:space="preserve">1. O'zbekiston Respublikasining «Temir yo'l transporti to'g'risida» Qonuni. – Toshkent.</w:t>
+      </w:r>
+    </w:p>
+    <w:p>
+      <w:pPr>
+        <w:spacing w:after="80" w:line="312" w:lineRule="auto"/>
+        <w:ind w:left="425" w:hanging="425"/>
+        <w:jc w:val="both"/>
+      </w:pPr>
+      <w:r>
+        <w:rPr>
+          <w:sz w:val="24"/>
+          <w:szCs w:val="24"/>
+        </w:rPr>
+        <w:t xml:space="preserve">2. Тормозное оборудование железнодорожного подвижного состава: справочник. – Москва: Транспорт.</w:t>
+      </w:r>
+    </w:p>
+    <w:p>
+      <w:pPr>
+        <w:spacing w:after="80" w:line="312" w:lineRule="auto"/>
+        <w:ind w:left="425" w:hanging="425"/>
+        <w:jc w:val="both"/>
+      </w:pPr>
+      <w:r>
+        <w:rPr>
+          <w:sz w:val="24"/>
+          <w:szCs w:val="24"/>
+        </w:rPr>
+        <w:t xml:space="preserve">3. Крылов В.И., Крылов В.В. Автоматические тормоза подвижного состава. – Москва: Транспорт.</w:t>
+      </w:r>
+    </w:p>
+    <w:p>
+      <w:pPr>
+        <w:spacing w:after="80" w:line="312" w:lineRule="auto"/>
+        <w:ind w:left="425" w:hanging="425"/>
+        <w:jc w:val="both"/>
+      </w:pPr>
+      <w:r>
+        <w:rPr>
+          <w:sz w:val="24"/>
+          <w:szCs w:val="24"/>
+        </w:rPr>
+        <w:t xml:space="preserve">4. Иноземцев В.Г. Тормоза железнодорожного подвижного состава. – Москва: Транспорт.</w:t>
+      </w:r>
+    </w:p>
+    <w:p>
+      <w:pPr>
+        <w:spacing w:after="80" w:line="312" w:lineRule="auto"/>
+        <w:ind w:left="425" w:hanging="425"/>
+        <w:jc w:val="both"/>
+      </w:pPr>
+      <w:r>
+        <w:rPr>
+          <w:sz w:val="24"/>
+          <w:szCs w:val="24"/>
+        </w:rPr>
+        <w:t xml:space="preserve">5. Блок тормозного оборудования 072. Руководство по эксплуатации 072.00.000 РЭ.</w:t>
+      </w:r>
+    </w:p>
+    <w:p>
+      <w:pPr>
+        <w:spacing w:after="80" w:line="312" w:lineRule="auto"/>
+        <w:ind w:left="425" w:hanging="425"/>
+        <w:jc w:val="both"/>
+      </w:pPr>
+      <w:r>
+        <w:rPr>
+          <w:sz w:val="24"/>
+          <w:szCs w:val="24"/>
+        </w:rPr>
+        <w:t xml:space="preserve">6. Технология ремонта подвижного состава: учебник для вузов ж.-д. транспорта.</w:t>
+      </w:r>
+    </w:p>
+    <w:p>
+      <w:pPr>
+        <w:spacing w:after="80" w:line="312" w:lineRule="auto"/>
+        <w:ind w:left="425" w:hanging="425"/>
+        <w:jc w:val="both"/>
+      </w:pPr>
+      <w:r>
+        <w:rPr>
+          <w:sz w:val="24"/>
+          <w:szCs w:val="24"/>
+        </w:rPr>
+        <w:t xml:space="preserve">7. Mashinasozlik texnologiyasi asoslari. Darslik. – Toshkent.</w:t>
+      </w:r>
+    </w:p>
+    <w:p>
+      <w:pPr>
+        <w:spacing w:after="80" w:line="312" w:lineRule="auto"/>
+        <w:ind w:left="425" w:hanging="425"/>
+        <w:jc w:val="both"/>
+      </w:pPr>
+      <w:r>
+        <w:rPr>
+          <w:sz w:val="24"/>
+          <w:szCs w:val="24"/>
+        </w:rPr>
+        <w:t xml:space="preserve">8. Detallarni tiklash texnologiyasi. O'quv qo'llanma. – Toshkent.</w:t>
+      </w:r>
+    </w:p>
+    <w:p>
+      <w:pPr>
+        <w:spacing w:after="80" w:line="312" w:lineRule="auto"/>
+        <w:ind w:left="425" w:hanging="425"/>
+        <w:jc w:val="both"/>
+      </w:pPr>
+      <w:r>
+        <w:rPr>
+          <w:sz w:val="24"/>
+          <w:szCs w:val="24"/>
+        </w:rPr>
+        <w:t xml:space="preserve">9. Mehnat muhofazasi va xavfsizlik texnikasi. Darslik. – Toshkent.</w:t>
+      </w:r>
+    </w:p>
+    <w:p>
+      <w:pPr>
+        <w:spacing w:after="80" w:line="312" w:lineRule="auto"/>
+        <w:ind w:left="425" w:hanging="425"/>
+        <w:jc w:val="both"/>
+      </w:pPr>
+      <w:r>
+        <w:rPr>
+          <w:sz w:val="24"/>
+          <w:szCs w:val="24"/>
+        </w:rPr>
+        <w:t xml:space="preserve">10. Ishlab chiqarish ekologiyasi. O'quv qo'llanma. – Toshkent.</w:t>
+      </w:r>
+    </w:p>
+    <w:p>
+      <w:pPr>
+        <w:spacing w:after="80" w:line="312" w:lineRule="auto"/>
+        <w:ind w:left="425" w:hanging="425"/>
+        <w:jc w:val="both"/>
+      </w:pPr>
+      <w:r>
+        <w:rPr>
+          <w:sz w:val="24"/>
+          <w:szCs w:val="24"/>
+        </w:rPr>
+        <w:t xml:space="preserve">11. Ishlab chiqarish iqtisodiyoti va menejmenti. Darslik. – Toshkent.</w:t>
+      </w:r>
+    </w:p>
+    <w:p>
+      <w:pPr>
+        <w:spacing w:after="80" w:line="312" w:lineRule="auto"/>
+        <w:ind w:left="425" w:hanging="425"/>
+        <w:jc w:val="both"/>
+      </w:pPr>
+      <w:r>
+        <w:rPr>
+          <w:sz w:val="24"/>
+          <w:szCs w:val="24"/>
+        </w:rPr>
+        <w:t xml:space="preserve">12. GOST va texnik shartlar (tormoz uskunalари ta'миri bo'yicha normativ hujjatlar).</w:t>
+      </w:r>
+    </w:p>
+    <w:p>
+      <w:r>
+        <w:br w:type="page"/>
+      </w:r>
+    </w:p>
+    <w:p>
+      <w:pPr>
+        <w:jc w:val="center"/>
+        <w:spacing w:before="0" w:after="220"/>
+      </w:pPr>
+      <w:r>
+        <w:rPr>
+          <w:b/>
+          <w:sz w:val="28"/>
+          <w:szCs w:val="28"/>
+        </w:rPr>
+        <w:t xml:space="preserve">ILOVALAR</w:t>
+      </w:r>
+    </w:p>
+    <w:p>
+      <w:pPr>
+        <w:spacing w:after="120" w:line="360" w:lineRule="auto"/>
+        <w:ind w:firstLine="709"/>
+        <w:jc w:val="both"/>
+      </w:pPr>
+      <w:r>
+        <w:rPr>
+          <w:sz w:val="24"/>
+          <w:szCs w:val="24"/>
+        </w:rPr>
+        <w:t xml:space="preserve">Ilovalarда quyidagi materiallar keltiriladi: texnologik jarayon kartalari (marshrut va operatsion kartalar); blokning umumiy ko'rinishi va yig'ish chizmalari; maxsus moslama chizmasi; sinov stendи pnevmatik sxemasi; nuqsonlash va sinov qaydnomalari namunalari; iqtisodiy ko'rsatkichlар jadval va diagrammalари.</w:t>
+      </w:r>
+    </w:p>
     <w:sectPr>
       <w:pgSz w:w="11906" w:h="16838"/>
       <w:pgMar w:top="1134" w:right="567" w:bottom="1134" w:left="1701" w:header="708" w:footer="708" w:gutter="0"/>

</xml_diff>